<commit_message>
Remove tax preparer info — letter signed directly by Eliana Machado de Almeida
https://claude.ai/code/session_019pk3CFrfADSxNgg23VPbbZ
</commit_message>
<xml_diff>
--- a/IRS_LTR566T_Response_Eliana_Machado_2024.docx
+++ b/IRS_LTR566T_Response_Eliana_Machado_2024.docx
@@ -5,10 +5,12 @@
     <w:p>
       <w:pPr>
         <w:spacing w:before="80" w:after="80"/>
+        <w:jc w:val="left"/>
       </w:pPr>
       <w:r>
         <w:rPr>
           <w:rFonts w:ascii="Courier New" w:hAnsi="Courier New"/>
+          <w:b w:val="0"/>
           <w:sz w:val="18"/>
         </w:rPr>
         <w:t>========================================================================</w:t>
@@ -31,96 +33,15 @@
     <w:p>
       <w:pPr>
         <w:spacing w:before="80" w:after="80"/>
-      </w:pPr>
-      <w:r>
-        <w:rPr>
-          <w:rFonts w:ascii="Courier New" w:hAnsi="Courier New"/>
-          <w:sz w:val="18"/>
-        </w:rPr>
-        <w:t>========================================================================</w:t>
-      </w:r>
-    </w:p>
-    <w:p>
-      <w:pPr>
-        <w:spacing w:before="0" w:after="80"/>
         <w:jc w:val="left"/>
       </w:pPr>
       <w:r>
         <w:rPr>
           <w:rFonts w:ascii="Courier New" w:hAnsi="Courier New"/>
           <w:b w:val="0"/>
-          <w:sz w:val="20"/>
+          <w:sz w:val="18"/>
         </w:rPr>
-      </w:r>
-    </w:p>
-    <w:p>
-      <w:pPr>
-        <w:spacing w:before="0" w:after="80"/>
-        <w:jc w:val="left"/>
-      </w:pPr>
-      <w:r>
-        <w:rPr>
-          <w:rFonts w:ascii="Courier New" w:hAnsi="Courier New"/>
-          <w:b/>
-          <w:sz w:val="20"/>
-        </w:rPr>
-        <w:t>Advance Tax Servs Accountants Inc</w:t>
-      </w:r>
-    </w:p>
-    <w:p>
-      <w:pPr>
-        <w:spacing w:before="0" w:after="80"/>
-        <w:jc w:val="left"/>
-      </w:pPr>
-      <w:r>
-        <w:rPr>
-          <w:rFonts w:ascii="Courier New" w:hAnsi="Courier New"/>
-          <w:b w:val="0"/>
-          <w:sz w:val="20"/>
-        </w:rPr>
-        <w:t>4 Mount Royal Ave Ste 4 110 F</w:t>
-      </w:r>
-    </w:p>
-    <w:p>
-      <w:pPr>
-        <w:spacing w:before="0" w:after="80"/>
-        <w:jc w:val="left"/>
-      </w:pPr>
-      <w:r>
-        <w:rPr>
-          <w:rFonts w:ascii="Courier New" w:hAnsi="Courier New"/>
-          <w:b w:val="0"/>
-          <w:sz w:val="20"/>
-        </w:rPr>
-        <w:t>Marlborough, MA 01752</w:t>
-      </w:r>
-    </w:p>
-    <w:p>
-      <w:pPr>
-        <w:spacing w:before="0" w:after="80"/>
-        <w:jc w:val="left"/>
-      </w:pPr>
-      <w:r>
-        <w:rPr>
-          <w:rFonts w:ascii="Courier New" w:hAnsi="Courier New"/>
-          <w:b w:val="0"/>
-          <w:sz w:val="20"/>
-        </w:rPr>
-        <w:t>Phone: (781) 759-2202</w:t>
-      </w:r>
-    </w:p>
-    <w:p>
-      <w:pPr>
-        <w:spacing w:before="0" w:after="80"/>
-        <w:jc w:val="left"/>
-      </w:pPr>
-      <w:r>
-        <w:rPr>
-          <w:rFonts w:ascii="Courier New" w:hAnsi="Courier New"/>
-          <w:b w:val="0"/>
-          <w:sz w:val="20"/>
-        </w:rPr>
-        <w:t>Email: isabel@advancetaxservices.accountants</w:t>
+        <w:t>========================================================================</w:t>
       </w:r>
     </w:p>
     <w:p>
@@ -207,10 +128,12 @@
     <w:p>
       <w:pPr>
         <w:spacing w:before="40" w:after="40"/>
+        <w:jc w:val="left"/>
       </w:pPr>
       <w:r>
         <w:rPr>
           <w:rFonts w:ascii="Courier New" w:hAnsi="Courier New"/>
+          <w:b w:val="0"/>
           <w:sz w:val="18"/>
         </w:rPr>
         <w:t>------------------------------------------------------------------------</w:t>
@@ -289,10 +212,12 @@
     <w:p>
       <w:pPr>
         <w:spacing w:before="40" w:after="40"/>
+        <w:jc w:val="left"/>
       </w:pPr>
       <w:r>
         <w:rPr>
           <w:rFonts w:ascii="Courier New" w:hAnsi="Courier New"/>
+          <w:b w:val="0"/>
           <w:sz w:val="18"/>
         </w:rPr>
         <w:t>------------------------------------------------------------------------</w:t>
@@ -376,7 +301,7 @@
           <w:b w:val="0"/>
           <w:sz w:val="20"/>
         </w:rPr>
-        <w:t>My return was electronically filed on September 26, 2025, and accepted by the IRS on the same date (Submission ID: XXXXXX2025269pe21o4g). The return was prepared by Isabel Raimundo, Advance Tax Servs Accountants Inc (PTIN: XXXXXXXXX / EIN: 88-0523842).</w:t>
+        <w:t>My return was electronically filed on September 26, 2025, and accepted by the IRS on the same date (Submission ID: XXXXXX2025269pe21o4g).</w:t>
       </w:r>
     </w:p>
     <w:p>
@@ -422,10 +347,12 @@
     <w:p>
       <w:pPr>
         <w:spacing w:before="80" w:after="80"/>
+        <w:jc w:val="left"/>
       </w:pPr>
       <w:r>
         <w:rPr>
           <w:rFonts w:ascii="Courier New" w:hAnsi="Courier New"/>
+          <w:b w:val="0"/>
           <w:sz w:val="18"/>
         </w:rPr>
         <w:t>========================================================================</w:t>
@@ -433,7 +360,8 @@
     </w:p>
     <w:p>
       <w:pPr>
-        <w:spacing w:before="200" w:after="80"/>
+        <w:spacing w:before="0" w:after="80"/>
+        <w:jc w:val="left"/>
       </w:pPr>
       <w:r>
         <w:rPr>
@@ -447,10 +375,12 @@
     <w:p>
       <w:pPr>
         <w:spacing w:before="80" w:after="80"/>
+        <w:jc w:val="left"/>
       </w:pPr>
       <w:r>
         <w:rPr>
           <w:rFonts w:ascii="Courier New" w:hAnsi="Courier New"/>
+          <w:b w:val="0"/>
           <w:sz w:val="18"/>
         </w:rPr>
         <w:t>========================================================================</w:t>
@@ -625,10 +555,12 @@
     <w:p>
       <w:pPr>
         <w:spacing w:before="80" w:after="80"/>
+        <w:jc w:val="left"/>
       </w:pPr>
       <w:r>
         <w:rPr>
           <w:rFonts w:ascii="Courier New" w:hAnsi="Courier New"/>
+          <w:b w:val="0"/>
           <w:sz w:val="18"/>
         </w:rPr>
         <w:t>========================================================================</w:t>
@@ -636,7 +568,8 @@
     </w:p>
     <w:p>
       <w:pPr>
-        <w:spacing w:before="200" w:after="80"/>
+        <w:spacing w:before="0" w:after="80"/>
+        <w:jc w:val="left"/>
       </w:pPr>
       <w:r>
         <w:rPr>
@@ -650,10 +583,12 @@
     <w:p>
       <w:pPr>
         <w:spacing w:before="80" w:after="80"/>
+        <w:jc w:val="left"/>
       </w:pPr>
       <w:r>
         <w:rPr>
           <w:rFonts w:ascii="Courier New" w:hAnsi="Courier New"/>
+          <w:b w:val="0"/>
           <w:sz w:val="18"/>
         </w:rPr>
         <w:t>========================================================================</w:t>
@@ -1201,10 +1136,12 @@
     <w:p>
       <w:pPr>
         <w:spacing w:before="80" w:after="80"/>
+        <w:jc w:val="left"/>
       </w:pPr>
       <w:r>
         <w:rPr>
           <w:rFonts w:ascii="Courier New" w:hAnsi="Courier New"/>
+          <w:b w:val="0"/>
           <w:sz w:val="18"/>
         </w:rPr>
         <w:t>========================================================================</w:t>
@@ -1212,7 +1149,8 @@
     </w:p>
     <w:p>
       <w:pPr>
-        <w:spacing w:before="200" w:after="80"/>
+        <w:spacing w:before="0" w:after="80"/>
+        <w:jc w:val="left"/>
       </w:pPr>
       <w:r>
         <w:rPr>
@@ -1226,10 +1164,12 @@
     <w:p>
       <w:pPr>
         <w:spacing w:before="80" w:after="80"/>
+        <w:jc w:val="left"/>
       </w:pPr>
       <w:r>
         <w:rPr>
           <w:rFonts w:ascii="Courier New" w:hAnsi="Courier New"/>
+          <w:b w:val="0"/>
           <w:sz w:val="18"/>
         </w:rPr>
         <w:t>========================================================================</w:t>
@@ -1569,10 +1509,12 @@
     <w:p>
       <w:pPr>
         <w:spacing w:before="40" w:after="40"/>
+        <w:jc w:val="left"/>
       </w:pPr>
       <w:r>
         <w:rPr>
           <w:rFonts w:ascii="Courier New" w:hAnsi="Courier New"/>
+          <w:b w:val="0"/>
           <w:sz w:val="18"/>
         </w:rPr>
         <w:t>------------------------------------------------------------------------</w:t>
@@ -1898,10 +1840,12 @@
     <w:p>
       <w:pPr>
         <w:spacing w:before="40" w:after="40"/>
+        <w:jc w:val="left"/>
       </w:pPr>
       <w:r>
         <w:rPr>
           <w:rFonts w:ascii="Courier New" w:hAnsi="Courier New"/>
+          <w:b w:val="0"/>
           <w:sz w:val="18"/>
         </w:rPr>
         <w:t>------------------------------------------------------------------------</w:t>
@@ -2075,10 +2019,12 @@
     <w:p>
       <w:pPr>
         <w:spacing w:before="80" w:after="80"/>
+        <w:jc w:val="left"/>
       </w:pPr>
       <w:r>
         <w:rPr>
           <w:rFonts w:ascii="Courier New" w:hAnsi="Courier New"/>
+          <w:b w:val="0"/>
           <w:sz w:val="18"/>
         </w:rPr>
         <w:t>========================================================================</w:t>
@@ -2086,7 +2032,8 @@
     </w:p>
     <w:p>
       <w:pPr>
-        <w:spacing w:before="200" w:after="80"/>
+        <w:spacing w:before="0" w:after="80"/>
+        <w:jc w:val="left"/>
       </w:pPr>
       <w:r>
         <w:rPr>
@@ -2100,10 +2047,12 @@
     <w:p>
       <w:pPr>
         <w:spacing w:before="80" w:after="80"/>
+        <w:jc w:val="left"/>
       </w:pPr>
       <w:r>
         <w:rPr>
           <w:rFonts w:ascii="Courier New" w:hAnsi="Courier New"/>
+          <w:b w:val="0"/>
           <w:sz w:val="18"/>
         </w:rPr>
         <w:t>========================================================================</w:t>
@@ -2317,10 +2266,12 @@
     <w:p>
       <w:pPr>
         <w:spacing w:before="80" w:after="80"/>
+        <w:jc w:val="left"/>
       </w:pPr>
       <w:r>
         <w:rPr>
           <w:rFonts w:ascii="Courier New" w:hAnsi="Courier New"/>
+          <w:b w:val="0"/>
           <w:sz w:val="18"/>
         </w:rPr>
         <w:t>========================================================================</w:t>
@@ -2328,7 +2279,8 @@
     </w:p>
     <w:p>
       <w:pPr>
-        <w:spacing w:before="200" w:after="80"/>
+        <w:spacing w:before="0" w:after="80"/>
+        <w:jc w:val="left"/>
       </w:pPr>
       <w:r>
         <w:rPr>
@@ -2342,10 +2294,12 @@
     <w:p>
       <w:pPr>
         <w:spacing w:before="80" w:after="80"/>
+        <w:jc w:val="left"/>
       </w:pPr>
       <w:r>
         <w:rPr>
           <w:rFonts w:ascii="Courier New" w:hAnsi="Courier New"/>
+          <w:b w:val="0"/>
           <w:sz w:val="18"/>
         </w:rPr>
         <w:t>========================================================================</w:t>
@@ -2464,10 +2418,12 @@
     <w:p>
       <w:pPr>
         <w:spacing w:before="80" w:after="80"/>
+        <w:jc w:val="left"/>
       </w:pPr>
       <w:r>
         <w:rPr>
           <w:rFonts w:ascii="Courier New" w:hAnsi="Courier New"/>
+          <w:b w:val="0"/>
           <w:sz w:val="18"/>
         </w:rPr>
         <w:t>========================================================================</w:t>
@@ -2475,7 +2431,8 @@
     </w:p>
     <w:p>
       <w:pPr>
-        <w:spacing w:before="200" w:after="80"/>
+        <w:spacing w:before="0" w:after="80"/>
+        <w:jc w:val="left"/>
       </w:pPr>
       <w:r>
         <w:rPr>
@@ -2489,10 +2446,12 @@
     <w:p>
       <w:pPr>
         <w:spacing w:before="80" w:after="80"/>
+        <w:jc w:val="left"/>
       </w:pPr>
       <w:r>
         <w:rPr>
           <w:rFonts w:ascii="Courier New" w:hAnsi="Courier New"/>
+          <w:b w:val="0"/>
           <w:sz w:val="18"/>
         </w:rPr>
         <w:t>========================================================================</w:t>
@@ -2625,10 +2584,12 @@
     <w:p>
       <w:pPr>
         <w:spacing w:before="80" w:after="80"/>
+        <w:jc w:val="left"/>
       </w:pPr>
       <w:r>
         <w:rPr>
           <w:rFonts w:ascii="Courier New" w:hAnsi="Courier New"/>
+          <w:b w:val="0"/>
           <w:sz w:val="18"/>
         </w:rPr>
         <w:t>========================================================================</w:t>
@@ -2636,7 +2597,8 @@
     </w:p>
     <w:p>
       <w:pPr>
-        <w:spacing w:before="200" w:after="80"/>
+        <w:spacing w:before="0" w:after="80"/>
+        <w:jc w:val="left"/>
       </w:pPr>
       <w:r>
         <w:rPr>
@@ -2650,10 +2612,12 @@
     <w:p>
       <w:pPr>
         <w:spacing w:before="80" w:after="80"/>
+        <w:jc w:val="left"/>
       </w:pPr>
       <w:r>
         <w:rPr>
           <w:rFonts w:ascii="Courier New" w:hAnsi="Courier New"/>
+          <w:b w:val="0"/>
           <w:sz w:val="18"/>
         </w:rPr>
         <w:t>========================================================================</w:t>
@@ -2702,10 +2666,12 @@
     <w:p>
       <w:pPr>
         <w:spacing w:before="80" w:after="80"/>
+        <w:jc w:val="left"/>
       </w:pPr>
       <w:r>
         <w:rPr>
           <w:rFonts w:ascii="Courier New" w:hAnsi="Courier New"/>
+          <w:b w:val="0"/>
           <w:sz w:val="18"/>
         </w:rPr>
         <w:t>========================================================================</w:t>
@@ -2713,7 +2679,8 @@
     </w:p>
     <w:p>
       <w:pPr>
-        <w:spacing w:before="200" w:after="80"/>
+        <w:spacing w:before="0" w:after="80"/>
+        <w:jc w:val="left"/>
       </w:pPr>
       <w:r>
         <w:rPr>
@@ -2727,10 +2694,12 @@
     <w:p>
       <w:pPr>
         <w:spacing w:before="80" w:after="80"/>
+        <w:jc w:val="left"/>
       </w:pPr>
       <w:r>
         <w:rPr>
           <w:rFonts w:ascii="Courier New" w:hAnsi="Courier New"/>
+          <w:b w:val="0"/>
           <w:sz w:val="18"/>
         </w:rPr>
         <w:t>========================================================================</w:t>
@@ -2975,10 +2944,12 @@
     <w:p>
       <w:pPr>
         <w:spacing w:before="80" w:after="80"/>
+        <w:jc w:val="left"/>
       </w:pPr>
       <w:r>
         <w:rPr>
           <w:rFonts w:ascii="Courier New" w:hAnsi="Courier New"/>
+          <w:b w:val="0"/>
           <w:sz w:val="18"/>
         </w:rPr>
         <w:t>========================================================================</w:t>
@@ -3008,7 +2979,7 @@
           <w:b w:val="0"/>
           <w:sz w:val="20"/>
         </w:rPr>
-        <w:t>I trust this information fully addresses the items raised in Notice LTR566T. Should you require any additional documentation, please contact me directly or through my tax preparer listed below.</w:t>
+        <w:t>I trust this information fully addresses the items raised in Notice LTR566T. Should you require any additional documentation, please contact me directly.</w:t>
       </w:r>
     </w:p>
     <w:p>
@@ -3190,121 +3161,13 @@
     </w:p>
     <w:p>
       <w:pPr>
-        <w:spacing w:before="0" w:after="80"/>
+        <w:spacing w:before="80" w:after="80"/>
         <w:jc w:val="left"/>
       </w:pPr>
       <w:r>
         <w:rPr>
           <w:rFonts w:ascii="Courier New" w:hAnsi="Courier New"/>
           <w:b w:val="0"/>
-          <w:sz w:val="20"/>
-        </w:rPr>
-      </w:r>
-    </w:p>
-    <w:p>
-      <w:pPr>
-        <w:spacing w:before="0" w:after="80"/>
-        <w:jc w:val="left"/>
-      </w:pPr>
-      <w:r>
-        <w:rPr>
-          <w:rFonts w:ascii="Courier New" w:hAnsi="Courier New"/>
-          <w:b w:val="0"/>
-          <w:sz w:val="20"/>
-        </w:rPr>
-        <w:t>Prepared by:</w:t>
-      </w:r>
-    </w:p>
-    <w:p>
-      <w:pPr>
-        <w:spacing w:before="0" w:after="80"/>
-        <w:jc w:val="left"/>
-      </w:pPr>
-      <w:r>
-        <w:rPr>
-          <w:rFonts w:ascii="Courier New" w:hAnsi="Courier New"/>
-          <w:b/>
-          <w:sz w:val="20"/>
-        </w:rPr>
-        <w:t>Isabel Raimundo</w:t>
-      </w:r>
-    </w:p>
-    <w:p>
-      <w:pPr>
-        <w:spacing w:before="0" w:after="80"/>
-        <w:jc w:val="left"/>
-      </w:pPr>
-      <w:r>
-        <w:rPr>
-          <w:rFonts w:ascii="Courier New" w:hAnsi="Courier New"/>
-          <w:b w:val="0"/>
-          <w:sz w:val="20"/>
-        </w:rPr>
-        <w:t>Advance Tax Servs Accountants Inc</w:t>
-      </w:r>
-    </w:p>
-    <w:p>
-      <w:pPr>
-        <w:spacing w:before="0" w:after="80"/>
-        <w:jc w:val="left"/>
-      </w:pPr>
-      <w:r>
-        <w:rPr>
-          <w:rFonts w:ascii="Courier New" w:hAnsi="Courier New"/>
-          <w:b w:val="0"/>
-          <w:sz w:val="20"/>
-        </w:rPr>
-        <w:t>4 Mount Royal Ave Ste 4 110 F, Marlborough, MA 01752</w:t>
-      </w:r>
-    </w:p>
-    <w:p>
-      <w:pPr>
-        <w:spacing w:before="0" w:after="80"/>
-        <w:jc w:val="left"/>
-      </w:pPr>
-      <w:r>
-        <w:rPr>
-          <w:rFonts w:ascii="Courier New" w:hAnsi="Courier New"/>
-          <w:b w:val="0"/>
-          <w:sz w:val="20"/>
-        </w:rPr>
-        <w:t>Phone: (781) 759-2202</w:t>
-      </w:r>
-    </w:p>
-    <w:p>
-      <w:pPr>
-        <w:spacing w:before="0" w:after="80"/>
-        <w:jc w:val="left"/>
-      </w:pPr>
-      <w:r>
-        <w:rPr>
-          <w:rFonts w:ascii="Courier New" w:hAnsi="Courier New"/>
-          <w:b w:val="0"/>
-          <w:sz w:val="20"/>
-        </w:rPr>
-        <w:t>EIN: 88-0523842</w:t>
-      </w:r>
-    </w:p>
-    <w:p>
-      <w:pPr>
-        <w:spacing w:before="0" w:after="80"/>
-        <w:jc w:val="left"/>
-      </w:pPr>
-      <w:r>
-        <w:rPr>
-          <w:rFonts w:ascii="Courier New" w:hAnsi="Courier New"/>
-          <w:b w:val="0"/>
-          <w:sz w:val="20"/>
-        </w:rPr>
-      </w:r>
-    </w:p>
-    <w:p>
-      <w:pPr>
-        <w:spacing w:before="80" w:after="80"/>
-      </w:pPr>
-      <w:r>
-        <w:rPr>
-          <w:rFonts w:ascii="Courier New" w:hAnsi="Courier New"/>
           <w:sz w:val="18"/>
         </w:rPr>
         <w:t>========================================================================</w:t>
@@ -3327,10 +3190,12 @@
     <w:p>
       <w:pPr>
         <w:spacing w:before="80" w:after="80"/>
+        <w:jc w:val="left"/>
       </w:pPr>
       <w:r>
         <w:rPr>
           <w:rFonts w:ascii="Courier New" w:hAnsi="Courier New"/>
+          <w:b w:val="0"/>
           <w:sz w:val="18"/>
         </w:rPr>
         <w:t>========================================================================</w:t>

</xml_diff>

<commit_message>
Add IRS mailing address — Memphis TN 38130-0911
https://claude.ai/code/session_019pk3CFrfADSxNgg23VPbbZ
</commit_message>
<xml_diff>
--- a/IRS_LTR566T_Response_Eliana_Machado_2024.docx
+++ b/IRS_LTR566T_Response_Eliana_Machado_2024.docx
@@ -106,10 +106,24 @@
       <w:r>
         <w:rPr>
           <w:rFonts w:ascii="Courier New" w:hAnsi="Courier New"/>
-          <w:b/>
+          <w:b w:val="0"/>
           <w:sz w:val="20"/>
         </w:rPr>
-        <w:t>[ADDRESS AS SHOWN ON NOTICE LTR566T]</w:t>
+        <w:t>P.O. Box 30901, AMC 8236</w:t>
+      </w:r>
+    </w:p>
+    <w:p>
+      <w:pPr>
+        <w:spacing w:before="0" w:after="80"/>
+        <w:jc w:val="left"/>
+      </w:pPr>
+      <w:r>
+        <w:rPr>
+          <w:rFonts w:ascii="Courier New" w:hAnsi="Courier New"/>
+          <w:b w:val="0"/>
+          <w:sz w:val="20"/>
+        </w:rPr>
+        <w:t>Memphis, TN 38130-0911</w:t>
       </w:r>
     </w:p>
     <w:p>

</xml_diff>

<commit_message>
Simplify response letter — address only items requested by IRS (Schedule A mortgage interest and QBI)
https://claude.ai/code/session_019pk3CFrfADSxNgg23VPbbZ
</commit_message>
<xml_diff>
--- a/IRS_LTR566T_Response_Eliana_Machado_2024.docx
+++ b/IRS_LTR566T_Response_Eliana_Machado_2024.docx
@@ -4,3215 +4,807 @@
   <w:body>
     <w:p>
       <w:pPr>
-        <w:spacing w:before="80" w:after="80"/>
+        <w:spacing w:before="0" w:after="120"/>
         <w:jc w:val="left"/>
       </w:pPr>
       <w:r>
         <w:rPr>
-          <w:rFonts w:ascii="Courier New" w:hAnsi="Courier New"/>
+          <w:rFonts w:ascii="Times New Roman" w:hAnsi="Times New Roman"/>
           <w:b w:val="0"/>
-          <w:sz w:val="18"/>
+          <w:sz w:val="22"/>
         </w:rPr>
-        <w:t>========================================================================</w:t>
+        <w:t>June 13, 2026</w:t>
       </w:r>
     </w:p>
     <w:p>
       <w:pPr>
-        <w:spacing w:before="0" w:after="40"/>
-        <w:jc w:val="center"/>
-      </w:pPr>
-      <w:r>
-        <w:rPr>
-          <w:rFonts w:ascii="Courier New" w:hAnsi="Courier New"/>
-          <w:b/>
-          <w:sz w:val="24"/>
-        </w:rPr>
-        <w:t>RESPONSE TO IRS NOTICE LTR566T</w:t>
-      </w:r>
-    </w:p>
-    <w:p>
-      <w:pPr>
-        <w:spacing w:before="80" w:after="80"/>
+        <w:spacing w:before="0" w:after="120"/>
         <w:jc w:val="left"/>
       </w:pPr>
       <w:r>
         <w:rPr>
-          <w:rFonts w:ascii="Courier New" w:hAnsi="Courier New"/>
+          <w:rFonts w:ascii="Times New Roman" w:hAnsi="Times New Roman"/>
           <w:b w:val="0"/>
-          <w:sz w:val="18"/>
-        </w:rPr>
-        <w:t>========================================================================</w:t>
-      </w:r>
-    </w:p>
-    <w:p>
-      <w:pPr>
-        <w:spacing w:before="0" w:after="80"/>
-        <w:jc w:val="left"/>
-      </w:pPr>
-      <w:r>
-        <w:rPr>
-          <w:rFonts w:ascii="Courier New" w:hAnsi="Courier New"/>
-          <w:b w:val="0"/>
-          <w:sz w:val="20"/>
+          <w:sz w:val="22"/>
         </w:rPr>
       </w:r>
     </w:p>
     <w:p>
       <w:pPr>
-        <w:spacing w:before="0" w:after="80"/>
+        <w:spacing w:before="0" w:after="120"/>
         <w:jc w:val="left"/>
       </w:pPr>
       <w:r>
         <w:rPr>
-          <w:rFonts w:ascii="Courier New" w:hAnsi="Courier New"/>
+          <w:rFonts w:ascii="Times New Roman" w:hAnsi="Times New Roman"/>
           <w:b w:val="0"/>
-          <w:sz w:val="20"/>
-        </w:rPr>
-        <w:t>Date: June 13, 2026</w:t>
-      </w:r>
-    </w:p>
-    <w:p>
-      <w:pPr>
-        <w:spacing w:before="0" w:after="80"/>
-        <w:jc w:val="left"/>
-      </w:pPr>
-      <w:r>
-        <w:rPr>
-          <w:rFonts w:ascii="Courier New" w:hAnsi="Courier New"/>
-          <w:b w:val="0"/>
-          <w:sz w:val="20"/>
-        </w:rPr>
-      </w:r>
-    </w:p>
-    <w:p>
-      <w:pPr>
-        <w:spacing w:before="0" w:after="80"/>
-        <w:jc w:val="left"/>
-      </w:pPr>
-      <w:r>
-        <w:rPr>
-          <w:rFonts w:ascii="Courier New" w:hAnsi="Courier New"/>
-          <w:b w:val="0"/>
-          <w:sz w:val="20"/>
+          <w:sz w:val="22"/>
         </w:rPr>
         <w:t>Internal Revenue Service</w:t>
       </w:r>
     </w:p>
     <w:p>
       <w:pPr>
-        <w:spacing w:before="0" w:after="80"/>
+        <w:spacing w:before="0" w:after="120"/>
         <w:jc w:val="left"/>
       </w:pPr>
       <w:r>
         <w:rPr>
-          <w:rFonts w:ascii="Courier New" w:hAnsi="Courier New"/>
+          <w:rFonts w:ascii="Times New Roman" w:hAnsi="Times New Roman"/>
           <w:b w:val="0"/>
-          <w:sz w:val="20"/>
+          <w:sz w:val="22"/>
         </w:rPr>
-        <w:t>P.O. Box 30901, AMC 8236</w:t>
+        <w:t>P.O. Box 309011, AMC 8236</w:t>
       </w:r>
     </w:p>
     <w:p>
       <w:pPr>
-        <w:spacing w:before="0" w:after="80"/>
+        <w:spacing w:before="0" w:after="120"/>
         <w:jc w:val="left"/>
       </w:pPr>
       <w:r>
         <w:rPr>
-          <w:rFonts w:ascii="Courier New" w:hAnsi="Courier New"/>
+          <w:rFonts w:ascii="Times New Roman" w:hAnsi="Times New Roman"/>
           <w:b w:val="0"/>
-          <w:sz w:val="20"/>
+          <w:sz w:val="22"/>
         </w:rPr>
         <w:t>Memphis, TN 38130-0911</w:t>
       </w:r>
     </w:p>
     <w:p>
       <w:pPr>
-        <w:spacing w:before="0" w:after="80"/>
+        <w:spacing w:before="0" w:after="120"/>
         <w:jc w:val="left"/>
       </w:pPr>
       <w:r>
         <w:rPr>
-          <w:rFonts w:ascii="Courier New" w:hAnsi="Courier New"/>
+          <w:rFonts w:ascii="Times New Roman" w:hAnsi="Times New Roman"/>
           <w:b w:val="0"/>
-          <w:sz w:val="20"/>
+          <w:sz w:val="22"/>
         </w:rPr>
       </w:r>
     </w:p>
     <w:p>
       <w:pPr>
-        <w:spacing w:before="40" w:after="40"/>
+        <w:spacing w:before="0" w:after="120"/>
         <w:jc w:val="left"/>
       </w:pPr>
       <w:r>
         <w:rPr>
-          <w:rFonts w:ascii="Courier New" w:hAnsi="Courier New"/>
-          <w:b w:val="0"/>
-          <w:sz w:val="18"/>
+          <w:rFonts w:ascii="Times New Roman" w:hAnsi="Times New Roman"/>
+          <w:b/>
+          <w:sz w:val="22"/>
         </w:rPr>
-        <w:t>------------------------------------------------------------------------</w:t>
+        <w:t>Re:     Response to Notice LTR566T</w:t>
       </w:r>
     </w:p>
     <w:p>
       <w:pPr>
-        <w:spacing w:before="0" w:after="80"/>
+        <w:spacing w:before="0" w:after="120"/>
         <w:jc w:val="left"/>
       </w:pPr>
       <w:r>
         <w:rPr>
-          <w:rFonts w:ascii="Courier New" w:hAnsi="Courier New"/>
+          <w:rFonts w:ascii="Times New Roman" w:hAnsi="Times New Roman"/>
           <w:b w:val="0"/>
-          <w:sz w:val="20"/>
+          <w:sz w:val="22"/>
         </w:rPr>
-        <w:t>Re:     Response to LTR566T — Notice Date: May 18, 2026</w:t>
+        <w:t xml:space="preserve">        Taxpayer:       Eliana Machado de Almeida</w:t>
       </w:r>
     </w:p>
     <w:p>
       <w:pPr>
-        <w:spacing w:before="0" w:after="80"/>
+        <w:spacing w:before="0" w:after="120"/>
         <w:jc w:val="left"/>
       </w:pPr>
       <w:r>
         <w:rPr>
-          <w:rFonts w:ascii="Courier New" w:hAnsi="Courier New"/>
+          <w:rFonts w:ascii="Times New Roman" w:hAnsi="Times New Roman"/>
           <w:b w:val="0"/>
-          <w:sz w:val="20"/>
+          <w:sz w:val="22"/>
         </w:rPr>
-        <w:t xml:space="preserve">        Taxpayer:   Eliana Machado de Almeida</w:t>
+        <w:t xml:space="preserve">        SSN:            697-75-6336</w:t>
       </w:r>
     </w:p>
     <w:p>
       <w:pPr>
-        <w:spacing w:before="0" w:after="80"/>
+        <w:spacing w:before="0" w:after="120"/>
         <w:jc w:val="left"/>
       </w:pPr>
       <w:r>
         <w:rPr>
-          <w:rFonts w:ascii="Courier New" w:hAnsi="Courier New"/>
+          <w:rFonts w:ascii="Times New Roman" w:hAnsi="Times New Roman"/>
           <w:b w:val="0"/>
-          <w:sz w:val="20"/>
+          <w:sz w:val="22"/>
         </w:rPr>
-        <w:t xml:space="preserve">        SSN:        697-75-6336</w:t>
+        <w:t xml:space="preserve">        Tax Year:       2024 (Form 1040)</w:t>
       </w:r>
     </w:p>
     <w:p>
       <w:pPr>
-        <w:spacing w:before="0" w:after="80"/>
+        <w:spacing w:before="0" w:after="120"/>
         <w:jc w:val="left"/>
       </w:pPr>
       <w:r>
         <w:rPr>
-          <w:rFonts w:ascii="Courier New" w:hAnsi="Courier New"/>
+          <w:rFonts w:ascii="Times New Roman" w:hAnsi="Times New Roman"/>
           <w:b w:val="0"/>
-          <w:sz w:val="20"/>
+          <w:sz w:val="22"/>
         </w:rPr>
-        <w:t xml:space="preserve">        Tax Year:   2024</w:t>
+        <w:t xml:space="preserve">        Notice Date:    May 18, 2026</w:t>
       </w:r>
     </w:p>
     <w:p>
       <w:pPr>
-        <w:spacing w:before="0" w:after="80"/>
+        <w:spacing w:before="0" w:after="120"/>
         <w:jc w:val="left"/>
       </w:pPr>
       <w:r>
         <w:rPr>
-          <w:rFonts w:ascii="Courier New" w:hAnsi="Courier New"/>
+          <w:rFonts w:ascii="Times New Roman" w:hAnsi="Times New Roman"/>
           <w:b w:val="0"/>
-          <w:sz w:val="20"/>
+          <w:sz w:val="22"/>
         </w:rPr>
-        <w:t xml:space="preserve">        Notice:     LTR566T</w:t>
+        <w:t xml:space="preserve">        Project Code:   0417</w:t>
       </w:r>
     </w:p>
     <w:p>
       <w:pPr>
-        <w:spacing w:before="40" w:after="40"/>
+        <w:spacing w:before="0" w:after="120"/>
         <w:jc w:val="left"/>
       </w:pPr>
       <w:r>
         <w:rPr>
-          <w:rFonts w:ascii="Courier New" w:hAnsi="Courier New"/>
+          <w:rFonts w:ascii="Times New Roman" w:hAnsi="Times New Roman"/>
           <w:b w:val="0"/>
-          <w:sz w:val="18"/>
-        </w:rPr>
-        <w:t>------------------------------------------------------------------------</w:t>
-      </w:r>
-    </w:p>
-    <w:p>
-      <w:pPr>
-        <w:spacing w:before="0" w:after="80"/>
-        <w:jc w:val="left"/>
-      </w:pPr>
-      <w:r>
-        <w:rPr>
-          <w:rFonts w:ascii="Courier New" w:hAnsi="Courier New"/>
-          <w:b w:val="0"/>
-          <w:sz w:val="20"/>
+          <w:sz w:val="22"/>
         </w:rPr>
       </w:r>
     </w:p>
     <w:p>
       <w:pPr>
-        <w:spacing w:before="0" w:after="80"/>
+        <w:spacing w:before="0" w:after="120"/>
         <w:jc w:val="left"/>
       </w:pPr>
       <w:r>
         <w:rPr>
-          <w:rFonts w:ascii="Courier New" w:hAnsi="Courier New"/>
+          <w:rFonts w:ascii="Times New Roman" w:hAnsi="Times New Roman"/>
           <w:b w:val="0"/>
-          <w:sz w:val="20"/>
+          <w:sz w:val="22"/>
         </w:rPr>
         <w:t>Dear IRS Examiner,</w:t>
       </w:r>
     </w:p>
     <w:p>
       <w:pPr>
-        <w:spacing w:before="0" w:after="80"/>
+        <w:spacing w:before="0" w:after="120"/>
         <w:jc w:val="left"/>
       </w:pPr>
       <w:r>
         <w:rPr>
-          <w:rFonts w:ascii="Courier New" w:hAnsi="Courier New"/>
+          <w:rFonts w:ascii="Times New Roman" w:hAnsi="Times New Roman"/>
           <w:b w:val="0"/>
-          <w:sz w:val="20"/>
+          <w:sz w:val="22"/>
         </w:rPr>
       </w:r>
     </w:p>
     <w:p>
       <w:pPr>
-        <w:spacing w:before="0" w:after="80"/>
+        <w:spacing w:before="0" w:after="120"/>
         <w:jc w:val="left"/>
       </w:pPr>
       <w:r>
         <w:rPr>
-          <w:rFonts w:ascii="Courier New" w:hAnsi="Courier New"/>
+          <w:rFonts w:ascii="Times New Roman" w:hAnsi="Times New Roman"/>
           <w:b w:val="0"/>
-          <w:sz w:val="20"/>
+          <w:sz w:val="22"/>
         </w:rPr>
-        <w:t>I, Eliana Machado de Almeida, am writing in response to the LTR566T dated May 18, 2026, regarding my 2024 Federal Income Tax Return (Form 1040).</w:t>
+        <w:t>I am writing in response to Notice LTR566T dated May 18, 2026, requesting additional information to support the following items claimed on my 2024 federal income tax return:</w:t>
       </w:r>
     </w:p>
     <w:p>
       <w:pPr>
-        <w:spacing w:before="0" w:after="80"/>
+        <w:spacing w:before="0" w:after="120"/>
         <w:jc w:val="left"/>
       </w:pPr>
       <w:r>
         <w:rPr>
-          <w:rFonts w:ascii="Courier New" w:hAnsi="Courier New"/>
+          <w:rFonts w:ascii="Times New Roman" w:hAnsi="Times New Roman"/>
           <w:b w:val="0"/>
-          <w:sz w:val="20"/>
+          <w:sz w:val="22"/>
         </w:rPr>
       </w:r>
     </w:p>
     <w:p>
       <w:pPr>
-        <w:spacing w:before="0" w:after="80"/>
+        <w:spacing w:before="0" w:after="120"/>
         <w:jc w:val="left"/>
       </w:pPr>
       <w:r>
         <w:rPr>
-          <w:rFonts w:ascii="Courier New" w:hAnsi="Courier New"/>
+          <w:rFonts w:ascii="Times New Roman" w:hAnsi="Times New Roman"/>
           <w:b w:val="0"/>
-          <w:sz w:val="20"/>
+          <w:sz w:val="22"/>
         </w:rPr>
-        <w:t>My return was electronically filed on September 26, 2025, and accepted by the IRS on the same date (Submission ID: XXXXXX2025269pe21o4g).</w:t>
+        <w:t xml:space="preserve">      •   Schedule A — Home Mortgage Interest (Form 1098)</w:t>
       </w:r>
     </w:p>
     <w:p>
       <w:pPr>
-        <w:spacing w:before="0" w:after="80"/>
+        <w:spacing w:before="0" w:after="120"/>
         <w:jc w:val="left"/>
       </w:pPr>
       <w:r>
         <w:rPr>
-          <w:rFonts w:ascii="Courier New" w:hAnsi="Courier New"/>
+          <w:rFonts w:ascii="Times New Roman" w:hAnsi="Times New Roman"/>
           <w:b w:val="0"/>
-          <w:sz w:val="20"/>
+          <w:sz w:val="22"/>
+        </w:rPr>
+        <w:t xml:space="preserve">      •   Qualified Business Income Deduction (Form 8995 / Form 14997)</w:t>
+      </w:r>
+    </w:p>
+    <w:p>
+      <w:pPr>
+        <w:spacing w:before="0" w:after="120"/>
+        <w:jc w:val="left"/>
+      </w:pPr>
+      <w:r>
+        <w:rPr>
+          <w:rFonts w:ascii="Times New Roman" w:hAnsi="Times New Roman"/>
+          <w:b w:val="0"/>
+          <w:sz w:val="22"/>
         </w:rPr>
       </w:r>
     </w:p>
     <w:p>
       <w:pPr>
-        <w:spacing w:before="0" w:after="80"/>
+        <w:spacing w:before="0" w:after="120"/>
         <w:jc w:val="left"/>
       </w:pPr>
       <w:r>
         <w:rPr>
-          <w:rFonts w:ascii="Courier New" w:hAnsi="Courier New"/>
+          <w:rFonts w:ascii="Times New Roman" w:hAnsi="Times New Roman"/>
           <w:b w:val="0"/>
-          <w:sz w:val="20"/>
+          <w:sz w:val="22"/>
         </w:rPr>
-        <w:t>Below is a complete summary of my 2024 return with supporting information.</w:t>
+        <w:t>Please find enclosed the documents requested to substantiate each item, as described below.</w:t>
       </w:r>
     </w:p>
     <w:p>
       <w:pPr>
-        <w:spacing w:before="0" w:after="80"/>
+        <w:spacing w:before="0" w:after="120"/>
         <w:jc w:val="left"/>
       </w:pPr>
       <w:r>
         <w:rPr>
-          <w:rFonts w:ascii="Courier New" w:hAnsi="Courier New"/>
+          <w:rFonts w:ascii="Times New Roman" w:hAnsi="Times New Roman"/>
           <w:b w:val="0"/>
-          <w:sz w:val="20"/>
+          <w:sz w:val="22"/>
         </w:rPr>
       </w:r>
     </w:p>
     <w:p>
       <w:pPr>
-        <w:spacing w:before="80" w:after="80"/>
+        <w:spacing w:before="0" w:after="120"/>
         <w:jc w:val="left"/>
       </w:pPr>
       <w:r>
         <w:rPr>
-          <w:rFonts w:ascii="Courier New" w:hAnsi="Courier New"/>
-          <w:b w:val="0"/>
-          <w:sz w:val="18"/>
+          <w:rFonts w:ascii="Times New Roman" w:hAnsi="Times New Roman"/>
+          <w:b/>
+          <w:sz w:val="22"/>
         </w:rPr>
-        <w:t>========================================================================</w:t>
+        <w:t>1.   SCHEDULE A — HOME MORTGAGE INTEREST</w:t>
       </w:r>
     </w:p>
     <w:p>
       <w:pPr>
-        <w:spacing w:before="0" w:after="80"/>
+        <w:spacing w:before="0" w:after="120"/>
         <w:jc w:val="left"/>
       </w:pPr>
       <w:r>
         <w:rPr>
-          <w:rFonts w:ascii="Courier New" w:hAnsi="Courier New"/>
-          <w:b/>
-          <w:sz w:val="20"/>
-        </w:rPr>
-        <w:t>1. FILING STATUS &amp; RETURN SUMMARY</w:t>
-      </w:r>
-    </w:p>
-    <w:p>
-      <w:pPr>
-        <w:spacing w:before="80" w:after="80"/>
-        <w:jc w:val="left"/>
-      </w:pPr>
-      <w:r>
-        <w:rPr>
-          <w:rFonts w:ascii="Courier New" w:hAnsi="Courier New"/>
+          <w:rFonts w:ascii="Times New Roman" w:hAnsi="Times New Roman"/>
           <w:b w:val="0"/>
-          <w:sz w:val="18"/>
-        </w:rPr>
-        <w:t>========================================================================</w:t>
-      </w:r>
-    </w:p>
-    <w:p>
-      <w:pPr>
-        <w:spacing w:before="0" w:after="80"/>
-        <w:jc w:val="left"/>
-      </w:pPr>
-      <w:r>
-        <w:rPr>
-          <w:rFonts w:ascii="Courier New" w:hAnsi="Courier New"/>
-          <w:b w:val="0"/>
-          <w:sz w:val="20"/>
+          <w:sz w:val="22"/>
         </w:rPr>
       </w:r>
     </w:p>
     <w:p>
       <w:pPr>
-        <w:spacing w:before="0" w:after="80"/>
+        <w:spacing w:before="0" w:after="120"/>
         <w:jc w:val="left"/>
       </w:pPr>
       <w:r>
         <w:rPr>
-          <w:rFonts w:ascii="Courier New" w:hAnsi="Courier New"/>
+          <w:rFonts w:ascii="Times New Roman" w:hAnsi="Times New Roman"/>
           <w:b w:val="0"/>
-          <w:sz w:val="20"/>
+          <w:sz w:val="22"/>
         </w:rPr>
-        <w:t xml:space="preserve">  Filing Status:                      Single</w:t>
+        <w:t>I deducted a total of $114,034 in mortgage interest on Schedule A of my 2024 Form 1040, as reported on Forms 1098 received from my lenders. This amount covers the mortgages on my primary residence and rental properties.</w:t>
       </w:r>
     </w:p>
     <w:p>
       <w:pPr>
-        <w:spacing w:before="0" w:after="80"/>
+        <w:spacing w:before="0" w:after="120"/>
         <w:jc w:val="left"/>
       </w:pPr>
       <w:r>
         <w:rPr>
-          <w:rFonts w:ascii="Courier New" w:hAnsi="Courier New"/>
+          <w:rFonts w:ascii="Times New Roman" w:hAnsi="Times New Roman"/>
           <w:b w:val="0"/>
-          <w:sz w:val="20"/>
-        </w:rPr>
-        <w:t xml:space="preserve">  Total Income (Schedule 1):          $153,838</w:t>
-      </w:r>
-    </w:p>
-    <w:p>
-      <w:pPr>
-        <w:spacing w:before="0" w:after="80"/>
-        <w:jc w:val="left"/>
-      </w:pPr>
-      <w:r>
-        <w:rPr>
-          <w:rFonts w:ascii="Courier New" w:hAnsi="Courier New"/>
-          <w:b w:val="0"/>
-          <w:sz w:val="20"/>
-        </w:rPr>
-        <w:t xml:space="preserve">  Adjusted Gross Income:              $148,089</w:t>
-      </w:r>
-    </w:p>
-    <w:p>
-      <w:pPr>
-        <w:spacing w:before="0" w:after="80"/>
-        <w:jc w:val="left"/>
-      </w:pPr>
-      <w:r>
-        <w:rPr>
-          <w:rFonts w:ascii="Courier New" w:hAnsi="Courier New"/>
-          <w:b w:val="0"/>
-          <w:sz w:val="20"/>
-        </w:rPr>
-        <w:t xml:space="preserve">  Itemized Deductions (Schedule A):   $122,109</w:t>
-      </w:r>
-    </w:p>
-    <w:p>
-      <w:pPr>
-        <w:spacing w:before="0" w:after="80"/>
-        <w:jc w:val="left"/>
-      </w:pPr>
-      <w:r>
-        <w:rPr>
-          <w:rFonts w:ascii="Courier New" w:hAnsi="Courier New"/>
-          <w:b w:val="0"/>
-          <w:sz w:val="20"/>
-        </w:rPr>
-        <w:t xml:space="preserve">  QBI Deduction (Form 8995):          $  5,196</w:t>
-      </w:r>
-    </w:p>
-    <w:p>
-      <w:pPr>
-        <w:spacing w:before="0" w:after="80"/>
-        <w:jc w:val="left"/>
-      </w:pPr>
-      <w:r>
-        <w:rPr>
-          <w:rFonts w:ascii="Courier New" w:hAnsi="Courier New"/>
-          <w:b w:val="0"/>
-          <w:sz w:val="20"/>
-        </w:rPr>
-        <w:t xml:space="preserve">  Taxable Income:                     $ 20,784</w:t>
-      </w:r>
-    </w:p>
-    <w:p>
-      <w:pPr>
-        <w:spacing w:before="0" w:after="80"/>
-        <w:jc w:val="left"/>
-      </w:pPr>
-      <w:r>
-        <w:rPr>
-          <w:rFonts w:ascii="Courier New" w:hAnsi="Courier New"/>
-          <w:b w:val="0"/>
-          <w:sz w:val="20"/>
-        </w:rPr>
-        <w:t xml:space="preserve">  Income Tax (Line 16):               $  2,261</w:t>
-      </w:r>
-    </w:p>
-    <w:p>
-      <w:pPr>
-        <w:spacing w:before="0" w:after="80"/>
-        <w:jc w:val="left"/>
-      </w:pPr>
-      <w:r>
-        <w:rPr>
-          <w:rFonts w:ascii="Courier New" w:hAnsi="Courier New"/>
-          <w:b w:val="0"/>
-          <w:sz w:val="20"/>
-        </w:rPr>
-        <w:t xml:space="preserve">  Self-Employment Tax (Schedule SE):  $ 11,498</w:t>
-      </w:r>
-    </w:p>
-    <w:p>
-      <w:pPr>
-        <w:spacing w:before="0" w:after="80"/>
-        <w:jc w:val="left"/>
-      </w:pPr>
-      <w:r>
-        <w:rPr>
-          <w:rFonts w:ascii="Courier New" w:hAnsi="Courier New"/>
-          <w:b w:val="0"/>
-          <w:sz w:val="20"/>
-        </w:rPr>
-        <w:t xml:space="preserve">  Total Tax:                          $ 13,759</w:t>
-      </w:r>
-    </w:p>
-    <w:p>
-      <w:pPr>
-        <w:spacing w:before="0" w:after="80"/>
-        <w:jc w:val="left"/>
-      </w:pPr>
-      <w:r>
-        <w:rPr>
-          <w:rFonts w:ascii="Courier New" w:hAnsi="Courier New"/>
-          <w:b w:val="0"/>
-          <w:sz w:val="20"/>
-        </w:rPr>
-        <w:t xml:space="preserve">  Balance Due:                        $ 14,379</w:t>
-      </w:r>
-    </w:p>
-    <w:p>
-      <w:pPr>
-        <w:spacing w:before="0" w:after="80"/>
-        <w:jc w:val="left"/>
-      </w:pPr>
-      <w:r>
-        <w:rPr>
-          <w:rFonts w:ascii="Courier New" w:hAnsi="Courier New"/>
-          <w:b w:val="0"/>
-          <w:sz w:val="20"/>
+          <w:sz w:val="22"/>
         </w:rPr>
       </w:r>
     </w:p>
     <w:p>
       <w:pPr>
-        <w:spacing w:before="80" w:after="80"/>
+        <w:spacing w:before="0" w:after="120"/>
         <w:jc w:val="left"/>
       </w:pPr>
       <w:r>
         <w:rPr>
-          <w:rFonts w:ascii="Courier New" w:hAnsi="Courier New"/>
+          <w:rFonts w:ascii="Times New Roman" w:hAnsi="Times New Roman"/>
           <w:b w:val="0"/>
-          <w:sz w:val="18"/>
+          <w:sz w:val="22"/>
         </w:rPr>
-        <w:t>========================================================================</w:t>
+        <w:t>In response to Form 886-H-INT, I am enclosing the following:</w:t>
       </w:r>
     </w:p>
     <w:p>
       <w:pPr>
-        <w:spacing w:before="0" w:after="80"/>
+        <w:spacing w:before="0" w:after="120"/>
         <w:jc w:val="left"/>
       </w:pPr>
       <w:r>
         <w:rPr>
-          <w:rFonts w:ascii="Courier New" w:hAnsi="Courier New"/>
-          <w:b/>
-          <w:sz w:val="20"/>
-        </w:rPr>
-        <w:t>2. BUSINESS INCOME — SCHEDULE C</w:t>
-      </w:r>
-    </w:p>
-    <w:p>
-      <w:pPr>
-        <w:spacing w:before="80" w:after="80"/>
-        <w:jc w:val="left"/>
-      </w:pPr>
-      <w:r>
-        <w:rPr>
-          <w:rFonts w:ascii="Courier New" w:hAnsi="Courier New"/>
+          <w:rFonts w:ascii="Times New Roman" w:hAnsi="Times New Roman"/>
           <w:b w:val="0"/>
-          <w:sz w:val="18"/>
-        </w:rPr>
-        <w:t>========================================================================</w:t>
-      </w:r>
-    </w:p>
-    <w:p>
-      <w:pPr>
-        <w:spacing w:before="0" w:after="80"/>
-        <w:jc w:val="left"/>
-      </w:pPr>
-      <w:r>
-        <w:rPr>
-          <w:rFonts w:ascii="Courier New" w:hAnsi="Courier New"/>
-          <w:b w:val="0"/>
-          <w:sz w:val="20"/>
+          <w:sz w:val="22"/>
         </w:rPr>
       </w:r>
     </w:p>
     <w:p>
       <w:pPr>
-        <w:spacing w:before="0" w:after="80"/>
+        <w:spacing w:before="0" w:after="120"/>
         <w:jc w:val="left"/>
       </w:pPr>
       <w:r>
         <w:rPr>
-          <w:rFonts w:ascii="Courier New" w:hAnsi="Courier New"/>
+          <w:rFonts w:ascii="Times New Roman" w:hAnsi="Times New Roman"/>
           <w:b w:val="0"/>
-          <w:sz w:val="20"/>
+          <w:sz w:val="22"/>
         </w:rPr>
-        <w:t>Business: Housecleaning Service (NAICS 561720)</w:t>
+        <w:t xml:space="preserve">      [X]  Forms 1098 — Annual Mortgage Interest Statements for all loans, showing interest paid, and beginning and ending principal balances</w:t>
       </w:r>
     </w:p>
     <w:p>
       <w:pPr>
-        <w:spacing w:before="0" w:after="80"/>
+        <w:spacing w:before="0" w:after="120"/>
         <w:jc w:val="left"/>
       </w:pPr>
       <w:r>
         <w:rPr>
-          <w:rFonts w:ascii="Courier New" w:hAnsi="Courier New"/>
+          <w:rFonts w:ascii="Times New Roman" w:hAnsi="Times New Roman"/>
           <w:b w:val="0"/>
-          <w:sz w:val="20"/>
+          <w:sz w:val="22"/>
         </w:rPr>
-        <w:t>Name:     Eliana Machado de Almeida</w:t>
+        <w:t xml:space="preserve">      [X]  Original loan agreements / mortgage contracts for each loan</w:t>
       </w:r>
     </w:p>
     <w:p>
       <w:pPr>
-        <w:spacing w:before="0" w:after="80"/>
+        <w:spacing w:before="0" w:after="120"/>
         <w:jc w:val="left"/>
       </w:pPr>
       <w:r>
         <w:rPr>
-          <w:rFonts w:ascii="Courier New" w:hAnsi="Courier New"/>
+          <w:rFonts w:ascii="Times New Roman" w:hAnsi="Times New Roman"/>
           <w:b w:val="0"/>
-          <w:sz w:val="20"/>
+          <w:sz w:val="22"/>
         </w:rPr>
-        <w:t>Address:  PO Box 1467, Edgartown, MA 02539</w:t>
+        <w:t xml:space="preserve">      [X]  Form HUD-1 Settlement Statements for each property</w:t>
       </w:r>
     </w:p>
     <w:p>
       <w:pPr>
-        <w:spacing w:before="0" w:after="80"/>
+        <w:spacing w:before="0" w:after="120"/>
         <w:jc w:val="left"/>
       </w:pPr>
       <w:r>
         <w:rPr>
-          <w:rFonts w:ascii="Courier New" w:hAnsi="Courier New"/>
+          <w:rFonts w:ascii="Times New Roman" w:hAnsi="Times New Roman"/>
           <w:b w:val="0"/>
-          <w:sz w:val="20"/>
+          <w:sz w:val="22"/>
         </w:rPr>
-        <w:t>Method:   Cash basis</w:t>
+        <w:t xml:space="preserve">      [X]  Completed Form 14900 — Worksheet for Qualified Loan Limit and Deductible Home Mortgage Interest</w:t>
       </w:r>
     </w:p>
     <w:p>
       <w:pPr>
-        <w:spacing w:before="0" w:after="80"/>
+        <w:spacing w:before="0" w:after="120"/>
         <w:jc w:val="left"/>
       </w:pPr>
       <w:r>
         <w:rPr>
-          <w:rFonts w:ascii="Courier New" w:hAnsi="Courier New"/>
+          <w:rFonts w:ascii="Times New Roman" w:hAnsi="Times New Roman"/>
           <w:b w:val="0"/>
-          <w:sz w:val="20"/>
+          <w:sz w:val="22"/>
         </w:rPr>
       </w:r>
     </w:p>
     <w:p>
       <w:pPr>
-        <w:spacing w:before="0" w:after="80"/>
+        <w:spacing w:before="0" w:after="120"/>
         <w:jc w:val="left"/>
       </w:pPr>
       <w:r>
         <w:rPr>
-          <w:rFonts w:ascii="Courier New" w:hAnsi="Courier New"/>
-          <w:b w:val="0"/>
-          <w:sz w:val="20"/>
+          <w:rFonts w:ascii="Times New Roman" w:hAnsi="Times New Roman"/>
+          <w:b/>
+          <w:sz w:val="22"/>
         </w:rPr>
-        <w:t xml:space="preserve">  Gross Receipts:                     $249,000</w:t>
+        <w:t>2.   QUALIFIED BUSINESS INCOME DEDUCTION — FORM 8995</w:t>
       </w:r>
     </w:p>
     <w:p>
       <w:pPr>
-        <w:spacing w:before="0" w:after="80"/>
+        <w:spacing w:before="0" w:after="120"/>
         <w:jc w:val="left"/>
       </w:pPr>
       <w:r>
         <w:rPr>
-          <w:rFonts w:ascii="Courier New" w:hAnsi="Courier New"/>
+          <w:rFonts w:ascii="Times New Roman" w:hAnsi="Times New Roman"/>
           <w:b w:val="0"/>
-          <w:sz w:val="20"/>
-        </w:rPr>
-        <w:t xml:space="preserve">  Cost of Goods Sold:                 $135,973</w:t>
-      </w:r>
-    </w:p>
-    <w:p>
-      <w:pPr>
-        <w:spacing w:before="0" w:after="80"/>
-        <w:jc w:val="left"/>
-      </w:pPr>
-      <w:r>
-        <w:rPr>
-          <w:rFonts w:ascii="Courier New" w:hAnsi="Courier New"/>
-          <w:b w:val="0"/>
-          <w:sz w:val="20"/>
-        </w:rPr>
-        <w:t xml:space="preserve">    - Purchases (supplies/materials):   $68,572</w:t>
-      </w:r>
-    </w:p>
-    <w:p>
-      <w:pPr>
-        <w:spacing w:before="0" w:after="80"/>
-        <w:jc w:val="left"/>
-      </w:pPr>
-      <w:r>
-        <w:rPr>
-          <w:rFonts w:ascii="Courier New" w:hAnsi="Courier New"/>
-          <w:b w:val="0"/>
-          <w:sz w:val="20"/>
-        </w:rPr>
-        <w:t xml:space="preserve">    - Cost of Labor:                    $67,401</w:t>
-      </w:r>
-    </w:p>
-    <w:p>
-      <w:pPr>
-        <w:spacing w:before="0" w:after="80"/>
-        <w:jc w:val="left"/>
-      </w:pPr>
-      <w:r>
-        <w:rPr>
-          <w:rFonts w:ascii="Courier New" w:hAnsi="Courier New"/>
-          <w:b w:val="0"/>
-          <w:sz w:val="20"/>
-        </w:rPr>
-        <w:t xml:space="preserve">  Gross Profit:                       $113,027</w:t>
-      </w:r>
-    </w:p>
-    <w:p>
-      <w:pPr>
-        <w:spacing w:before="0" w:after="80"/>
-        <w:jc w:val="left"/>
-      </w:pPr>
-      <w:r>
-        <w:rPr>
-          <w:rFonts w:ascii="Courier New" w:hAnsi="Courier New"/>
-          <w:b w:val="0"/>
-          <w:sz w:val="20"/>
+          <w:sz w:val="22"/>
         </w:rPr>
       </w:r>
     </w:p>
     <w:p>
       <w:pPr>
-        <w:spacing w:before="0" w:after="80"/>
+        <w:spacing w:before="0" w:after="120"/>
         <w:jc w:val="left"/>
       </w:pPr>
       <w:r>
         <w:rPr>
-          <w:rFonts w:ascii="Courier New" w:hAnsi="Courier New"/>
+          <w:rFonts w:ascii="Times New Roman" w:hAnsi="Times New Roman"/>
           <w:b w:val="0"/>
-          <w:sz w:val="20"/>
+          <w:sz w:val="22"/>
         </w:rPr>
-        <w:t xml:space="preserve">  Business Expenses:</w:t>
+        <w:t>I claimed a Qualified Business Income Deduction (QBID) of $5,196 on my 2024 Form 1040, calculated on Form 8995. The deduction was limited by my taxable income (20% x $25,980 = $5,196) and is based on income from my housecleaning sole proprietorship (Schedule C) and rental properties (Schedule E).</w:t>
       </w:r>
     </w:p>
     <w:p>
       <w:pPr>
-        <w:spacing w:before="0" w:after="80"/>
+        <w:spacing w:before="0" w:after="120"/>
         <w:jc w:val="left"/>
       </w:pPr>
       <w:r>
         <w:rPr>
-          <w:rFonts w:ascii="Courier New" w:hAnsi="Courier New"/>
+          <w:rFonts w:ascii="Times New Roman" w:hAnsi="Times New Roman"/>
           <w:b w:val="0"/>
-          <w:sz w:val="20"/>
-        </w:rPr>
-        <w:t xml:space="preserve">    Car &amp; Truck (13,800 mi @ $0.67):  $  9,246</w:t>
-      </w:r>
-    </w:p>
-    <w:p>
-      <w:pPr>
-        <w:spacing w:before="0" w:after="80"/>
-        <w:jc w:val="left"/>
-      </w:pPr>
-      <w:r>
-        <w:rPr>
-          <w:rFonts w:ascii="Courier New" w:hAnsi="Courier New"/>
-          <w:b w:val="0"/>
-          <w:sz w:val="20"/>
-        </w:rPr>
-        <w:t xml:space="preserve">    Insurance:                         $  1,294</w:t>
-      </w:r>
-    </w:p>
-    <w:p>
-      <w:pPr>
-        <w:spacing w:before="0" w:after="80"/>
-        <w:jc w:val="left"/>
-      </w:pPr>
-      <w:r>
-        <w:rPr>
-          <w:rFonts w:ascii="Courier New" w:hAnsi="Courier New"/>
-          <w:b w:val="0"/>
-          <w:sz w:val="20"/>
-        </w:rPr>
-        <w:t xml:space="preserve">    Office Expenses:                   $ 14,584</w:t>
-      </w:r>
-    </w:p>
-    <w:p>
-      <w:pPr>
-        <w:spacing w:before="0" w:after="80"/>
-        <w:jc w:val="left"/>
-      </w:pPr>
-      <w:r>
-        <w:rPr>
-          <w:rFonts w:ascii="Courier New" w:hAnsi="Courier New"/>
-          <w:b w:val="0"/>
-          <w:sz w:val="20"/>
-        </w:rPr>
-        <w:t xml:space="preserve">      - Bank Charges:          $75</w:t>
-      </w:r>
-    </w:p>
-    <w:p>
-      <w:pPr>
-        <w:spacing w:before="0" w:after="80"/>
-        <w:jc w:val="left"/>
-      </w:pPr>
-      <w:r>
-        <w:rPr>
-          <w:rFonts w:ascii="Courier New" w:hAnsi="Courier New"/>
-          <w:b w:val="0"/>
-          <w:sz w:val="20"/>
-        </w:rPr>
-        <w:t xml:space="preserve">      - Internet:           $2,967</w:t>
-      </w:r>
-    </w:p>
-    <w:p>
-      <w:pPr>
-        <w:spacing w:before="0" w:after="80"/>
-        <w:jc w:val="left"/>
-      </w:pPr>
-      <w:r>
-        <w:rPr>
-          <w:rFonts w:ascii="Courier New" w:hAnsi="Courier New"/>
-          <w:b w:val="0"/>
-          <w:sz w:val="20"/>
-        </w:rPr>
-        <w:t xml:space="preserve">      - Telephone:            $761</w:t>
-      </w:r>
-    </w:p>
-    <w:p>
-      <w:pPr>
-        <w:spacing w:before="0" w:after="80"/>
-        <w:jc w:val="left"/>
-      </w:pPr>
-      <w:r>
-        <w:rPr>
-          <w:rFonts w:ascii="Courier New" w:hAnsi="Courier New"/>
-          <w:b w:val="0"/>
-          <w:sz w:val="20"/>
-        </w:rPr>
-        <w:t xml:space="preserve">      - Office Supplies:    $6,031</w:t>
-      </w:r>
-    </w:p>
-    <w:p>
-      <w:pPr>
-        <w:spacing w:before="0" w:after="80"/>
-        <w:jc w:val="left"/>
-      </w:pPr>
-      <w:r>
-        <w:rPr>
-          <w:rFonts w:ascii="Courier New" w:hAnsi="Courier New"/>
-          <w:b w:val="0"/>
-          <w:sz w:val="20"/>
-        </w:rPr>
-        <w:t xml:space="preserve">      - Shipping:             $150</w:t>
-      </w:r>
-    </w:p>
-    <w:p>
-      <w:pPr>
-        <w:spacing w:before="0" w:after="80"/>
-        <w:jc w:val="left"/>
-      </w:pPr>
-      <w:r>
-        <w:rPr>
-          <w:rFonts w:ascii="Courier New" w:hAnsi="Courier New"/>
-          <w:b w:val="0"/>
-          <w:sz w:val="20"/>
-        </w:rPr>
-        <w:t xml:space="preserve">      - Professional Fees:  $4,600</w:t>
-      </w:r>
-    </w:p>
-    <w:p>
-      <w:pPr>
-        <w:spacing w:before="0" w:after="80"/>
-        <w:jc w:val="left"/>
-      </w:pPr>
-      <w:r>
-        <w:rPr>
-          <w:rFonts w:ascii="Courier New" w:hAnsi="Courier New"/>
-          <w:b w:val="0"/>
-          <w:sz w:val="20"/>
-        </w:rPr>
-        <w:t xml:space="preserve">    Supplies:                          $  6,031</w:t>
-      </w:r>
-    </w:p>
-    <w:p>
-      <w:pPr>
-        <w:spacing w:before="0" w:after="80"/>
-        <w:jc w:val="left"/>
-      </w:pPr>
-      <w:r>
-        <w:rPr>
-          <w:rFonts w:ascii="Courier New" w:hAnsi="Courier New"/>
-          <w:b w:val="0"/>
-          <w:sz w:val="20"/>
-        </w:rPr>
-        <w:t xml:space="preserve">    Deductible Meals:                  $    493</w:t>
-      </w:r>
-    </w:p>
-    <w:p>
-      <w:pPr>
-        <w:spacing w:before="0" w:after="80"/>
-        <w:jc w:val="left"/>
-      </w:pPr>
-      <w:r>
-        <w:rPr>
-          <w:rFonts w:ascii="Courier New" w:hAnsi="Courier New"/>
-          <w:b w:val="0"/>
-          <w:sz w:val="20"/>
-        </w:rPr>
-        <w:t xml:space="preserve">  Total Expenses:                      $ 31,648</w:t>
-      </w:r>
-    </w:p>
-    <w:p>
-      <w:pPr>
-        <w:spacing w:before="0" w:after="80"/>
-        <w:jc w:val="left"/>
-      </w:pPr>
-      <w:r>
-        <w:rPr>
-          <w:rFonts w:ascii="Courier New" w:hAnsi="Courier New"/>
-          <w:b w:val="0"/>
-          <w:sz w:val="20"/>
+          <w:sz w:val="22"/>
         </w:rPr>
       </w:r>
     </w:p>
     <w:p>
       <w:pPr>
-        <w:spacing w:before="0" w:after="80"/>
+        <w:spacing w:before="0" w:after="120"/>
         <w:jc w:val="left"/>
       </w:pPr>
       <w:r>
         <w:rPr>
-          <w:rFonts w:ascii="Courier New" w:hAnsi="Courier New"/>
-          <w:b/>
-          <w:sz w:val="20"/>
+          <w:rFonts w:ascii="Times New Roman" w:hAnsi="Times New Roman"/>
+          <w:b w:val="0"/>
+          <w:sz w:val="22"/>
         </w:rPr>
-        <w:t xml:space="preserve">  NET PROFIT (Schedule C, Line 31):   $ 81,379</w:t>
+        <w:t>In response to Form 14997, I am enclosing the following:</w:t>
       </w:r>
     </w:p>
     <w:p>
       <w:pPr>
-        <w:spacing w:before="0" w:after="80"/>
+        <w:spacing w:before="0" w:after="120"/>
         <w:jc w:val="left"/>
       </w:pPr>
       <w:r>
         <w:rPr>
-          <w:rFonts w:ascii="Courier New" w:hAnsi="Courier New"/>
+          <w:rFonts w:ascii="Times New Roman" w:hAnsi="Times New Roman"/>
           <w:b w:val="0"/>
-          <w:sz w:val="20"/>
+          <w:sz w:val="22"/>
         </w:rPr>
       </w:r>
     </w:p>
     <w:p>
       <w:pPr>
-        <w:spacing w:before="0" w:after="80"/>
+        <w:spacing w:before="0" w:after="120"/>
         <w:jc w:val="left"/>
       </w:pPr>
       <w:r>
         <w:rPr>
-          <w:rFonts w:ascii="Courier New" w:hAnsi="Courier New"/>
+          <w:rFonts w:ascii="Times New Roman" w:hAnsi="Times New Roman"/>
           <w:b w:val="0"/>
-          <w:sz w:val="20"/>
+          <w:sz w:val="22"/>
         </w:rPr>
-        <w:t>Vehicle: Van, placed in service 01/01/2022</w:t>
+        <w:t xml:space="preserve">      [X]  Copy of Form 8995 — Qualified Business Income Deduction (as filed)</w:t>
       </w:r>
     </w:p>
     <w:p>
       <w:pPr>
-        <w:spacing w:before="0" w:after="80"/>
+        <w:spacing w:before="0" w:after="120"/>
         <w:jc w:val="left"/>
       </w:pPr>
       <w:r>
         <w:rPr>
-          <w:rFonts w:ascii="Courier New" w:hAnsi="Courier New"/>
+          <w:rFonts w:ascii="Times New Roman" w:hAnsi="Times New Roman"/>
           <w:b w:val="0"/>
-          <w:sz w:val="20"/>
+          <w:sz w:val="22"/>
         </w:rPr>
-        <w:t xml:space="preserve">  Total miles driven 2024:  16,400</w:t>
+        <w:t xml:space="preserve">      [X]  Schedule C — Net profit from housecleaning business: $81,379</w:t>
       </w:r>
     </w:p>
     <w:p>
       <w:pPr>
-        <w:spacing w:before="0" w:after="80"/>
+        <w:spacing w:before="0" w:after="120"/>
         <w:jc w:val="left"/>
       </w:pPr>
       <w:r>
         <w:rPr>
-          <w:rFonts w:ascii="Courier New" w:hAnsi="Courier New"/>
+          <w:rFonts w:ascii="Times New Roman" w:hAnsi="Times New Roman"/>
           <w:b w:val="0"/>
-          <w:sz w:val="20"/>
+          <w:sz w:val="22"/>
         </w:rPr>
-        <w:t xml:space="preserve">  Business miles:           13,800 (84.15%)</w:t>
+        <w:t xml:space="preserve">      [X]  Schedule E — Net rental income: $72,459 (two properties)</w:t>
       </w:r>
     </w:p>
     <w:p>
       <w:pPr>
-        <w:spacing w:before="0" w:after="80"/>
+        <w:spacing w:before="0" w:after="120"/>
         <w:jc w:val="left"/>
       </w:pPr>
       <w:r>
         <w:rPr>
-          <w:rFonts w:ascii="Courier New" w:hAnsi="Courier New"/>
+          <w:rFonts w:ascii="Times New Roman" w:hAnsi="Times New Roman"/>
           <w:b w:val="0"/>
-          <w:sz w:val="20"/>
+          <w:sz w:val="22"/>
         </w:rPr>
-        <w:t xml:space="preserve">  Other miles:               2,600</w:t>
+        <w:t xml:space="preserve">      [X]  Detailed QBI calculation statement showing income components and income limitation applied</w:t>
       </w:r>
     </w:p>
     <w:p>
       <w:pPr>
-        <w:spacing w:before="0" w:after="80"/>
+        <w:spacing w:before="0" w:after="120"/>
         <w:jc w:val="left"/>
       </w:pPr>
       <w:r>
         <w:rPr>
-          <w:rFonts w:ascii="Courier New" w:hAnsi="Courier New"/>
+          <w:rFonts w:ascii="Times New Roman" w:hAnsi="Times New Roman"/>
           <w:b w:val="0"/>
-          <w:sz w:val="20"/>
+          <w:sz w:val="22"/>
         </w:rPr>
       </w:r>
     </w:p>
     <w:p>
       <w:pPr>
-        <w:spacing w:before="0" w:after="80"/>
+        <w:spacing w:before="0" w:after="120"/>
         <w:jc w:val="left"/>
       </w:pPr>
       <w:r>
         <w:rPr>
-          <w:rFonts w:ascii="Courier New" w:hAnsi="Courier New"/>
+          <w:rFonts w:ascii="Times New Roman" w:hAnsi="Times New Roman"/>
           <w:b w:val="0"/>
-          <w:sz w:val="20"/>
+          <w:sz w:val="22"/>
         </w:rPr>
-        <w:t>Supporting documents enclosed:</w:t>
+        <w:t>I trust these documents fully address the items raised in Notice LTR566T. Should you need any additional information, please do not hesitate to contact me.</w:t>
       </w:r>
     </w:p>
     <w:p>
       <w:pPr>
-        <w:spacing w:before="0" w:after="80"/>
+        <w:spacing w:before="0" w:after="120"/>
         <w:jc w:val="left"/>
       </w:pPr>
       <w:r>
         <w:rPr>
-          <w:rFonts w:ascii="Courier New" w:hAnsi="Courier New"/>
+          <w:rFonts w:ascii="Times New Roman" w:hAnsi="Times New Roman"/>
           <w:b w:val="0"/>
-          <w:sz w:val="20"/>
-        </w:rPr>
-        <w:t xml:space="preserve">  - Bank statements showing gross receipts of $249,000</w:t>
-      </w:r>
-    </w:p>
-    <w:p>
-      <w:pPr>
-        <w:spacing w:before="0" w:after="80"/>
-        <w:jc w:val="left"/>
-      </w:pPr>
-      <w:r>
-        <w:rPr>
-          <w:rFonts w:ascii="Courier New" w:hAnsi="Courier New"/>
-          <w:b w:val="0"/>
-          <w:sz w:val="20"/>
-        </w:rPr>
-        <w:t xml:space="preserve">  - Mileage log (2024)</w:t>
-      </w:r>
-    </w:p>
-    <w:p>
-      <w:pPr>
-        <w:spacing w:before="0" w:after="80"/>
-        <w:jc w:val="left"/>
-      </w:pPr>
-      <w:r>
-        <w:rPr>
-          <w:rFonts w:ascii="Courier New" w:hAnsi="Courier New"/>
-          <w:b w:val="0"/>
-          <w:sz w:val="20"/>
-        </w:rPr>
-        <w:t xml:space="preserve">  - Receipts for all business expenses</w:t>
-      </w:r>
-    </w:p>
-    <w:p>
-      <w:pPr>
-        <w:spacing w:before="0" w:after="80"/>
-        <w:jc w:val="left"/>
-      </w:pPr>
-      <w:r>
-        <w:rPr>
-          <w:rFonts w:ascii="Courier New" w:hAnsi="Courier New"/>
-          <w:b w:val="0"/>
-          <w:sz w:val="20"/>
-        </w:rPr>
-        <w:t xml:space="preserve">  - Labor cost records</w:t>
-      </w:r>
-    </w:p>
-    <w:p>
-      <w:pPr>
-        <w:spacing w:before="0" w:after="80"/>
-        <w:jc w:val="left"/>
-      </w:pPr>
-      <w:r>
-        <w:rPr>
-          <w:rFonts w:ascii="Courier New" w:hAnsi="Courier New"/>
-          <w:b w:val="0"/>
-          <w:sz w:val="20"/>
+          <w:sz w:val="22"/>
         </w:rPr>
       </w:r>
     </w:p>
     <w:p>
       <w:pPr>
-        <w:spacing w:before="80" w:after="80"/>
+        <w:spacing w:before="0" w:after="120"/>
         <w:jc w:val="left"/>
       </w:pPr>
       <w:r>
         <w:rPr>
-          <w:rFonts w:ascii="Courier New" w:hAnsi="Courier New"/>
+          <w:rFonts w:ascii="Times New Roman" w:hAnsi="Times New Roman"/>
           <w:b w:val="0"/>
-          <w:sz w:val="18"/>
-        </w:rPr>
-        <w:t>========================================================================</w:t>
-      </w:r>
-    </w:p>
-    <w:p>
-      <w:pPr>
-        <w:spacing w:before="0" w:after="80"/>
-        <w:jc w:val="left"/>
-      </w:pPr>
-      <w:r>
-        <w:rPr>
-          <w:rFonts w:ascii="Courier New" w:hAnsi="Courier New"/>
-          <w:b/>
-          <w:sz w:val="20"/>
-        </w:rPr>
-        <w:t>3. RENTAL INCOME — SCHEDULE E</w:t>
-      </w:r>
-    </w:p>
-    <w:p>
-      <w:pPr>
-        <w:spacing w:before="80" w:after="80"/>
-        <w:jc w:val="left"/>
-      </w:pPr>
-      <w:r>
-        <w:rPr>
-          <w:rFonts w:ascii="Courier New" w:hAnsi="Courier New"/>
-          <w:b w:val="0"/>
-          <w:sz w:val="18"/>
-        </w:rPr>
-        <w:t>========================================================================</w:t>
-      </w:r>
-    </w:p>
-    <w:p>
-      <w:pPr>
-        <w:spacing w:before="0" w:after="80"/>
-        <w:jc w:val="left"/>
-      </w:pPr>
-      <w:r>
-        <w:rPr>
-          <w:rFonts w:ascii="Courier New" w:hAnsi="Courier New"/>
-          <w:b w:val="0"/>
-          <w:sz w:val="20"/>
-        </w:rPr>
-      </w:r>
-    </w:p>
-    <w:p>
-      <w:pPr>
-        <w:spacing w:before="0" w:after="80"/>
-        <w:jc w:val="left"/>
-      </w:pPr>
-      <w:r>
-        <w:rPr>
-          <w:rFonts w:ascii="Courier New" w:hAnsi="Courier New"/>
-          <w:b/>
-          <w:sz w:val="20"/>
-        </w:rPr>
-        <w:t>PROPERTY A: 27 Cormorant Circle, Edgartown, MA 02539</w:t>
-      </w:r>
-    </w:p>
-    <w:p>
-      <w:pPr>
-        <w:spacing w:before="0" w:after="80"/>
-        <w:jc w:val="left"/>
-      </w:pPr>
-      <w:r>
-        <w:rPr>
-          <w:rFonts w:ascii="Courier New" w:hAnsi="Courier New"/>
-          <w:b w:val="0"/>
-          <w:sz w:val="20"/>
-        </w:rPr>
-        <w:t xml:space="preserve">  Type:               Single Family Residence</w:t>
-      </w:r>
-    </w:p>
-    <w:p>
-      <w:pPr>
-        <w:spacing w:before="0" w:after="80"/>
-        <w:jc w:val="left"/>
-      </w:pPr>
-      <w:r>
-        <w:rPr>
-          <w:rFonts w:ascii="Courier New" w:hAnsi="Courier New"/>
-          <w:b w:val="0"/>
-          <w:sz w:val="20"/>
-        </w:rPr>
-        <w:t xml:space="preserve">  Purchased:          05/23/2005</w:t>
-      </w:r>
-    </w:p>
-    <w:p>
-      <w:pPr>
-        <w:spacing w:before="0" w:after="80"/>
-        <w:jc w:val="left"/>
-      </w:pPr>
-      <w:r>
-        <w:rPr>
-          <w:rFonts w:ascii="Courier New" w:hAnsi="Courier New"/>
-          <w:b w:val="0"/>
-          <w:sz w:val="20"/>
-        </w:rPr>
-        <w:t xml:space="preserve">  Cost Basis:         $1,410,200</w:t>
-      </w:r>
-    </w:p>
-    <w:p>
-      <w:pPr>
-        <w:spacing w:before="0" w:after="80"/>
-        <w:jc w:val="left"/>
-      </w:pPr>
-      <w:r>
-        <w:rPr>
-          <w:rFonts w:ascii="Courier New" w:hAnsi="Courier New"/>
-          <w:b w:val="0"/>
-          <w:sz w:val="20"/>
-        </w:rPr>
-        <w:t xml:space="preserve">  Fair Rental Days:   365 | Personal Use Days: 0</w:t>
-      </w:r>
-    </w:p>
-    <w:p>
-      <w:pPr>
-        <w:spacing w:before="0" w:after="80"/>
-        <w:jc w:val="left"/>
-      </w:pPr>
-      <w:r>
-        <w:rPr>
-          <w:rFonts w:ascii="Courier New" w:hAnsi="Courier New"/>
-          <w:b w:val="0"/>
-          <w:sz w:val="20"/>
-        </w:rPr>
-      </w:r>
-    </w:p>
-    <w:p>
-      <w:pPr>
-        <w:spacing w:before="0" w:after="80"/>
-        <w:jc w:val="left"/>
-      </w:pPr>
-      <w:r>
-        <w:rPr>
-          <w:rFonts w:ascii="Courier New" w:hAnsi="Courier New"/>
-          <w:b w:val="0"/>
-          <w:sz w:val="20"/>
-        </w:rPr>
-        <w:t xml:space="preserve">  Income:</w:t>
-      </w:r>
-    </w:p>
-    <w:p>
-      <w:pPr>
-        <w:spacing w:before="0" w:after="80"/>
-        <w:jc w:val="left"/>
-      </w:pPr>
-      <w:r>
-        <w:rPr>
-          <w:rFonts w:ascii="Courier New" w:hAnsi="Courier New"/>
-          <w:b w:val="0"/>
-          <w:sz w:val="20"/>
-        </w:rPr>
-        <w:t xml:space="preserve">    Rents Received:               $146,624</w:t>
-      </w:r>
-    </w:p>
-    <w:p>
-      <w:pPr>
-        <w:spacing w:before="0" w:after="80"/>
-        <w:jc w:val="left"/>
-      </w:pPr>
-      <w:r>
-        <w:rPr>
-          <w:rFonts w:ascii="Courier New" w:hAnsi="Courier New"/>
-          <w:b w:val="0"/>
-          <w:sz w:val="20"/>
-        </w:rPr>
-      </w:r>
-    </w:p>
-    <w:p>
-      <w:pPr>
-        <w:spacing w:before="0" w:after="80"/>
-        <w:jc w:val="left"/>
-      </w:pPr>
-      <w:r>
-        <w:rPr>
-          <w:rFonts w:ascii="Courier New" w:hAnsi="Courier New"/>
-          <w:b w:val="0"/>
-          <w:sz w:val="20"/>
-        </w:rPr>
-        <w:t xml:space="preserve">  Expenses:</w:t>
-      </w:r>
-    </w:p>
-    <w:p>
-      <w:pPr>
-        <w:spacing w:before="0" w:after="80"/>
-        <w:jc w:val="left"/>
-      </w:pPr>
-      <w:r>
-        <w:rPr>
-          <w:rFonts w:ascii="Courier New" w:hAnsi="Courier New"/>
-          <w:b w:val="0"/>
-          <w:sz w:val="20"/>
-        </w:rPr>
-        <w:t xml:space="preserve">    Insurance:                    $  3,454</w:t>
-      </w:r>
-    </w:p>
-    <w:p>
-      <w:pPr>
-        <w:spacing w:before="0" w:after="80"/>
-        <w:jc w:val="left"/>
-      </w:pPr>
-      <w:r>
-        <w:rPr>
-          <w:rFonts w:ascii="Courier New" w:hAnsi="Courier New"/>
-          <w:b w:val="0"/>
-          <w:sz w:val="20"/>
-        </w:rPr>
-        <w:t xml:space="preserve">    Mortgage Interest:            $ 33,397</w:t>
-      </w:r>
-    </w:p>
-    <w:p>
-      <w:pPr>
-        <w:spacing w:before="0" w:after="80"/>
-        <w:jc w:val="left"/>
-      </w:pPr>
-      <w:r>
-        <w:rPr>
-          <w:rFonts w:ascii="Courier New" w:hAnsi="Courier New"/>
-          <w:b w:val="0"/>
-          <w:sz w:val="20"/>
-        </w:rPr>
-        <w:t xml:space="preserve">      (Two mortgages: $16,880 + $16,517)</w:t>
-      </w:r>
-    </w:p>
-    <w:p>
-      <w:pPr>
-        <w:spacing w:before="0" w:after="80"/>
-        <w:jc w:val="left"/>
-      </w:pPr>
-      <w:r>
-        <w:rPr>
-          <w:rFonts w:ascii="Courier New" w:hAnsi="Courier New"/>
-          <w:b w:val="0"/>
-          <w:sz w:val="20"/>
-        </w:rPr>
-        <w:t xml:space="preserve">    Property Taxes:               $  2,885</w:t>
-      </w:r>
-    </w:p>
-    <w:p>
-      <w:pPr>
-        <w:spacing w:before="0" w:after="80"/>
-        <w:jc w:val="left"/>
-      </w:pPr>
-      <w:r>
-        <w:rPr>
-          <w:rFonts w:ascii="Courier New" w:hAnsi="Courier New"/>
-          <w:b w:val="0"/>
-          <w:sz w:val="20"/>
-        </w:rPr>
-        <w:t xml:space="preserve">    Depreciation (27.5 yrs SL):   $ 51,275</w:t>
-      </w:r>
-    </w:p>
-    <w:p>
-      <w:pPr>
-        <w:spacing w:before="0" w:after="80"/>
-        <w:jc w:val="left"/>
-      </w:pPr>
-      <w:r>
-        <w:rPr>
-          <w:rFonts w:ascii="Courier New" w:hAnsi="Courier New"/>
-          <w:b w:val="0"/>
-          <w:sz w:val="20"/>
-        </w:rPr>
-        <w:t xml:space="preserve">    Other Expenses:               $ 13,559</w:t>
-      </w:r>
-    </w:p>
-    <w:p>
-      <w:pPr>
-        <w:spacing w:before="0" w:after="80"/>
-        <w:jc w:val="left"/>
-      </w:pPr>
-      <w:r>
-        <w:rPr>
-          <w:rFonts w:ascii="Courier New" w:hAnsi="Courier New"/>
-          <w:b w:val="0"/>
-          <w:sz w:val="20"/>
-        </w:rPr>
-        <w:t xml:space="preserve">      - Condo Fee:       $  400</w:t>
-      </w:r>
-    </w:p>
-    <w:p>
-      <w:pPr>
-        <w:spacing w:before="0" w:after="80"/>
-        <w:jc w:val="left"/>
-      </w:pPr>
-      <w:r>
-        <w:rPr>
-          <w:rFonts w:ascii="Courier New" w:hAnsi="Courier New"/>
-          <w:b w:val="0"/>
-          <w:sz w:val="20"/>
-        </w:rPr>
-        <w:t xml:space="preserve">      - Solar Panels:    $2,750</w:t>
-      </w:r>
-    </w:p>
-    <w:p>
-      <w:pPr>
-        <w:spacing w:before="0" w:after="80"/>
-        <w:jc w:val="left"/>
-      </w:pPr>
-      <w:r>
-        <w:rPr>
-          <w:rFonts w:ascii="Courier New" w:hAnsi="Courier New"/>
-          <w:b w:val="0"/>
-          <w:sz w:val="20"/>
-        </w:rPr>
-        <w:t xml:space="preserve">      - Water/Sewer:    $10,409</w:t>
-      </w:r>
-    </w:p>
-    <w:p>
-      <w:pPr>
-        <w:spacing w:before="0" w:after="80"/>
-        <w:jc w:val="left"/>
-      </w:pPr>
-      <w:r>
-        <w:rPr>
-          <w:rFonts w:ascii="Courier New" w:hAnsi="Courier New"/>
-          <w:b w:val="0"/>
-          <w:sz w:val="20"/>
-        </w:rPr>
-        <w:t xml:space="preserve">  Total Expenses:                 $104,570</w:t>
-      </w:r>
-    </w:p>
-    <w:p>
-      <w:pPr>
-        <w:spacing w:before="0" w:after="80"/>
-        <w:jc w:val="left"/>
-      </w:pPr>
-      <w:r>
-        <w:rPr>
-          <w:rFonts w:ascii="Courier New" w:hAnsi="Courier New"/>
-          <w:b w:val="0"/>
-          <w:sz w:val="20"/>
-        </w:rPr>
-      </w:r>
-    </w:p>
-    <w:p>
-      <w:pPr>
-        <w:spacing w:before="0" w:after="80"/>
-        <w:jc w:val="left"/>
-      </w:pPr>
-      <w:r>
-        <w:rPr>
-          <w:rFonts w:ascii="Courier New" w:hAnsi="Courier New"/>
-          <w:b/>
-          <w:sz w:val="20"/>
-        </w:rPr>
-        <w:t xml:space="preserve">  NET INCOME (Property A):        $ 42,054</w:t>
-      </w:r>
-    </w:p>
-    <w:p>
-      <w:pPr>
-        <w:spacing w:before="0" w:after="80"/>
-        <w:jc w:val="left"/>
-      </w:pPr>
-      <w:r>
-        <w:rPr>
-          <w:rFonts w:ascii="Courier New" w:hAnsi="Courier New"/>
-          <w:b w:val="0"/>
-          <w:sz w:val="20"/>
-        </w:rPr>
-      </w:r>
-    </w:p>
-    <w:p>
-      <w:pPr>
-        <w:spacing w:before="40" w:after="40"/>
-        <w:jc w:val="left"/>
-      </w:pPr>
-      <w:r>
-        <w:rPr>
-          <w:rFonts w:ascii="Courier New" w:hAnsi="Courier New"/>
-          <w:b w:val="0"/>
-          <w:sz w:val="18"/>
-        </w:rPr>
-        <w:t>------------------------------------------------------------------------</w:t>
-      </w:r>
-    </w:p>
-    <w:p>
-      <w:pPr>
-        <w:spacing w:before="0" w:after="80"/>
-        <w:jc w:val="left"/>
-      </w:pPr>
-      <w:r>
-        <w:rPr>
-          <w:rFonts w:ascii="Courier New" w:hAnsi="Courier New"/>
-          <w:b w:val="0"/>
-          <w:sz w:val="20"/>
-        </w:rPr>
-      </w:r>
-    </w:p>
-    <w:p>
-      <w:pPr>
-        <w:spacing w:before="0" w:after="80"/>
-        <w:jc w:val="left"/>
-      </w:pPr>
-      <w:r>
-        <w:rPr>
-          <w:rFonts w:ascii="Courier New" w:hAnsi="Courier New"/>
-          <w:b/>
-          <w:sz w:val="20"/>
-        </w:rPr>
-        <w:t>PROPERTY B: 7 Briarwood Dr, Edgartown, MA 02539</w:t>
-      </w:r>
-    </w:p>
-    <w:p>
-      <w:pPr>
-        <w:spacing w:before="0" w:after="80"/>
-        <w:jc w:val="left"/>
-      </w:pPr>
-      <w:r>
-        <w:rPr>
-          <w:rFonts w:ascii="Courier New" w:hAnsi="Courier New"/>
-          <w:b w:val="0"/>
-          <w:sz w:val="20"/>
-        </w:rPr>
-        <w:t xml:space="preserve">  Type:               Multi-Family Residence</w:t>
-      </w:r>
-    </w:p>
-    <w:p>
-      <w:pPr>
-        <w:spacing w:before="0" w:after="80"/>
-        <w:jc w:val="left"/>
-      </w:pPr>
-      <w:r>
-        <w:rPr>
-          <w:rFonts w:ascii="Courier New" w:hAnsi="Courier New"/>
-          <w:b w:val="0"/>
-          <w:sz w:val="20"/>
-        </w:rPr>
-        <w:t xml:space="preserve">  Purchased:          03/09/2017</w:t>
-      </w:r>
-    </w:p>
-    <w:p>
-      <w:pPr>
-        <w:spacing w:before="0" w:after="80"/>
-        <w:jc w:val="left"/>
-      </w:pPr>
-      <w:r>
-        <w:rPr>
-          <w:rFonts w:ascii="Courier New" w:hAnsi="Courier New"/>
-          <w:b w:val="0"/>
-          <w:sz w:val="20"/>
-        </w:rPr>
-        <w:t xml:space="preserve">  Cost Basis:         $733,600</w:t>
-      </w:r>
-    </w:p>
-    <w:p>
-      <w:pPr>
-        <w:spacing w:before="0" w:after="80"/>
-        <w:jc w:val="left"/>
-      </w:pPr>
-      <w:r>
-        <w:rPr>
-          <w:rFonts w:ascii="Courier New" w:hAnsi="Courier New"/>
-          <w:b w:val="0"/>
-          <w:sz w:val="20"/>
-        </w:rPr>
-        <w:t xml:space="preserve">  Fair Rental Days:   365 | Personal Use Days: 0</w:t>
-      </w:r>
-    </w:p>
-    <w:p>
-      <w:pPr>
-        <w:spacing w:before="0" w:after="80"/>
-        <w:jc w:val="left"/>
-      </w:pPr>
-      <w:r>
-        <w:rPr>
-          <w:rFonts w:ascii="Courier New" w:hAnsi="Courier New"/>
-          <w:b w:val="0"/>
-          <w:sz w:val="20"/>
-        </w:rPr>
-      </w:r>
-    </w:p>
-    <w:p>
-      <w:pPr>
-        <w:spacing w:before="0" w:after="80"/>
-        <w:jc w:val="left"/>
-      </w:pPr>
-      <w:r>
-        <w:rPr>
-          <w:rFonts w:ascii="Courier New" w:hAnsi="Courier New"/>
-          <w:b w:val="0"/>
-          <w:sz w:val="20"/>
-        </w:rPr>
-        <w:t xml:space="preserve">  Income:</w:t>
-      </w:r>
-    </w:p>
-    <w:p>
-      <w:pPr>
-        <w:spacing w:before="0" w:after="80"/>
-        <w:jc w:val="left"/>
-      </w:pPr>
-      <w:r>
-        <w:rPr>
-          <w:rFonts w:ascii="Courier New" w:hAnsi="Courier New"/>
-          <w:b w:val="0"/>
-          <w:sz w:val="20"/>
-        </w:rPr>
-        <w:t xml:space="preserve">    Rents Received:               $ 90,000</w:t>
-      </w:r>
-    </w:p>
-    <w:p>
-      <w:pPr>
-        <w:spacing w:before="0" w:after="80"/>
-        <w:jc w:val="left"/>
-      </w:pPr>
-      <w:r>
-        <w:rPr>
-          <w:rFonts w:ascii="Courier New" w:hAnsi="Courier New"/>
-          <w:b w:val="0"/>
-          <w:sz w:val="20"/>
-        </w:rPr>
-      </w:r>
-    </w:p>
-    <w:p>
-      <w:pPr>
-        <w:spacing w:before="0" w:after="80"/>
-        <w:jc w:val="left"/>
-      </w:pPr>
-      <w:r>
-        <w:rPr>
-          <w:rFonts w:ascii="Courier New" w:hAnsi="Courier New"/>
-          <w:b w:val="0"/>
-          <w:sz w:val="20"/>
-        </w:rPr>
-        <w:t xml:space="preserve">  Expenses:</w:t>
-      </w:r>
-    </w:p>
-    <w:p>
-      <w:pPr>
-        <w:spacing w:before="0" w:after="80"/>
-        <w:jc w:val="left"/>
-      </w:pPr>
-      <w:r>
-        <w:rPr>
-          <w:rFonts w:ascii="Courier New" w:hAnsi="Courier New"/>
-          <w:b w:val="0"/>
-          <w:sz w:val="20"/>
-        </w:rPr>
-        <w:t xml:space="preserve">    Insurance:                    $  3,503</w:t>
-      </w:r>
-    </w:p>
-    <w:p>
-      <w:pPr>
-        <w:spacing w:before="0" w:after="80"/>
-        <w:jc w:val="left"/>
-      </w:pPr>
-      <w:r>
-        <w:rPr>
-          <w:rFonts w:ascii="Courier New" w:hAnsi="Courier New"/>
-          <w:b w:val="0"/>
-          <w:sz w:val="20"/>
-        </w:rPr>
-        <w:t xml:space="preserve">    Mortgage Interest:            $ 14,292</w:t>
-      </w:r>
-    </w:p>
-    <w:p>
-      <w:pPr>
-        <w:spacing w:before="0" w:after="80"/>
-        <w:jc w:val="left"/>
-      </w:pPr>
-      <w:r>
-        <w:rPr>
-          <w:rFonts w:ascii="Courier New" w:hAnsi="Courier New"/>
-          <w:b w:val="0"/>
-          <w:sz w:val="20"/>
-        </w:rPr>
-        <w:t xml:space="preserve">    Property Taxes:               $  2,513</w:t>
-      </w:r>
-    </w:p>
-    <w:p>
-      <w:pPr>
-        <w:spacing w:before="0" w:after="80"/>
-        <w:jc w:val="left"/>
-      </w:pPr>
-      <w:r>
-        <w:rPr>
-          <w:rFonts w:ascii="Courier New" w:hAnsi="Courier New"/>
-          <w:b w:val="0"/>
-          <w:sz w:val="20"/>
-        </w:rPr>
-        <w:t xml:space="preserve">    Depreciation (27.5 yrs SL):   $ 26,674</w:t>
-      </w:r>
-    </w:p>
-    <w:p>
-      <w:pPr>
-        <w:spacing w:before="0" w:after="80"/>
-        <w:jc w:val="left"/>
-      </w:pPr>
-      <w:r>
-        <w:rPr>
-          <w:rFonts w:ascii="Courier New" w:hAnsi="Courier New"/>
-          <w:b w:val="0"/>
-          <w:sz w:val="20"/>
-        </w:rPr>
-        <w:t xml:space="preserve">    Other Expenses:               $ 12,613</w:t>
-      </w:r>
-    </w:p>
-    <w:p>
-      <w:pPr>
-        <w:spacing w:before="0" w:after="80"/>
-        <w:jc w:val="left"/>
-      </w:pPr>
-      <w:r>
-        <w:rPr>
-          <w:rFonts w:ascii="Courier New" w:hAnsi="Courier New"/>
-          <w:b w:val="0"/>
-          <w:sz w:val="20"/>
-        </w:rPr>
-        <w:t xml:space="preserve">      - Solar Panels:    $3,803</w:t>
-      </w:r>
-    </w:p>
-    <w:p>
-      <w:pPr>
-        <w:spacing w:before="0" w:after="80"/>
-        <w:jc w:val="left"/>
-      </w:pPr>
-      <w:r>
-        <w:rPr>
-          <w:rFonts w:ascii="Courier New" w:hAnsi="Courier New"/>
-          <w:b w:val="0"/>
-          <w:sz w:val="20"/>
-        </w:rPr>
-        <w:t xml:space="preserve">      - Water/Sewer:     $8,060</w:t>
-      </w:r>
-    </w:p>
-    <w:p>
-      <w:pPr>
-        <w:spacing w:before="0" w:after="80"/>
-        <w:jc w:val="left"/>
-      </w:pPr>
-      <w:r>
-        <w:rPr>
-          <w:rFonts w:ascii="Courier New" w:hAnsi="Courier New"/>
-          <w:b w:val="0"/>
-          <w:sz w:val="20"/>
-        </w:rPr>
-        <w:t xml:space="preserve">      - Condo Fee:       $  750</w:t>
-      </w:r>
-    </w:p>
-    <w:p>
-      <w:pPr>
-        <w:spacing w:before="0" w:after="80"/>
-        <w:jc w:val="left"/>
-      </w:pPr>
-      <w:r>
-        <w:rPr>
-          <w:rFonts w:ascii="Courier New" w:hAnsi="Courier New"/>
-          <w:b w:val="0"/>
-          <w:sz w:val="20"/>
-        </w:rPr>
-        <w:t xml:space="preserve">  Total Expenses:                 $ 59,595</w:t>
-      </w:r>
-    </w:p>
-    <w:p>
-      <w:pPr>
-        <w:spacing w:before="0" w:after="80"/>
-        <w:jc w:val="left"/>
-      </w:pPr>
-      <w:r>
-        <w:rPr>
-          <w:rFonts w:ascii="Courier New" w:hAnsi="Courier New"/>
-          <w:b w:val="0"/>
-          <w:sz w:val="20"/>
-        </w:rPr>
-      </w:r>
-    </w:p>
-    <w:p>
-      <w:pPr>
-        <w:spacing w:before="0" w:after="80"/>
-        <w:jc w:val="left"/>
-      </w:pPr>
-      <w:r>
-        <w:rPr>
-          <w:rFonts w:ascii="Courier New" w:hAnsi="Courier New"/>
-          <w:b/>
-          <w:sz w:val="20"/>
-        </w:rPr>
-        <w:t xml:space="preserve">  NET INCOME (Property B):        $ 30,405</w:t>
-      </w:r>
-    </w:p>
-    <w:p>
-      <w:pPr>
-        <w:spacing w:before="0" w:after="80"/>
-        <w:jc w:val="left"/>
-      </w:pPr>
-      <w:r>
-        <w:rPr>
-          <w:rFonts w:ascii="Courier New" w:hAnsi="Courier New"/>
-          <w:b w:val="0"/>
-          <w:sz w:val="20"/>
-        </w:rPr>
-      </w:r>
-    </w:p>
-    <w:p>
-      <w:pPr>
-        <w:spacing w:before="40" w:after="40"/>
-        <w:jc w:val="left"/>
-      </w:pPr>
-      <w:r>
-        <w:rPr>
-          <w:rFonts w:ascii="Courier New" w:hAnsi="Courier New"/>
-          <w:b w:val="0"/>
-          <w:sz w:val="18"/>
-        </w:rPr>
-        <w:t>------------------------------------------------------------------------</w:t>
-      </w:r>
-    </w:p>
-    <w:p>
-      <w:pPr>
-        <w:spacing w:before="0" w:after="80"/>
-        <w:jc w:val="left"/>
-      </w:pPr>
-      <w:r>
-        <w:rPr>
-          <w:rFonts w:ascii="Courier New" w:hAnsi="Courier New"/>
-          <w:b w:val="0"/>
-          <w:sz w:val="20"/>
-        </w:rPr>
-      </w:r>
-    </w:p>
-    <w:p>
-      <w:pPr>
-        <w:spacing w:before="0" w:after="80"/>
-        <w:jc w:val="left"/>
-      </w:pPr>
-      <w:r>
-        <w:rPr>
-          <w:rFonts w:ascii="Courier New" w:hAnsi="Courier New"/>
-          <w:b/>
-          <w:sz w:val="20"/>
-        </w:rPr>
-        <w:t xml:space="preserve">  TOTAL SCHEDULE E NET INCOME:    $ 72,459</w:t>
-      </w:r>
-    </w:p>
-    <w:p>
-      <w:pPr>
-        <w:spacing w:before="0" w:after="80"/>
-        <w:jc w:val="left"/>
-      </w:pPr>
-      <w:r>
-        <w:rPr>
-          <w:rFonts w:ascii="Courier New" w:hAnsi="Courier New"/>
-          <w:b w:val="0"/>
-          <w:sz w:val="20"/>
-        </w:rPr>
-      </w:r>
-    </w:p>
-    <w:p>
-      <w:pPr>
-        <w:spacing w:before="0" w:after="80"/>
-        <w:jc w:val="left"/>
-      </w:pPr>
-      <w:r>
-        <w:rPr>
-          <w:rFonts w:ascii="Courier New" w:hAnsi="Courier New"/>
-          <w:b w:val="0"/>
-          <w:sz w:val="20"/>
-        </w:rPr>
-        <w:t>Supporting documents enclosed:</w:t>
-      </w:r>
-    </w:p>
-    <w:p>
-      <w:pPr>
-        <w:spacing w:before="0" w:after="80"/>
-        <w:jc w:val="left"/>
-      </w:pPr>
-      <w:r>
-        <w:rPr>
-          <w:rFonts w:ascii="Courier New" w:hAnsi="Courier New"/>
-          <w:b w:val="0"/>
-          <w:sz w:val="20"/>
-        </w:rPr>
-        <w:t xml:space="preserve">  - Lease agreements for both properties (365 days rental, no personal use)</w:t>
-      </w:r>
-    </w:p>
-    <w:p>
-      <w:pPr>
-        <w:spacing w:before="0" w:after="80"/>
-        <w:jc w:val="left"/>
-      </w:pPr>
-      <w:r>
-        <w:rPr>
-          <w:rFonts w:ascii="Courier New" w:hAnsi="Courier New"/>
-          <w:b w:val="0"/>
-          <w:sz w:val="20"/>
-        </w:rPr>
-        <w:t xml:space="preserve">  - Forms 1098 — Mortgage Interest Statements (both properties)</w:t>
-      </w:r>
-    </w:p>
-    <w:p>
-      <w:pPr>
-        <w:spacing w:before="0" w:after="80"/>
-        <w:jc w:val="left"/>
-      </w:pPr>
-      <w:r>
-        <w:rPr>
-          <w:rFonts w:ascii="Courier New" w:hAnsi="Courier New"/>
-          <w:b w:val="0"/>
-          <w:sz w:val="20"/>
-        </w:rPr>
-        <w:t xml:space="preserve">  - Property tax bills — 27 Cormorant Circle &amp; 7 Briarwood Dr</w:t>
-      </w:r>
-    </w:p>
-    <w:p>
-      <w:pPr>
-        <w:spacing w:before="0" w:after="80"/>
-        <w:jc w:val="left"/>
-      </w:pPr>
-      <w:r>
-        <w:rPr>
-          <w:rFonts w:ascii="Courier New" w:hAnsi="Courier New"/>
-          <w:b w:val="0"/>
-          <w:sz w:val="20"/>
-        </w:rPr>
-        <w:t xml:space="preserve">  - Insurance invoices (both properties)</w:t>
-      </w:r>
-    </w:p>
-    <w:p>
-      <w:pPr>
-        <w:spacing w:before="0" w:after="80"/>
-        <w:jc w:val="left"/>
-      </w:pPr>
-      <w:r>
-        <w:rPr>
-          <w:rFonts w:ascii="Courier New" w:hAnsi="Courier New"/>
-          <w:b w:val="0"/>
-          <w:sz w:val="20"/>
-        </w:rPr>
-        <w:t xml:space="preserve">  - Depreciation schedules (Form 4562)</w:t>
-      </w:r>
-    </w:p>
-    <w:p>
-      <w:pPr>
-        <w:spacing w:before="0" w:after="80"/>
-        <w:jc w:val="left"/>
-      </w:pPr>
-      <w:r>
-        <w:rPr>
-          <w:rFonts w:ascii="Courier New" w:hAnsi="Courier New"/>
-          <w:b w:val="0"/>
-          <w:sz w:val="20"/>
-        </w:rPr>
-        <w:t xml:space="preserve">  - Solar panel and utility invoices</w:t>
-      </w:r>
-    </w:p>
-    <w:p>
-      <w:pPr>
-        <w:spacing w:before="0" w:after="80"/>
-        <w:jc w:val="left"/>
-      </w:pPr>
-      <w:r>
-        <w:rPr>
-          <w:rFonts w:ascii="Courier New" w:hAnsi="Courier New"/>
-          <w:b w:val="0"/>
-          <w:sz w:val="20"/>
-        </w:rPr>
-        <w:t xml:space="preserve">  - Condo fee statements</w:t>
-      </w:r>
-    </w:p>
-    <w:p>
-      <w:pPr>
-        <w:spacing w:before="0" w:after="80"/>
-        <w:jc w:val="left"/>
-      </w:pPr>
-      <w:r>
-        <w:rPr>
-          <w:rFonts w:ascii="Courier New" w:hAnsi="Courier New"/>
-          <w:b w:val="0"/>
-          <w:sz w:val="20"/>
-        </w:rPr>
-      </w:r>
-    </w:p>
-    <w:p>
-      <w:pPr>
-        <w:spacing w:before="80" w:after="80"/>
-        <w:jc w:val="left"/>
-      </w:pPr>
-      <w:r>
-        <w:rPr>
-          <w:rFonts w:ascii="Courier New" w:hAnsi="Courier New"/>
-          <w:b w:val="0"/>
-          <w:sz w:val="18"/>
-        </w:rPr>
-        <w:t>========================================================================</w:t>
-      </w:r>
-    </w:p>
-    <w:p>
-      <w:pPr>
-        <w:spacing w:before="0" w:after="80"/>
-        <w:jc w:val="left"/>
-      </w:pPr>
-      <w:r>
-        <w:rPr>
-          <w:rFonts w:ascii="Courier New" w:hAnsi="Courier New"/>
-          <w:b/>
-          <w:sz w:val="20"/>
-        </w:rPr>
-        <w:t>4. ITEMIZED DEDUCTIONS — SCHEDULE A</w:t>
-      </w:r>
-    </w:p>
-    <w:p>
-      <w:pPr>
-        <w:spacing w:before="80" w:after="80"/>
-        <w:jc w:val="left"/>
-      </w:pPr>
-      <w:r>
-        <w:rPr>
-          <w:rFonts w:ascii="Courier New" w:hAnsi="Courier New"/>
-          <w:b w:val="0"/>
-          <w:sz w:val="18"/>
-        </w:rPr>
-        <w:t>========================================================================</w:t>
-      </w:r>
-    </w:p>
-    <w:p>
-      <w:pPr>
-        <w:spacing w:before="0" w:after="80"/>
-        <w:jc w:val="left"/>
-      </w:pPr>
-      <w:r>
-        <w:rPr>
-          <w:rFonts w:ascii="Courier New" w:hAnsi="Courier New"/>
-          <w:b w:val="0"/>
-          <w:sz w:val="20"/>
-        </w:rPr>
-      </w:r>
-    </w:p>
-    <w:p>
-      <w:pPr>
-        <w:spacing w:before="0" w:after="80"/>
-        <w:jc w:val="left"/>
-      </w:pPr>
-      <w:r>
-        <w:rPr>
-          <w:rFonts w:ascii="Courier New" w:hAnsi="Courier New"/>
-          <w:b w:val="0"/>
-          <w:sz w:val="20"/>
-        </w:rPr>
-        <w:t xml:space="preserve">  State &amp; Local Income Taxes (MA 2023 paid):  $  5,424</w:t>
-      </w:r>
-    </w:p>
-    <w:p>
-      <w:pPr>
-        <w:spacing w:before="0" w:after="80"/>
-        <w:jc w:val="left"/>
-      </w:pPr>
-      <w:r>
-        <w:rPr>
-          <w:rFonts w:ascii="Courier New" w:hAnsi="Courier New"/>
-          <w:b w:val="0"/>
-          <w:sz w:val="20"/>
-        </w:rPr>
-        <w:t xml:space="preserve">  State &amp; Local Real Estate Taxes:             $  2,651</w:t>
-      </w:r>
-    </w:p>
-    <w:p>
-      <w:pPr>
-        <w:spacing w:before="0" w:after="80"/>
-        <w:jc w:val="left"/>
-      </w:pPr>
-      <w:r>
-        <w:rPr>
-          <w:rFonts w:ascii="Courier New" w:hAnsi="Courier New"/>
-          <w:b w:val="0"/>
-          <w:sz w:val="20"/>
-        </w:rPr>
-        <w:t xml:space="preserve">  SALT Subtotal:                               $  8,075</w:t>
-      </w:r>
-    </w:p>
-    <w:p>
-      <w:pPr>
-        <w:spacing w:before="0" w:after="80"/>
-        <w:jc w:val="left"/>
-      </w:pPr>
-      <w:r>
-        <w:rPr>
-          <w:rFonts w:ascii="Courier New" w:hAnsi="Courier New"/>
-          <w:b w:val="0"/>
-          <w:sz w:val="20"/>
-        </w:rPr>
-        <w:t xml:space="preserve">  SALT Cap (limited to):                       $  8,075</w:t>
-      </w:r>
-    </w:p>
-    <w:p>
-      <w:pPr>
-        <w:spacing w:before="0" w:after="80"/>
-        <w:jc w:val="left"/>
-      </w:pPr>
-      <w:r>
-        <w:rPr>
-          <w:rFonts w:ascii="Courier New" w:hAnsi="Courier New"/>
-          <w:b w:val="0"/>
-          <w:sz w:val="20"/>
-        </w:rPr>
-      </w:r>
-    </w:p>
-    <w:p>
-      <w:pPr>
-        <w:spacing w:before="0" w:after="80"/>
-        <w:jc w:val="left"/>
-      </w:pPr>
-      <w:r>
-        <w:rPr>
-          <w:rFonts w:ascii="Courier New" w:hAnsi="Courier New"/>
-          <w:b w:val="0"/>
-          <w:sz w:val="20"/>
-        </w:rPr>
-        <w:t xml:space="preserve">  Mortgage Interest (Form 1098):               $114,034</w:t>
-      </w:r>
-    </w:p>
-    <w:p>
-      <w:pPr>
-        <w:spacing w:before="0" w:after="80"/>
-        <w:jc w:val="left"/>
-      </w:pPr>
-      <w:r>
-        <w:rPr>
-          <w:rFonts w:ascii="Courier New" w:hAnsi="Courier New"/>
-          <w:b w:val="0"/>
-          <w:sz w:val="20"/>
-        </w:rPr>
-        <w:t xml:space="preserve">    - 27 Cormorant Circle mortgages</w:t>
-      </w:r>
-    </w:p>
-    <w:p>
-      <w:pPr>
-        <w:spacing w:before="0" w:after="80"/>
-        <w:jc w:val="left"/>
-      </w:pPr>
-      <w:r>
-        <w:rPr>
-          <w:rFonts w:ascii="Courier New" w:hAnsi="Courier New"/>
-          <w:b w:val="0"/>
-          <w:sz w:val="20"/>
-        </w:rPr>
-        <w:t xml:space="preserve">    - 7 Briarwood Dr mortgage</w:t>
-      </w:r>
-    </w:p>
-    <w:p>
-      <w:pPr>
-        <w:spacing w:before="0" w:after="80"/>
-        <w:jc w:val="left"/>
-      </w:pPr>
-      <w:r>
-        <w:rPr>
-          <w:rFonts w:ascii="Courier New" w:hAnsi="Courier New"/>
-          <w:b w:val="0"/>
-          <w:sz w:val="20"/>
-        </w:rPr>
-        <w:t xml:space="preserve">    - Primary residence mortgage</w:t>
-      </w:r>
-    </w:p>
-    <w:p>
-      <w:pPr>
-        <w:spacing w:before="0" w:after="80"/>
-        <w:jc w:val="left"/>
-      </w:pPr>
-      <w:r>
-        <w:rPr>
-          <w:rFonts w:ascii="Courier New" w:hAnsi="Courier New"/>
-          <w:b w:val="0"/>
-          <w:sz w:val="20"/>
-        </w:rPr>
-      </w:r>
-    </w:p>
-    <w:p>
-      <w:pPr>
-        <w:spacing w:before="0" w:after="80"/>
-        <w:jc w:val="left"/>
-      </w:pPr>
-      <w:r>
-        <w:rPr>
-          <w:rFonts w:ascii="Courier New" w:hAnsi="Courier New"/>
-          <w:b/>
-          <w:sz w:val="20"/>
-        </w:rPr>
-        <w:t xml:space="preserve">  TOTAL ITEMIZED DEDUCTIONS:                   $122,109</w:t>
-      </w:r>
-    </w:p>
-    <w:p>
-      <w:pPr>
-        <w:spacing w:before="0" w:after="80"/>
-        <w:jc w:val="left"/>
-      </w:pPr>
-      <w:r>
-        <w:rPr>
-          <w:rFonts w:ascii="Courier New" w:hAnsi="Courier New"/>
-          <w:b w:val="0"/>
-          <w:sz w:val="20"/>
-        </w:rPr>
-      </w:r>
-    </w:p>
-    <w:p>
-      <w:pPr>
-        <w:spacing w:before="0" w:after="80"/>
-        <w:jc w:val="left"/>
-      </w:pPr>
-      <w:r>
-        <w:rPr>
-          <w:rFonts w:ascii="Courier New" w:hAnsi="Courier New"/>
-          <w:b w:val="0"/>
-          <w:sz w:val="20"/>
-        </w:rPr>
-        <w:t>Note: All mortgage interest reported on Forms 1098 from lending institutions. Copies enclosed.</w:t>
-      </w:r>
-    </w:p>
-    <w:p>
-      <w:pPr>
-        <w:spacing w:before="0" w:after="80"/>
-        <w:jc w:val="left"/>
-      </w:pPr>
-      <w:r>
-        <w:rPr>
-          <w:rFonts w:ascii="Courier New" w:hAnsi="Courier New"/>
-          <w:b w:val="0"/>
-          <w:sz w:val="20"/>
-        </w:rPr>
-      </w:r>
-    </w:p>
-    <w:p>
-      <w:pPr>
-        <w:spacing w:before="80" w:after="80"/>
-        <w:jc w:val="left"/>
-      </w:pPr>
-      <w:r>
-        <w:rPr>
-          <w:rFonts w:ascii="Courier New" w:hAnsi="Courier New"/>
-          <w:b w:val="0"/>
-          <w:sz w:val="18"/>
-        </w:rPr>
-        <w:t>========================================================================</w:t>
-      </w:r>
-    </w:p>
-    <w:p>
-      <w:pPr>
-        <w:spacing w:before="0" w:after="80"/>
-        <w:jc w:val="left"/>
-      </w:pPr>
-      <w:r>
-        <w:rPr>
-          <w:rFonts w:ascii="Courier New" w:hAnsi="Courier New"/>
-          <w:b/>
-          <w:sz w:val="20"/>
-        </w:rPr>
-        <w:t>5. SELF-EMPLOYMENT TAX — SCHEDULE SE</w:t>
-      </w:r>
-    </w:p>
-    <w:p>
-      <w:pPr>
-        <w:spacing w:before="80" w:after="80"/>
-        <w:jc w:val="left"/>
-      </w:pPr>
-      <w:r>
-        <w:rPr>
-          <w:rFonts w:ascii="Courier New" w:hAnsi="Courier New"/>
-          <w:b w:val="0"/>
-          <w:sz w:val="18"/>
-        </w:rPr>
-        <w:t>========================================================================</w:t>
-      </w:r>
-    </w:p>
-    <w:p>
-      <w:pPr>
-        <w:spacing w:before="0" w:after="80"/>
-        <w:jc w:val="left"/>
-      </w:pPr>
-      <w:r>
-        <w:rPr>
-          <w:rFonts w:ascii="Courier New" w:hAnsi="Courier New"/>
-          <w:b w:val="0"/>
-          <w:sz w:val="20"/>
-        </w:rPr>
-      </w:r>
-    </w:p>
-    <w:p>
-      <w:pPr>
-        <w:spacing w:before="0" w:after="80"/>
-        <w:jc w:val="left"/>
-      </w:pPr>
-      <w:r>
-        <w:rPr>
-          <w:rFonts w:ascii="Courier New" w:hAnsi="Courier New"/>
-          <w:b w:val="0"/>
-          <w:sz w:val="20"/>
-        </w:rPr>
-        <w:t xml:space="preserve">  Net Schedule C Income:            $ 81,379</w:t>
-      </w:r>
-    </w:p>
-    <w:p>
-      <w:pPr>
-        <w:spacing w:before="0" w:after="80"/>
-        <w:jc w:val="left"/>
-      </w:pPr>
-      <w:r>
-        <w:rPr>
-          <w:rFonts w:ascii="Courier New" w:hAnsi="Courier New"/>
-          <w:b w:val="0"/>
-          <w:sz w:val="20"/>
-        </w:rPr>
-        <w:t xml:space="preserve">  SE Earnings (x 92.35%):          $ 75,154</w:t>
-      </w:r>
-    </w:p>
-    <w:p>
-      <w:pPr>
-        <w:spacing w:before="0" w:after="80"/>
-        <w:jc w:val="left"/>
-      </w:pPr>
-      <w:r>
-        <w:rPr>
-          <w:rFonts w:ascii="Courier New" w:hAnsi="Courier New"/>
-          <w:b w:val="0"/>
-          <w:sz w:val="20"/>
-        </w:rPr>
-        <w:t xml:space="preserve">  Social Security Tax (x 12.4%):   $  9,319</w:t>
-      </w:r>
-    </w:p>
-    <w:p>
-      <w:pPr>
-        <w:spacing w:before="0" w:after="80"/>
-        <w:jc w:val="left"/>
-      </w:pPr>
-      <w:r>
-        <w:rPr>
-          <w:rFonts w:ascii="Courier New" w:hAnsi="Courier New"/>
-          <w:b w:val="0"/>
-          <w:sz w:val="20"/>
-        </w:rPr>
-        <w:t xml:space="preserve">  Medicare Tax (x 2.9%):           $  2,179</w:t>
-      </w:r>
-    </w:p>
-    <w:p>
-      <w:pPr>
-        <w:spacing w:before="0" w:after="80"/>
-        <w:jc w:val="left"/>
-      </w:pPr>
-      <w:r>
-        <w:rPr>
-          <w:rFonts w:ascii="Courier New" w:hAnsi="Courier New"/>
-          <w:b/>
-          <w:sz w:val="20"/>
-        </w:rPr>
-        <w:t xml:space="preserve">  TOTAL SE TAX:                     $ 11,498</w:t>
-      </w:r>
-    </w:p>
-    <w:p>
-      <w:pPr>
-        <w:spacing w:before="0" w:after="80"/>
-        <w:jc w:val="left"/>
-      </w:pPr>
-      <w:r>
-        <w:rPr>
-          <w:rFonts w:ascii="Courier New" w:hAnsi="Courier New"/>
-          <w:b w:val="0"/>
-          <w:sz w:val="20"/>
-        </w:rPr>
-        <w:t xml:space="preserve">  SE Tax Deduction (50%):           $  5,749</w:t>
-      </w:r>
-    </w:p>
-    <w:p>
-      <w:pPr>
-        <w:spacing w:before="0" w:after="80"/>
-        <w:jc w:val="left"/>
-      </w:pPr>
-      <w:r>
-        <w:rPr>
-          <w:rFonts w:ascii="Courier New" w:hAnsi="Courier New"/>
-          <w:b w:val="0"/>
-          <w:sz w:val="20"/>
-        </w:rPr>
-      </w:r>
-    </w:p>
-    <w:p>
-      <w:pPr>
-        <w:spacing w:before="80" w:after="80"/>
-        <w:jc w:val="left"/>
-      </w:pPr>
-      <w:r>
-        <w:rPr>
-          <w:rFonts w:ascii="Courier New" w:hAnsi="Courier New"/>
-          <w:b w:val="0"/>
-          <w:sz w:val="18"/>
-        </w:rPr>
-        <w:t>========================================================================</w:t>
-      </w:r>
-    </w:p>
-    <w:p>
-      <w:pPr>
-        <w:spacing w:before="0" w:after="80"/>
-        <w:jc w:val="left"/>
-      </w:pPr>
-      <w:r>
-        <w:rPr>
-          <w:rFonts w:ascii="Courier New" w:hAnsi="Courier New"/>
-          <w:b/>
-          <w:sz w:val="20"/>
-        </w:rPr>
-        <w:t>6. QUALIFIED BUSINESS INCOME DEDUCTION — FORM 8995</w:t>
-      </w:r>
-    </w:p>
-    <w:p>
-      <w:pPr>
-        <w:spacing w:before="80" w:after="80"/>
-        <w:jc w:val="left"/>
-      </w:pPr>
-      <w:r>
-        <w:rPr>
-          <w:rFonts w:ascii="Courier New" w:hAnsi="Courier New"/>
-          <w:b w:val="0"/>
-          <w:sz w:val="18"/>
-        </w:rPr>
-        <w:t>========================================================================</w:t>
-      </w:r>
-    </w:p>
-    <w:p>
-      <w:pPr>
-        <w:spacing w:before="0" w:after="80"/>
-        <w:jc w:val="left"/>
-      </w:pPr>
-      <w:r>
-        <w:rPr>
-          <w:rFonts w:ascii="Courier New" w:hAnsi="Courier New"/>
-          <w:b w:val="0"/>
-          <w:sz w:val="20"/>
-        </w:rPr>
-      </w:r>
-    </w:p>
-    <w:p>
-      <w:pPr>
-        <w:spacing w:before="0" w:after="80"/>
-        <w:jc w:val="left"/>
-      </w:pPr>
-      <w:r>
-        <w:rPr>
-          <w:rFonts w:ascii="Courier New" w:hAnsi="Courier New"/>
-          <w:b w:val="0"/>
-          <w:sz w:val="20"/>
-        </w:rPr>
-        <w:t xml:space="preserve">  Schedule C (Housecleaning):       $ 75,630</w:t>
-      </w:r>
-    </w:p>
-    <w:p>
-      <w:pPr>
-        <w:spacing w:before="0" w:after="80"/>
-        <w:jc w:val="left"/>
-      </w:pPr>
-      <w:r>
-        <w:rPr>
-          <w:rFonts w:ascii="Courier New" w:hAnsi="Courier New"/>
-          <w:b w:val="0"/>
-          <w:sz w:val="20"/>
-        </w:rPr>
-        <w:t xml:space="preserve">  Schedule E — 27 Cormorant Cir:   $ 42,054</w:t>
-      </w:r>
-    </w:p>
-    <w:p>
-      <w:pPr>
-        <w:spacing w:before="0" w:after="80"/>
-        <w:jc w:val="left"/>
-      </w:pPr>
-      <w:r>
-        <w:rPr>
-          <w:rFonts w:ascii="Courier New" w:hAnsi="Courier New"/>
-          <w:b w:val="0"/>
-          <w:sz w:val="20"/>
-        </w:rPr>
-        <w:t xml:space="preserve">  Schedule E — 7 Briarwood Dr:     $ 30,405</w:t>
-      </w:r>
-    </w:p>
-    <w:p>
-      <w:pPr>
-        <w:spacing w:before="0" w:after="80"/>
-        <w:jc w:val="left"/>
-      </w:pPr>
-      <w:r>
-        <w:rPr>
-          <w:rFonts w:ascii="Courier New" w:hAnsi="Courier New"/>
-          <w:b w:val="0"/>
-          <w:sz w:val="20"/>
-        </w:rPr>
-        <w:t xml:space="preserve">  Total QBI:                        $148,089</w:t>
-      </w:r>
-    </w:p>
-    <w:p>
-      <w:pPr>
-        <w:spacing w:before="0" w:after="80"/>
-        <w:jc w:val="left"/>
-      </w:pPr>
-      <w:r>
-        <w:rPr>
-          <w:rFonts w:ascii="Courier New" w:hAnsi="Courier New"/>
-          <w:b w:val="0"/>
-          <w:sz w:val="20"/>
-        </w:rPr>
-        <w:t xml:space="preserve">  20% of QBI:                       $ 29,618</w:t>
-      </w:r>
-    </w:p>
-    <w:p>
-      <w:pPr>
-        <w:spacing w:before="0" w:after="80"/>
-        <w:jc w:val="left"/>
-      </w:pPr>
-      <w:r>
-        <w:rPr>
-          <w:rFonts w:ascii="Courier New" w:hAnsi="Courier New"/>
-          <w:b w:val="0"/>
-          <w:sz w:val="20"/>
-        </w:rPr>
-        <w:t xml:space="preserve">  Income Limitation (20% x $25,980):$  5,196</w:t>
-      </w:r>
-    </w:p>
-    <w:p>
-      <w:pPr>
-        <w:spacing w:before="0" w:after="80"/>
-        <w:jc w:val="left"/>
-      </w:pPr>
-      <w:r>
-        <w:rPr>
-          <w:rFonts w:ascii="Courier New" w:hAnsi="Courier New"/>
-          <w:b/>
-          <w:sz w:val="20"/>
-        </w:rPr>
-        <w:t xml:space="preserve">  QBI DEDUCTION ALLOWED:            $  5,196</w:t>
-      </w:r>
-    </w:p>
-    <w:p>
-      <w:pPr>
-        <w:spacing w:before="0" w:after="80"/>
-        <w:jc w:val="left"/>
-      </w:pPr>
-      <w:r>
-        <w:rPr>
-          <w:rFonts w:ascii="Courier New" w:hAnsi="Courier New"/>
-          <w:b w:val="0"/>
-          <w:sz w:val="20"/>
-        </w:rPr>
-      </w:r>
-    </w:p>
-    <w:p>
-      <w:pPr>
-        <w:spacing w:before="80" w:after="80"/>
-        <w:jc w:val="left"/>
-      </w:pPr>
-      <w:r>
-        <w:rPr>
-          <w:rFonts w:ascii="Courier New" w:hAnsi="Courier New"/>
-          <w:b w:val="0"/>
-          <w:sz w:val="18"/>
-        </w:rPr>
-        <w:t>========================================================================</w:t>
-      </w:r>
-    </w:p>
-    <w:p>
-      <w:pPr>
-        <w:spacing w:before="0" w:after="80"/>
-        <w:jc w:val="left"/>
-      </w:pPr>
-      <w:r>
-        <w:rPr>
-          <w:rFonts w:ascii="Courier New" w:hAnsi="Courier New"/>
-          <w:b/>
-          <w:sz w:val="20"/>
-        </w:rPr>
-        <w:t>7. UNDERPAYMENT PENALTY — FORM 2210</w:t>
-      </w:r>
-    </w:p>
-    <w:p>
-      <w:pPr>
-        <w:spacing w:before="80" w:after="80"/>
-        <w:jc w:val="left"/>
-      </w:pPr>
-      <w:r>
-        <w:rPr>
-          <w:rFonts w:ascii="Courier New" w:hAnsi="Courier New"/>
-          <w:b w:val="0"/>
-          <w:sz w:val="18"/>
-        </w:rPr>
-        <w:t>========================================================================</w:t>
-      </w:r>
-    </w:p>
-    <w:p>
-      <w:pPr>
-        <w:spacing w:before="0" w:after="80"/>
-        <w:jc w:val="left"/>
-      </w:pPr>
-      <w:r>
-        <w:rPr>
-          <w:rFonts w:ascii="Courier New" w:hAnsi="Courier New"/>
-          <w:b w:val="0"/>
-          <w:sz w:val="20"/>
-        </w:rPr>
-      </w:r>
-    </w:p>
-    <w:p>
-      <w:pPr>
-        <w:spacing w:before="0" w:after="80"/>
-        <w:jc w:val="left"/>
-      </w:pPr>
-      <w:r>
-        <w:rPr>
-          <w:rFonts w:ascii="Courier New" w:hAnsi="Courier New"/>
-          <w:b w:val="0"/>
-          <w:sz w:val="20"/>
-        </w:rPr>
-        <w:t>An underpayment penalty of $620 was calculated and included on Line 38 of the return. No estimated tax payments were made during tax year 2024. For tax year 2025, quarterly estimated payments of $3,440 per quarter have been recommended ($13,760 total).</w:t>
-      </w:r>
-    </w:p>
-    <w:p>
-      <w:pPr>
-        <w:spacing w:before="0" w:after="80"/>
-        <w:jc w:val="left"/>
-      </w:pPr>
-      <w:r>
-        <w:rPr>
-          <w:rFonts w:ascii="Courier New" w:hAnsi="Courier New"/>
-          <w:b w:val="0"/>
-          <w:sz w:val="20"/>
-        </w:rPr>
-      </w:r>
-    </w:p>
-    <w:p>
-      <w:pPr>
-        <w:spacing w:before="80" w:after="80"/>
-        <w:jc w:val="left"/>
-      </w:pPr>
-      <w:r>
-        <w:rPr>
-          <w:rFonts w:ascii="Courier New" w:hAnsi="Courier New"/>
-          <w:b w:val="0"/>
-          <w:sz w:val="18"/>
-        </w:rPr>
-        <w:t>========================================================================</w:t>
-      </w:r>
-    </w:p>
-    <w:p>
-      <w:pPr>
-        <w:spacing w:before="0" w:after="80"/>
-        <w:jc w:val="left"/>
-      </w:pPr>
-      <w:r>
-        <w:rPr>
-          <w:rFonts w:ascii="Courier New" w:hAnsi="Courier New"/>
-          <w:b/>
-          <w:sz w:val="20"/>
-        </w:rPr>
-        <w:t>8. DOCUMENTS ENCLOSED</w:t>
-      </w:r>
-    </w:p>
-    <w:p>
-      <w:pPr>
-        <w:spacing w:before="80" w:after="80"/>
-        <w:jc w:val="left"/>
-      </w:pPr>
-      <w:r>
-        <w:rPr>
-          <w:rFonts w:ascii="Courier New" w:hAnsi="Courier New"/>
-          <w:b w:val="0"/>
-          <w:sz w:val="18"/>
-        </w:rPr>
-        <w:t>========================================================================</w:t>
-      </w:r>
-    </w:p>
-    <w:p>
-      <w:pPr>
-        <w:spacing w:before="0" w:after="80"/>
-        <w:jc w:val="left"/>
-      </w:pPr>
-      <w:r>
-        <w:rPr>
-          <w:rFonts w:ascii="Courier New" w:hAnsi="Courier New"/>
-          <w:b w:val="0"/>
-          <w:sz w:val="20"/>
-        </w:rPr>
-      </w:r>
-    </w:p>
-    <w:p>
-      <w:pPr>
-        <w:spacing w:before="0" w:after="80"/>
-        <w:jc w:val="left"/>
-      </w:pPr>
-      <w:r>
-        <w:rPr>
-          <w:rFonts w:ascii="Courier New" w:hAnsi="Courier New"/>
-          <w:b w:val="0"/>
-          <w:sz w:val="20"/>
-        </w:rPr>
-        <w:t xml:space="preserve">  [X] Copy of 2024 Form 1040 and all schedules (A, C, E, SE)</w:t>
-      </w:r>
-    </w:p>
-    <w:p>
-      <w:pPr>
-        <w:spacing w:before="0" w:after="80"/>
-        <w:jc w:val="left"/>
-      </w:pPr>
-      <w:r>
-        <w:rPr>
-          <w:rFonts w:ascii="Courier New" w:hAnsi="Courier New"/>
-          <w:b w:val="0"/>
-          <w:sz w:val="20"/>
-        </w:rPr>
-        <w:t xml:space="preserve">  [X] Form 8995 — QBI Deduction</w:t>
-      </w:r>
-    </w:p>
-    <w:p>
-      <w:pPr>
-        <w:spacing w:before="0" w:after="80"/>
-        <w:jc w:val="left"/>
-      </w:pPr>
-      <w:r>
-        <w:rPr>
-          <w:rFonts w:ascii="Courier New" w:hAnsi="Courier New"/>
-          <w:b w:val="0"/>
-          <w:sz w:val="20"/>
-        </w:rPr>
-        <w:t xml:space="preserve">  [X] Form 4562 — Depreciation Schedules (both properties)</w:t>
-      </w:r>
-    </w:p>
-    <w:p>
-      <w:pPr>
-        <w:spacing w:before="0" w:after="80"/>
-        <w:jc w:val="left"/>
-      </w:pPr>
-      <w:r>
-        <w:rPr>
-          <w:rFonts w:ascii="Courier New" w:hAnsi="Courier New"/>
-          <w:b w:val="0"/>
-          <w:sz w:val="20"/>
-        </w:rPr>
-        <w:t xml:space="preserve">  [X] Schedule C expense receipts (business expenses)</w:t>
-      </w:r>
-    </w:p>
-    <w:p>
-      <w:pPr>
-        <w:spacing w:before="0" w:after="80"/>
-        <w:jc w:val="left"/>
-      </w:pPr>
-      <w:r>
-        <w:rPr>
-          <w:rFonts w:ascii="Courier New" w:hAnsi="Courier New"/>
-          <w:b w:val="0"/>
-          <w:sz w:val="20"/>
-        </w:rPr>
-        <w:t xml:space="preserve">  [X] Vehicle mileage log — 2024 (13,800 business miles)</w:t>
-      </w:r>
-    </w:p>
-    <w:p>
-      <w:pPr>
-        <w:spacing w:before="0" w:after="80"/>
-        <w:jc w:val="left"/>
-      </w:pPr>
-      <w:r>
-        <w:rPr>
-          <w:rFonts w:ascii="Courier New" w:hAnsi="Courier New"/>
-          <w:b w:val="0"/>
-          <w:sz w:val="20"/>
-        </w:rPr>
-        <w:t xml:space="preserve">  [X] Bank statements — gross receipts $249,000</w:t>
-      </w:r>
-    </w:p>
-    <w:p>
-      <w:pPr>
-        <w:spacing w:before="0" w:after="80"/>
-        <w:jc w:val="left"/>
-      </w:pPr>
-      <w:r>
-        <w:rPr>
-          <w:rFonts w:ascii="Courier New" w:hAnsi="Courier New"/>
-          <w:b w:val="0"/>
-          <w:sz w:val="20"/>
-        </w:rPr>
-        <w:t xml:space="preserve">  [X] Labor cost records — $67,401</w:t>
-      </w:r>
-    </w:p>
-    <w:p>
-      <w:pPr>
-        <w:spacing w:before="0" w:after="80"/>
-        <w:jc w:val="left"/>
-      </w:pPr>
-      <w:r>
-        <w:rPr>
-          <w:rFonts w:ascii="Courier New" w:hAnsi="Courier New"/>
-          <w:b w:val="0"/>
-          <w:sz w:val="20"/>
-        </w:rPr>
-        <w:t xml:space="preserve">  [X] Forms 1098 — Mortgage Interest (all properties)</w:t>
-      </w:r>
-    </w:p>
-    <w:p>
-      <w:pPr>
-        <w:spacing w:before="0" w:after="80"/>
-        <w:jc w:val="left"/>
-      </w:pPr>
-      <w:r>
-        <w:rPr>
-          <w:rFonts w:ascii="Courier New" w:hAnsi="Courier New"/>
-          <w:b w:val="0"/>
-          <w:sz w:val="20"/>
-        </w:rPr>
-        <w:t xml:space="preserve">  [X] Property tax bills — 27 Cormorant Circle &amp; 7 Briarwood Dr</w:t>
-      </w:r>
-    </w:p>
-    <w:p>
-      <w:pPr>
-        <w:spacing w:before="0" w:after="80"/>
-        <w:jc w:val="left"/>
-      </w:pPr>
-      <w:r>
-        <w:rPr>
-          <w:rFonts w:ascii="Courier New" w:hAnsi="Courier New"/>
-          <w:b w:val="0"/>
-          <w:sz w:val="20"/>
-        </w:rPr>
-        <w:t xml:space="preserve">  [X] Lease agreements — both rental properties (365 days, no personal use)</w:t>
-      </w:r>
-    </w:p>
-    <w:p>
-      <w:pPr>
-        <w:spacing w:before="0" w:after="80"/>
-        <w:jc w:val="left"/>
-      </w:pPr>
-      <w:r>
-        <w:rPr>
-          <w:rFonts w:ascii="Courier New" w:hAnsi="Courier New"/>
-          <w:b w:val="0"/>
-          <w:sz w:val="20"/>
-        </w:rPr>
-        <w:t xml:space="preserve">  [X] Insurance invoices — both properties</w:t>
-      </w:r>
-    </w:p>
-    <w:p>
-      <w:pPr>
-        <w:spacing w:before="0" w:after="80"/>
-        <w:jc w:val="left"/>
-      </w:pPr>
-      <w:r>
-        <w:rPr>
-          <w:rFonts w:ascii="Courier New" w:hAnsi="Courier New"/>
-          <w:b w:val="0"/>
-          <w:sz w:val="20"/>
-        </w:rPr>
-        <w:t xml:space="preserve">  [X] Utility/Water/Sewer bills — both properties</w:t>
-      </w:r>
-    </w:p>
-    <w:p>
-      <w:pPr>
-        <w:spacing w:before="0" w:after="80"/>
-        <w:jc w:val="left"/>
-      </w:pPr>
-      <w:r>
-        <w:rPr>
-          <w:rFonts w:ascii="Courier New" w:hAnsi="Courier New"/>
-          <w:b w:val="0"/>
-          <w:sz w:val="20"/>
-        </w:rPr>
-        <w:t xml:space="preserve">  [X] Solar panel invoices — both properties</w:t>
-      </w:r>
-    </w:p>
-    <w:p>
-      <w:pPr>
-        <w:spacing w:before="0" w:after="80"/>
-        <w:jc w:val="left"/>
-      </w:pPr>
-      <w:r>
-        <w:rPr>
-          <w:rFonts w:ascii="Courier New" w:hAnsi="Courier New"/>
-          <w:b w:val="0"/>
-          <w:sz w:val="20"/>
-        </w:rPr>
-        <w:t xml:space="preserve">  [X] Condo fee statements — both properties</w:t>
-      </w:r>
-    </w:p>
-    <w:p>
-      <w:pPr>
-        <w:spacing w:before="0" w:after="80"/>
-        <w:jc w:val="left"/>
-      </w:pPr>
-      <w:r>
-        <w:rPr>
-          <w:rFonts w:ascii="Courier New" w:hAnsi="Courier New"/>
-          <w:b w:val="0"/>
-          <w:sz w:val="20"/>
-        </w:rPr>
-        <w:t xml:space="preserve">  [X] Massachusetts state tax payment documentation ($7,372)</w:t>
-      </w:r>
-    </w:p>
-    <w:p>
-      <w:pPr>
-        <w:spacing w:before="0" w:after="80"/>
-        <w:jc w:val="left"/>
-      </w:pPr>
-      <w:r>
-        <w:rPr>
-          <w:rFonts w:ascii="Courier New" w:hAnsi="Courier New"/>
-          <w:b w:val="0"/>
-          <w:sz w:val="20"/>
-        </w:rPr>
-      </w:r>
-    </w:p>
-    <w:p>
-      <w:pPr>
-        <w:spacing w:before="80" w:after="80"/>
-        <w:jc w:val="left"/>
-      </w:pPr>
-      <w:r>
-        <w:rPr>
-          <w:rFonts w:ascii="Courier New" w:hAnsi="Courier New"/>
-          <w:b w:val="0"/>
-          <w:sz w:val="18"/>
-        </w:rPr>
-        <w:t>========================================================================</w:t>
-      </w:r>
-    </w:p>
-    <w:p>
-      <w:pPr>
-        <w:spacing w:before="0" w:after="80"/>
-        <w:jc w:val="left"/>
-      </w:pPr>
-      <w:r>
-        <w:rPr>
-          <w:rFonts w:ascii="Courier New" w:hAnsi="Courier New"/>
-          <w:b w:val="0"/>
-          <w:sz w:val="20"/>
-        </w:rPr>
-      </w:r>
-    </w:p>
-    <w:p>
-      <w:pPr>
-        <w:spacing w:before="0" w:after="80"/>
-        <w:jc w:val="left"/>
-      </w:pPr>
-      <w:r>
-        <w:rPr>
-          <w:rFonts w:ascii="Courier New" w:hAnsi="Courier New"/>
-          <w:b w:val="0"/>
-          <w:sz w:val="20"/>
-        </w:rPr>
-        <w:t>I trust this information fully addresses the items raised in Notice LTR566T. Should you require any additional documentation, please contact me directly.</w:t>
-      </w:r>
-    </w:p>
-    <w:p>
-      <w:pPr>
-        <w:spacing w:before="0" w:after="80"/>
-        <w:jc w:val="left"/>
-      </w:pPr>
-      <w:r>
-        <w:rPr>
-          <w:rFonts w:ascii="Courier New" w:hAnsi="Courier New"/>
-          <w:b w:val="0"/>
-          <w:sz w:val="20"/>
-        </w:rPr>
-      </w:r>
-    </w:p>
-    <w:p>
-      <w:pPr>
-        <w:spacing w:before="0" w:after="80"/>
-        <w:jc w:val="left"/>
-      </w:pPr>
-      <w:r>
-        <w:rPr>
-          <w:rFonts w:ascii="Courier New" w:hAnsi="Courier New"/>
-          <w:b w:val="0"/>
-          <w:sz w:val="20"/>
+          <w:sz w:val="22"/>
         </w:rPr>
         <w:t>I declare under penalty of perjury that the information provided herein is true, correct, and complete to the best of my knowledge and belief.</w:t>
       </w:r>
     </w:p>
     <w:p>
       <w:pPr>
-        <w:spacing w:before="0" w:after="80"/>
+        <w:spacing w:before="0" w:after="120"/>
         <w:jc w:val="left"/>
       </w:pPr>
       <w:r>
         <w:rPr>
-          <w:rFonts w:ascii="Courier New" w:hAnsi="Courier New"/>
+          <w:rFonts w:ascii="Times New Roman" w:hAnsi="Times New Roman"/>
           <w:b w:val="0"/>
-          <w:sz w:val="20"/>
+          <w:sz w:val="22"/>
         </w:rPr>
       </w:r>
     </w:p>
     <w:p>
       <w:pPr>
-        <w:spacing w:before="0" w:after="80"/>
+        <w:spacing w:before="0" w:after="120"/>
         <w:jc w:val="left"/>
       </w:pPr>
       <w:r>
         <w:rPr>
-          <w:rFonts w:ascii="Courier New" w:hAnsi="Courier New"/>
+          <w:rFonts w:ascii="Times New Roman" w:hAnsi="Times New Roman"/>
           <w:b w:val="0"/>
-          <w:sz w:val="20"/>
+          <w:sz w:val="22"/>
+        </w:rPr>
+      </w:r>
+    </w:p>
+    <w:p>
+      <w:pPr>
+        <w:spacing w:before="0" w:after="120"/>
+        <w:jc w:val="left"/>
+      </w:pPr>
+      <w:r>
+        <w:rPr>
+          <w:rFonts w:ascii="Times New Roman" w:hAnsi="Times New Roman"/>
+          <w:b w:val="0"/>
+          <w:sz w:val="22"/>
         </w:rPr>
         <w:t>Sincerely,</w:t>
       </w:r>
     </w:p>
     <w:p>
       <w:pPr>
-        <w:spacing w:before="0" w:after="80"/>
+        <w:spacing w:before="0" w:after="120"/>
         <w:jc w:val="left"/>
       </w:pPr>
       <w:r>
         <w:rPr>
-          <w:rFonts w:ascii="Courier New" w:hAnsi="Courier New"/>
+          <w:rFonts w:ascii="Times New Roman" w:hAnsi="Times New Roman"/>
           <w:b w:val="0"/>
-          <w:sz w:val="20"/>
+          <w:sz w:val="22"/>
         </w:rPr>
       </w:r>
     </w:p>
     <w:p>
       <w:pPr>
-        <w:spacing w:before="0" w:after="80"/>
+        <w:spacing w:before="0" w:after="120"/>
         <w:jc w:val="left"/>
       </w:pPr>
       <w:r>
         <w:rPr>
-          <w:rFonts w:ascii="Courier New" w:hAnsi="Courier New"/>
+          <w:rFonts w:ascii="Times New Roman" w:hAnsi="Times New Roman"/>
           <w:b w:val="0"/>
-          <w:sz w:val="20"/>
+          <w:sz w:val="22"/>
         </w:rPr>
       </w:r>
     </w:p>
     <w:p>
       <w:pPr>
-        <w:spacing w:before="0" w:after="80"/>
+        <w:spacing w:before="0" w:after="120"/>
         <w:jc w:val="left"/>
       </w:pPr>
       <w:r>
         <w:rPr>
-          <w:rFonts w:ascii="Courier New" w:hAnsi="Courier New"/>
+          <w:rFonts w:ascii="Times New Roman" w:hAnsi="Times New Roman"/>
           <w:b w:val="0"/>
-          <w:sz w:val="20"/>
+          <w:sz w:val="22"/>
+        </w:rPr>
+      </w:r>
+    </w:p>
+    <w:p>
+      <w:pPr>
+        <w:spacing w:before="0" w:after="120"/>
+        <w:jc w:val="left"/>
+      </w:pPr>
+      <w:r>
+        <w:rPr>
+          <w:rFonts w:ascii="Times New Roman" w:hAnsi="Times New Roman"/>
+          <w:b w:val="0"/>
+          <w:sz w:val="22"/>
         </w:rPr>
         <w:t>_________________________________        Date: ________________</w:t>
       </w:r>
     </w:p>
     <w:p>
       <w:pPr>
-        <w:spacing w:before="0" w:after="80"/>
+        <w:spacing w:before="0" w:after="120"/>
         <w:jc w:val="left"/>
       </w:pPr>
       <w:r>
         <w:rPr>
-          <w:rFonts w:ascii="Courier New" w:hAnsi="Courier New"/>
+          <w:rFonts w:ascii="Times New Roman" w:hAnsi="Times New Roman"/>
           <w:b/>
-          <w:sz w:val="20"/>
+          <w:sz w:val="22"/>
         </w:rPr>
         <w:t>Eliana Machado de Almeida</w:t>
       </w:r>
     </w:p>
     <w:p>
       <w:pPr>
-        <w:spacing w:before="0" w:after="80"/>
+        <w:spacing w:before="0" w:after="120"/>
         <w:jc w:val="left"/>
       </w:pPr>
       <w:r>
         <w:rPr>
-          <w:rFonts w:ascii="Courier New" w:hAnsi="Courier New"/>
+          <w:rFonts w:ascii="Times New Roman" w:hAnsi="Times New Roman"/>
           <w:b w:val="0"/>
-          <w:sz w:val="20"/>
+          <w:sz w:val="22"/>
         </w:rPr>
         <w:t>SSN: 697-75-6336</w:t>
       </w:r>
     </w:p>
     <w:p>
       <w:pPr>
-        <w:spacing w:before="0" w:after="80"/>
+        <w:spacing w:before="0" w:after="120"/>
         <w:jc w:val="left"/>
       </w:pPr>
       <w:r>
         <w:rPr>
-          <w:rFonts w:ascii="Courier New" w:hAnsi="Courier New"/>
+          <w:rFonts w:ascii="Times New Roman" w:hAnsi="Times New Roman"/>
           <w:b w:val="0"/>
-          <w:sz w:val="20"/>
+          <w:sz w:val="22"/>
         </w:rPr>
         <w:t>Address: PO Box 1467, Edgartown, MA 02539</w:t>
       </w:r>
     </w:p>
     <w:p>
       <w:pPr>
-        <w:spacing w:before="0" w:after="80"/>
+        <w:spacing w:before="0" w:after="120"/>
         <w:jc w:val="left"/>
       </w:pPr>
       <w:r>
         <w:rPr>
-          <w:rFonts w:ascii="Courier New" w:hAnsi="Courier New"/>
+          <w:rFonts w:ascii="Times New Roman" w:hAnsi="Times New Roman"/>
           <w:b w:val="0"/>
-          <w:sz w:val="20"/>
+          <w:sz w:val="22"/>
         </w:rPr>
         <w:t>Phone: (401) 633-5598</w:t>
       </w:r>
     </w:p>
     <w:p>
       <w:pPr>
-        <w:spacing w:before="0" w:after="80"/>
+        <w:spacing w:before="0" w:after="120"/>
         <w:jc w:val="left"/>
       </w:pPr>
       <w:r>
         <w:rPr>
-          <w:rFonts w:ascii="Courier New" w:hAnsi="Courier New"/>
+          <w:rFonts w:ascii="Times New Roman" w:hAnsi="Times New Roman"/>
           <w:b w:val="0"/>
-          <w:sz w:val="20"/>
+          <w:sz w:val="22"/>
         </w:rPr>
         <w:t>Email: elly_usa@hotmail.com</w:t>
-      </w:r>
-    </w:p>
-    <w:p>
-      <w:pPr>
-        <w:spacing w:before="0" w:after="80"/>
-        <w:jc w:val="left"/>
-      </w:pPr>
-      <w:r>
-        <w:rPr>
-          <w:rFonts w:ascii="Courier New" w:hAnsi="Courier New"/>
-          <w:b w:val="0"/>
-          <w:sz w:val="20"/>
-        </w:rPr>
-      </w:r>
-    </w:p>
-    <w:p>
-      <w:pPr>
-        <w:spacing w:before="80" w:after="80"/>
-        <w:jc w:val="left"/>
-      </w:pPr>
-      <w:r>
-        <w:rPr>
-          <w:rFonts w:ascii="Courier New" w:hAnsi="Courier New"/>
-          <w:b w:val="0"/>
-          <w:sz w:val="18"/>
-        </w:rPr>
-        <w:t>========================================================================</w:t>
-      </w:r>
-    </w:p>
-    <w:p>
-      <w:pPr>
-        <w:spacing w:before="0" w:after="80"/>
-        <w:jc w:val="center"/>
-      </w:pPr>
-      <w:r>
-        <w:rPr>
-          <w:rFonts w:ascii="Courier New" w:hAnsi="Courier New"/>
-          <w:b/>
-          <w:sz w:val="20"/>
-        </w:rPr>
-        <w:t>END OF RESPONSE</w:t>
-      </w:r>
-    </w:p>
-    <w:p>
-      <w:pPr>
-        <w:spacing w:before="80" w:after="80"/>
-        <w:jc w:val="left"/>
-      </w:pPr>
-      <w:r>
-        <w:rPr>
-          <w:rFonts w:ascii="Courier New" w:hAnsi="Courier New"/>
-          <w:b w:val="0"/>
-          <w:sz w:val="18"/>
-        </w:rPr>
-        <w:t>========================================================================</w:t>
       </w:r>
     </w:p>
     <w:sectPr>

</xml_diff>

<commit_message>
Update IRS LTR566T response with Form 14900 mortgage interest correction
- Correct Schedule A mortgage interest from $114,034 to $74,790 (TCJA limit)
- Include Form 14900 weighted-average calculation (ratio 0.771)
- Clarify rental property mortgage interest is on Schedule E only (no double-counting)
- Confirm QBI deduction $5,196 is correctly calculated as filed
- Remove extraneous return detail; focus only on the two items IRS requested

https://claude.ai/code/session_019pk3CFrfADSxNgg23VPbbZ
</commit_message>
<xml_diff>
--- a/IRS_LTR566T_Response_Eliana_Machado_2024.docx
+++ b/IRS_LTR566T_Response_Eliana_Machado_2024.docx
@@ -4,7 +4,21 @@
   <w:body>
     <w:p>
       <w:pPr>
-        <w:spacing w:before="0" w:after="120"/>
+        <w:spacing w:before="0" w:after="240"/>
+        <w:jc w:val="center"/>
+      </w:pPr>
+      <w:r>
+        <w:rPr>
+          <w:rFonts w:ascii="Times New Roman" w:hAnsi="Times New Roman"/>
+          <w:b/>
+          <w:sz w:val="28"/>
+        </w:rPr>
+        <w:t>RESPONSE TO IRS NOTICE LTR566T</w:t>
+      </w:r>
+    </w:p>
+    <w:p>
+      <w:pPr>
+        <w:spacing w:before="0" w:after="160"/>
         <w:jc w:val="left"/>
       </w:pPr>
       <w:r>
@@ -13,7 +27,315 @@
           <w:b w:val="0"/>
           <w:sz w:val="22"/>
         </w:rPr>
-        <w:t>June 13, 2026</w:t>
+        <w:t>Date: June 13, 2026</w:t>
+      </w:r>
+    </w:p>
+    <w:p>
+      <w:pPr>
+        <w:spacing w:before="0" w:after="40"/>
+        <w:jc w:val="left"/>
+      </w:pPr>
+      <w:r>
+        <w:rPr>
+          <w:rFonts w:ascii="Times New Roman" w:hAnsi="Times New Roman"/>
+          <w:b w:val="0"/>
+          <w:sz w:val="22"/>
+        </w:rPr>
+        <w:t>Internal Revenue Service</w:t>
+      </w:r>
+    </w:p>
+    <w:p>
+      <w:pPr>
+        <w:spacing w:before="0" w:after="40"/>
+        <w:jc w:val="left"/>
+      </w:pPr>
+      <w:r>
+        <w:rPr>
+          <w:rFonts w:ascii="Times New Roman" w:hAnsi="Times New Roman"/>
+          <w:b w:val="0"/>
+          <w:sz w:val="22"/>
+        </w:rPr>
+        <w:t>P.O. Box 309011, AMC 8236</w:t>
+      </w:r>
+    </w:p>
+    <w:p>
+      <w:pPr>
+        <w:spacing w:before="0" w:after="200"/>
+        <w:jc w:val="left"/>
+      </w:pPr>
+      <w:r>
+        <w:rPr>
+          <w:rFonts w:ascii="Times New Roman" w:hAnsi="Times New Roman"/>
+          <w:b w:val="0"/>
+          <w:sz w:val="22"/>
+        </w:rPr>
+        <w:t>Memphis, TN 38130-0911</w:t>
+      </w:r>
+    </w:p>
+    <w:p>
+      <w:pPr>
+        <w:spacing w:before="0" w:after="40"/>
+        <w:jc w:val="left"/>
+      </w:pPr>
+      <w:r>
+        <w:rPr>
+          <w:rFonts w:ascii="Courier New" w:hAnsi="Courier New"/>
+          <w:b w:val="0"/>
+          <w:sz w:val="18"/>
+        </w:rPr>
+        <w:t>------------------------------------------------------------------------</w:t>
+      </w:r>
+    </w:p>
+    <w:p>
+      <w:pPr>
+        <w:spacing w:before="0" w:after="120"/>
+        <w:jc w:val="left"/>
+      </w:pPr>
+      <w:r>
+        <w:rPr>
+          <w:rFonts w:ascii="Courier New" w:hAnsi="Courier New"/>
+          <w:b w:val="0"/>
+          <w:sz w:val="20"/>
+        </w:rPr>
+        <w:t>Re:     Response to LTR566T — Notice Date: May 18, 2026</w:t>
+      </w:r>
+    </w:p>
+    <w:p>
+      <w:pPr>
+        <w:spacing w:before="0" w:after="120"/>
+        <w:jc w:val="left"/>
+      </w:pPr>
+      <w:r>
+        <w:rPr>
+          <w:rFonts w:ascii="Courier New" w:hAnsi="Courier New"/>
+          <w:b w:val="0"/>
+          <w:sz w:val="20"/>
+        </w:rPr>
+        <w:t xml:space="preserve">        Taxpayer:   Eliana Machado de Almeida</w:t>
+      </w:r>
+    </w:p>
+    <w:p>
+      <w:pPr>
+        <w:spacing w:before="0" w:after="120"/>
+        <w:jc w:val="left"/>
+      </w:pPr>
+      <w:r>
+        <w:rPr>
+          <w:rFonts w:ascii="Courier New" w:hAnsi="Courier New"/>
+          <w:b w:val="0"/>
+          <w:sz w:val="20"/>
+        </w:rPr>
+        <w:t xml:space="preserve">        SSN:        697-75-6336</w:t>
+      </w:r>
+    </w:p>
+    <w:p>
+      <w:pPr>
+        <w:spacing w:before="0" w:after="120"/>
+        <w:jc w:val="left"/>
+      </w:pPr>
+      <w:r>
+        <w:rPr>
+          <w:rFonts w:ascii="Courier New" w:hAnsi="Courier New"/>
+          <w:b w:val="0"/>
+          <w:sz w:val="20"/>
+        </w:rPr>
+        <w:t xml:space="preserve">        Tax Year:   2024</w:t>
+      </w:r>
+    </w:p>
+    <w:p>
+      <w:pPr>
+        <w:spacing w:before="0" w:after="120"/>
+        <w:jc w:val="left"/>
+      </w:pPr>
+      <w:r>
+        <w:rPr>
+          <w:rFonts w:ascii="Courier New" w:hAnsi="Courier New"/>
+          <w:b w:val="0"/>
+          <w:sz w:val="20"/>
+        </w:rPr>
+        <w:t xml:space="preserve">        Notice:     LTR566T</w:t>
+      </w:r>
+    </w:p>
+    <w:p>
+      <w:pPr>
+        <w:spacing w:before="0" w:after="120"/>
+        <w:jc w:val="left"/>
+      </w:pPr>
+      <w:r>
+        <w:rPr>
+          <w:rFonts w:ascii="Courier New" w:hAnsi="Courier New"/>
+          <w:b w:val="0"/>
+          <w:sz w:val="20"/>
+        </w:rPr>
+        <w:t xml:space="preserve">        Project Code: 0417</w:t>
+      </w:r>
+    </w:p>
+    <w:p>
+      <w:pPr>
+        <w:spacing w:before="0" w:after="160"/>
+        <w:jc w:val="left"/>
+      </w:pPr>
+      <w:r>
+        <w:rPr>
+          <w:rFonts w:ascii="Courier New" w:hAnsi="Courier New"/>
+          <w:b w:val="0"/>
+          <w:sz w:val="18"/>
+        </w:rPr>
+        <w:t>------------------------------------------------------------------------</w:t>
+      </w:r>
+    </w:p>
+    <w:p>
+      <w:pPr>
+        <w:spacing w:before="0" w:after="160"/>
+        <w:jc w:val="left"/>
+      </w:pPr>
+      <w:r>
+        <w:rPr>
+          <w:rFonts w:ascii="Times New Roman" w:hAnsi="Times New Roman"/>
+          <w:b w:val="0"/>
+          <w:sz w:val="22"/>
+        </w:rPr>
+        <w:t>Dear IRS Examiner,</w:t>
+      </w:r>
+    </w:p>
+    <w:p>
+      <w:pPr>
+        <w:spacing w:before="0" w:after="160"/>
+        <w:jc w:val="left"/>
+      </w:pPr>
+      <w:r>
+        <w:rPr>
+          <w:rFonts w:ascii="Times New Roman" w:hAnsi="Times New Roman"/>
+          <w:b w:val="0"/>
+          <w:sz w:val="22"/>
+        </w:rPr>
+        <w:t>I, Eliana Machado de Almeida, am writing in response to the LTR566T dated May 18, 2026, regarding my 2024 Federal Income Tax Return (Form 1040), electronically filed on September 26, 2025 (Submission ID: XXXXXX2025269pe21o4g).</w:t>
+      </w:r>
+    </w:p>
+    <w:p>
+      <w:pPr>
+        <w:spacing w:before="0" w:after="80"/>
+        <w:jc w:val="left"/>
+      </w:pPr>
+      <w:r>
+        <w:rPr>
+          <w:rFonts w:ascii="Times New Roman" w:hAnsi="Times New Roman"/>
+          <w:b w:val="0"/>
+          <w:sz w:val="22"/>
+        </w:rPr>
+        <w:t>I understand that the IRS is reviewing two items on my return:</w:t>
+      </w:r>
+    </w:p>
+    <w:p>
+      <w:pPr>
+        <w:spacing w:before="0" w:after="40"/>
+        <w:jc w:val="left"/>
+      </w:pPr>
+      <w:r>
+        <w:rPr>
+          <w:rFonts w:ascii="Courier New" w:hAnsi="Courier New"/>
+          <w:b w:val="0"/>
+          <w:sz w:val="20"/>
+        </w:rPr>
+        <w:t xml:space="preserve">  (1)  Schedule A — Home Mortgage Interest (Form 1098)</w:t>
+      </w:r>
+    </w:p>
+    <w:p>
+      <w:pPr>
+        <w:spacing w:before="0" w:after="160"/>
+        <w:jc w:val="left"/>
+      </w:pPr>
+      <w:r>
+        <w:rPr>
+          <w:rFonts w:ascii="Courier New" w:hAnsi="Courier New"/>
+          <w:b w:val="0"/>
+          <w:sz w:val="20"/>
+        </w:rPr>
+        <w:t xml:space="preserve">  (2)  Form 8995 — Qualified Business Income (QBI) Deduction</w:t>
+      </w:r>
+    </w:p>
+    <w:p>
+      <w:pPr>
+        <w:spacing w:before="0" w:after="80"/>
+        <w:jc w:val="left"/>
+      </w:pPr>
+      <w:r>
+        <w:rPr>
+          <w:rFonts w:ascii="Times New Roman" w:hAnsi="Times New Roman"/>
+          <w:b w:val="0"/>
+          <w:sz w:val="22"/>
+        </w:rPr>
+        <w:t>Below I address each item with supporting documentation.</w:t>
+      </w:r>
+    </w:p>
+    <w:p>
+      <w:pPr>
+        <w:spacing w:before="80" w:after="40"/>
+        <w:jc w:val="left"/>
+      </w:pPr>
+      <w:r>
+        <w:rPr>
+          <w:rFonts w:ascii="Courier New" w:hAnsi="Courier New"/>
+          <w:b w:val="0"/>
+          <w:sz w:val="18"/>
+        </w:rPr>
+        <w:t>========================================================================</w:t>
+      </w:r>
+    </w:p>
+    <w:p>
+      <w:pPr>
+        <w:spacing w:before="40" w:after="40"/>
+        <w:jc w:val="left"/>
+      </w:pPr>
+      <w:r>
+        <w:rPr>
+          <w:rFonts w:ascii="Times New Roman" w:hAnsi="Times New Roman"/>
+          <w:b/>
+          <w:sz w:val="22"/>
+        </w:rPr>
+        <w:t>ITEM 1 — SCHEDULE A: HOME MORTGAGE INTEREST</w:t>
+      </w:r>
+    </w:p>
+    <w:p>
+      <w:pPr>
+        <w:spacing w:before="80" w:after="40"/>
+        <w:jc w:val="left"/>
+      </w:pPr>
+      <w:r>
+        <w:rPr>
+          <w:rFonts w:ascii="Courier New" w:hAnsi="Courier New"/>
+          <w:b w:val="0"/>
+          <w:sz w:val="18"/>
+        </w:rPr>
+        <w:t>========================================================================</w:t>
+      </w:r>
+    </w:p>
+    <w:p>
+      <w:pPr>
+        <w:spacing w:before="0" w:after="40"/>
+        <w:jc w:val="left"/>
+      </w:pPr>
+      <w:r>
+        <w:rPr>
+          <w:rFonts w:ascii="Times New Roman" w:hAnsi="Times New Roman"/>
+          <w:b w:val="0"/>
+          <w:sz w:val="22"/>
+        </w:rPr>
+        <w:t>My primary residence is located at:</w:t>
+      </w:r>
+    </w:p>
+    <w:p>
+      <w:pPr>
+        <w:spacing w:before="0" w:after="160"/>
+        <w:jc w:val="left"/>
+      </w:pPr>
+      <w:r>
+        <w:rPr>
+          <w:rFonts w:ascii="Courier New" w:hAnsi="Courier New"/>
+          <w:b w:val="0"/>
+          <w:sz w:val="20"/>
+        </w:rPr>
+        <w:t xml:space="preserve">  4 Lauras Way, Edgartown, MA 02539</w:t>
       </w:r>
     </w:p>
     <w:p>
@@ -27,6 +349,119 @@
           <w:b w:val="0"/>
           <w:sz w:val="22"/>
         </w:rPr>
+        <w:t>During tax year 2024, two lenders reported mortgage interest for this property:</w:t>
+      </w:r>
+    </w:p>
+    <w:p>
+      <w:pPr>
+        <w:spacing w:before="0" w:after="40"/>
+        <w:jc w:val="left"/>
+      </w:pPr>
+      <w:r>
+        <w:rPr>
+          <w:rFonts w:ascii="Courier New" w:hAnsi="Courier New"/>
+          <w:b w:val="0"/>
+          <w:sz w:val="20"/>
+        </w:rPr>
+        <w:t xml:space="preserve">  Lender 1: AmWest Funding Corp (originated 10/20/2023)</w:t>
+      </w:r>
+    </w:p>
+    <w:p>
+      <w:pPr>
+        <w:spacing w:before="0" w:after="40"/>
+        <w:jc w:val="left"/>
+      </w:pPr>
+      <w:r>
+        <w:rPr>
+          <w:rFonts w:ascii="Courier New" w:hAnsi="Courier New"/>
+          <w:b w:val="0"/>
+          <w:sz w:val="20"/>
+        </w:rPr>
+        <w:t xml:space="preserve">    Box 1 — Interest paid:              $  95,134.47</w:t>
+      </w:r>
+    </w:p>
+    <w:p>
+      <w:pPr>
+        <w:spacing w:before="0" w:after="120"/>
+        <w:jc w:val="left"/>
+      </w:pPr>
+      <w:r>
+        <w:rPr>
+          <w:rFonts w:ascii="Courier New" w:hAnsi="Courier New"/>
+          <w:b w:val="0"/>
+          <w:sz w:val="20"/>
+        </w:rPr>
+        <w:t xml:space="preserve">    Box 2 — Outstanding principal:      $1,039,488.45</w:t>
+      </w:r>
+    </w:p>
+    <w:p>
+      <w:pPr>
+        <w:spacing w:before="0" w:after="40"/>
+        <w:jc w:val="left"/>
+      </w:pPr>
+      <w:r>
+        <w:rPr>
+          <w:rFonts w:ascii="Courier New" w:hAnsi="Courier New"/>
+          <w:b w:val="0"/>
+          <w:sz w:val="20"/>
+        </w:rPr>
+        <w:t xml:space="preserve">  Lender 2: Radius Financial Group Inc. (originated 11/13/2024)</w:t>
+      </w:r>
+    </w:p>
+    <w:p>
+      <w:pPr>
+        <w:spacing w:before="0" w:after="40"/>
+        <w:jc w:val="left"/>
+      </w:pPr>
+      <w:r>
+        <w:rPr>
+          <w:rFonts w:ascii="Courier New" w:hAnsi="Courier New"/>
+          <w:b w:val="0"/>
+          <w:sz w:val="20"/>
+        </w:rPr>
+        <w:t xml:space="preserve">    Box 1 — Interest paid:              $   1,869.86</w:t>
+      </w:r>
+    </w:p>
+    <w:p>
+      <w:pPr>
+        <w:spacing w:before="0" w:after="120"/>
+        <w:jc w:val="left"/>
+      </w:pPr>
+      <w:r>
+        <w:rPr>
+          <w:rFonts w:ascii="Courier New" w:hAnsi="Courier New"/>
+          <w:b w:val="0"/>
+          <w:sz w:val="20"/>
+        </w:rPr>
+        <w:t xml:space="preserve">    Box 2 — Outstanding principal:      $  840,000.00</w:t>
+      </w:r>
+    </w:p>
+    <w:p>
+      <w:pPr>
+        <w:spacing w:before="0" w:after="200"/>
+        <w:jc w:val="left"/>
+      </w:pPr>
+      <w:r>
+        <w:rPr>
+          <w:rFonts w:ascii="Courier New" w:hAnsi="Courier New"/>
+          <w:b/>
+          <w:sz w:val="20"/>
+        </w:rPr>
+        <w:t xml:space="preserve">  Total interest from Forms 1098 (primary residence):  $ 97,004.33</w:t>
+      </w:r>
+    </w:p>
+    <w:p>
+      <w:pPr>
+        <w:spacing w:before="0" w:after="80"/>
+        <w:jc w:val="left"/>
+      </w:pPr>
+      <w:r>
+        <w:rPr>
+          <w:rFonts w:ascii="Times New Roman" w:hAnsi="Times New Roman"/>
+          <w:b/>
+          <w:sz w:val="22"/>
+        </w:rPr>
+        <w:t>TCJA LOAN LIMIT CALCULATION (Form 14900):</w:t>
       </w:r>
     </w:p>
     <w:p>
@@ -40,7 +475,161 @@
           <w:b w:val="0"/>
           <w:sz w:val="22"/>
         </w:rPr>
-        <w:t>Internal Revenue Service</w:t>
+        <w:t>Because both loans were originated after December 15, 2017, the deductible home mortgage interest is subject to the $750,000 qualified loan limit under IRC Section 163(h)(3)(F).</w:t>
+      </w:r>
+    </w:p>
+    <w:p>
+      <w:pPr>
+        <w:spacing w:before="0" w:after="80"/>
+        <w:jc w:val="left"/>
+      </w:pPr>
+      <w:r>
+        <w:rPr>
+          <w:rFonts w:ascii="Times New Roman" w:hAnsi="Times New Roman"/>
+          <w:b w:val="0"/>
+          <w:sz w:val="22"/>
+        </w:rPr>
+        <w:t>Applying the weighted-average balance method per IRS Publication 936:</w:t>
+      </w:r>
+    </w:p>
+    <w:p>
+      <w:pPr>
+        <w:spacing w:before="0" w:after="40"/>
+        <w:jc w:val="left"/>
+      </w:pPr>
+      <w:r>
+        <w:rPr>
+          <w:rFonts w:ascii="Courier New" w:hAnsi="Courier New"/>
+          <w:b w:val="0"/>
+          <w:sz w:val="20"/>
+        </w:rPr>
+        <w:t xml:space="preserve">  AmWest (319 days in 2024): $1,040,000 x (319/366) = $  906,449</w:t>
+      </w:r>
+    </w:p>
+    <w:p>
+      <w:pPr>
+        <w:spacing w:before="0" w:after="40"/>
+        <w:jc w:val="left"/>
+      </w:pPr>
+      <w:r>
+        <w:rPr>
+          <w:rFonts w:ascii="Courier New" w:hAnsi="Courier New"/>
+          <w:b w:val="0"/>
+          <w:sz w:val="20"/>
+        </w:rPr>
+        <w:t xml:space="preserve">  Radius  ( 47 days in 2024): $  840,000 x ( 47/366) = $  107,869</w:t>
+      </w:r>
+    </w:p>
+    <w:p>
+      <w:pPr>
+        <w:spacing w:before="0" w:after="80"/>
+        <w:jc w:val="left"/>
+      </w:pPr>
+      <w:r>
+        <w:rPr>
+          <w:rFonts w:ascii="Courier New" w:hAnsi="Courier New"/>
+          <w:b w:val="0"/>
+          <w:sz w:val="20"/>
+        </w:rPr>
+        <w:t xml:space="preserve">  Weighted average balance (Line 7):                    $  972,642</w:t>
+      </w:r>
+    </w:p>
+    <w:p>
+      <w:pPr>
+        <w:spacing w:before="0" w:after="40"/>
+        <w:jc w:val="left"/>
+      </w:pPr>
+      <w:r>
+        <w:rPr>
+          <w:rFonts w:ascii="Courier New" w:hAnsi="Courier New"/>
+          <w:b w:val="0"/>
+          <w:sz w:val="20"/>
+        </w:rPr>
+        <w:t xml:space="preserve">  Qualified loan limit (Line 11):                       $  750,000</w:t>
+      </w:r>
+    </w:p>
+    <w:p>
+      <w:pPr>
+        <w:spacing w:before="0" w:after="80"/>
+        <w:jc w:val="left"/>
+      </w:pPr>
+      <w:r>
+        <w:rPr>
+          <w:rFonts w:ascii="Courier New" w:hAnsi="Courier New"/>
+          <w:b w:val="0"/>
+          <w:sz w:val="20"/>
+        </w:rPr>
+        <w:t xml:space="preserve">  Limitation ratio (Line 14): $750,000 / $972,642  =       0.771</w:t>
+      </w:r>
+    </w:p>
+    <w:p>
+      <w:pPr>
+        <w:spacing w:before="0" w:after="40"/>
+        <w:jc w:val="left"/>
+      </w:pPr>
+      <w:r>
+        <w:rPr>
+          <w:rFonts w:ascii="Courier New" w:hAnsi="Courier New"/>
+          <w:b w:val="0"/>
+          <w:sz w:val="20"/>
+        </w:rPr>
+        <w:t xml:space="preserve">  Deductible home mortgage interest (Line 15):</w:t>
+      </w:r>
+    </w:p>
+    <w:p>
+      <w:pPr>
+        <w:spacing w:before="0" w:after="40"/>
+        <w:jc w:val="left"/>
+      </w:pPr>
+      <w:r>
+        <w:rPr>
+          <w:rFonts w:ascii="Courier New" w:hAnsi="Courier New"/>
+          <w:b/>
+          <w:sz w:val="20"/>
+        </w:rPr>
+        <w:t xml:space="preserve">    $97,004.33 x 0.771 =                               $  74,790.34</w:t>
+      </w:r>
+    </w:p>
+    <w:p>
+      <w:pPr>
+        <w:spacing w:before="0" w:after="120"/>
+        <w:jc w:val="left"/>
+      </w:pPr>
+      <w:r>
+        <w:rPr>
+          <w:rFonts w:ascii="Courier New" w:hAnsi="Courier New"/>
+          <w:b w:val="0"/>
+          <w:sz w:val="20"/>
+        </w:rPr>
+        <w:t xml:space="preserve">  Non-deductible portion (Line 16):                    $  22,213.99</w:t>
+      </w:r>
+    </w:p>
+    <w:p>
+      <w:pPr>
+        <w:spacing w:before="0" w:after="200"/>
+        <w:jc w:val="left"/>
+      </w:pPr>
+      <w:r>
+        <w:rPr>
+          <w:rFonts w:ascii="Times New Roman" w:hAnsi="Times New Roman"/>
+          <w:b w:val="0"/>
+          <w:sz w:val="22"/>
+        </w:rPr>
+        <w:t>The completed Form 14900 is enclosed with this response.</w:t>
+      </w:r>
+    </w:p>
+    <w:p>
+      <w:pPr>
+        <w:spacing w:before="0" w:after="80"/>
+        <w:jc w:val="left"/>
+      </w:pPr>
+      <w:r>
+        <w:rPr>
+          <w:rFonts w:ascii="Times New Roman" w:hAnsi="Times New Roman"/>
+          <w:b/>
+          <w:sz w:val="22"/>
+        </w:rPr>
+        <w:t>RENTAL PROPERTY MORTGAGE INTEREST (Schedule E):</w:t>
       </w:r>
     </w:p>
     <w:p>
@@ -54,7 +643,259 @@
           <w:b w:val="0"/>
           <w:sz w:val="22"/>
         </w:rPr>
-        <w:t>P.O. Box 309011, AMC 8236</w:t>
+        <w:t>I also own two rental properties with separate mortgage interest, reported exclusively on Schedule E and NOT included in Schedule A:</w:t>
+      </w:r>
+    </w:p>
+    <w:p>
+      <w:pPr>
+        <w:spacing w:before="0" w:after="40"/>
+        <w:jc w:val="left"/>
+      </w:pPr>
+      <w:r>
+        <w:rPr>
+          <w:rFonts w:ascii="Courier New" w:hAnsi="Courier New"/>
+          <w:b w:val="0"/>
+          <w:sz w:val="20"/>
+        </w:rPr>
+        <w:t xml:space="preserve">  27 Cormorant Circle, Edgartown, MA (Dovenmuehle Mortgage):</w:t>
+      </w:r>
+    </w:p>
+    <w:p>
+      <w:pPr>
+        <w:spacing w:before="0" w:after="80"/>
+        <w:jc w:val="left"/>
+      </w:pPr>
+      <w:r>
+        <w:rPr>
+          <w:rFonts w:ascii="Courier New" w:hAnsi="Courier New"/>
+          <w:b w:val="0"/>
+          <w:sz w:val="20"/>
+        </w:rPr>
+        <w:t xml:space="preserve">    Mortgage interest on Schedule E:  $ 33,397 (two loans: $16,880 + $16,517)</w:t>
+      </w:r>
+    </w:p>
+    <w:p>
+      <w:pPr>
+        <w:spacing w:before="0" w:after="40"/>
+        <w:jc w:val="left"/>
+      </w:pPr>
+      <w:r>
+        <w:rPr>
+          <w:rFonts w:ascii="Courier New" w:hAnsi="Courier New"/>
+          <w:b w:val="0"/>
+          <w:sz w:val="20"/>
+        </w:rPr>
+        <w:t xml:space="preserve">  7 Briarwood Dr, Edgartown, MA (Dovenmuehle Mortgage):</w:t>
+      </w:r>
+    </w:p>
+    <w:p>
+      <w:pPr>
+        <w:spacing w:before="0" w:after="120"/>
+        <w:jc w:val="left"/>
+      </w:pPr>
+      <w:r>
+        <w:rPr>
+          <w:rFonts w:ascii="Courier New" w:hAnsi="Courier New"/>
+          <w:b w:val="0"/>
+          <w:sz w:val="20"/>
+        </w:rPr>
+        <w:t xml:space="preserve">    Mortgage interest on Schedule E:  $ 14,292</w:t>
+      </w:r>
+    </w:p>
+    <w:p>
+      <w:pPr>
+        <w:spacing w:before="0" w:after="200"/>
+        <w:jc w:val="left"/>
+      </w:pPr>
+      <w:r>
+        <w:rPr>
+          <w:rFonts w:ascii="Times New Roman" w:hAnsi="Times New Roman"/>
+          <w:b w:val="0"/>
+          <w:sz w:val="22"/>
+        </w:rPr>
+        <w:t>There is no double-counting of rental mortgage interest on Schedule A.</w:t>
+      </w:r>
+    </w:p>
+    <w:p>
+      <w:pPr>
+        <w:spacing w:before="0" w:after="80"/>
+        <w:jc w:val="left"/>
+      </w:pPr>
+      <w:r>
+        <w:rPr>
+          <w:rFonts w:ascii="Times New Roman" w:hAnsi="Times New Roman"/>
+          <w:b/>
+          <w:sz w:val="22"/>
+        </w:rPr>
+        <w:t>CORRECTED SCHEDULE A — HOME MORTGAGE INTEREST:</w:t>
+      </w:r>
+    </w:p>
+    <w:p>
+      <w:pPr>
+        <w:spacing w:before="0" w:after="40"/>
+        <w:jc w:val="left"/>
+      </w:pPr>
+      <w:r>
+        <w:rPr>
+          <w:rFonts w:ascii="Courier New" w:hAnsi="Courier New"/>
+          <w:b/>
+          <w:sz w:val="20"/>
+        </w:rPr>
+        <w:t xml:space="preserve">  Home mortgage interest per Form 14900 (deductible):  $  74,790</w:t>
+      </w:r>
+    </w:p>
+    <w:p>
+      <w:pPr>
+        <w:spacing w:before="0" w:after="120"/>
+        <w:jc w:val="left"/>
+      </w:pPr>
+      <w:r>
+        <w:rPr>
+          <w:rFonts w:ascii="Courier New" w:hAnsi="Courier New"/>
+          <w:b w:val="0"/>
+          <w:sz w:val="20"/>
+        </w:rPr>
+        <w:t xml:space="preserve">  (Reduced from $114,034 as filed)</w:t>
+      </w:r>
+    </w:p>
+    <w:p>
+      <w:pPr>
+        <w:spacing w:before="0" w:after="200"/>
+        <w:jc w:val="left"/>
+      </w:pPr>
+      <w:r>
+        <w:rPr>
+          <w:rFonts w:ascii="Times New Roman" w:hAnsi="Times New Roman"/>
+          <w:b w:val="0"/>
+          <w:sz w:val="22"/>
+        </w:rPr>
+        <w:t>I acknowledge and accept the adjustment to the deductible home mortgage interest as calculated on the enclosed Form 14900.</w:t>
+      </w:r>
+    </w:p>
+    <w:p>
+      <w:pPr>
+        <w:spacing w:before="0" w:after="80"/>
+        <w:jc w:val="left"/>
+      </w:pPr>
+      <w:r>
+        <w:rPr>
+          <w:rFonts w:ascii="Times New Roman" w:hAnsi="Times New Roman"/>
+          <w:b/>
+          <w:sz w:val="22"/>
+        </w:rPr>
+        <w:t>Documents enclosed for Item 1:</w:t>
+      </w:r>
+    </w:p>
+    <w:p>
+      <w:pPr>
+        <w:spacing w:before="0" w:after="40"/>
+        <w:jc w:val="left"/>
+      </w:pPr>
+      <w:r>
+        <w:rPr>
+          <w:rFonts w:ascii="Courier New" w:hAnsi="Courier New"/>
+          <w:b w:val="0"/>
+          <w:sz w:val="20"/>
+        </w:rPr>
+        <w:t xml:space="preserve">  [X] Form 14900 — Worksheet for Qualified Loan Limit (completed)</w:t>
+      </w:r>
+    </w:p>
+    <w:p>
+      <w:pPr>
+        <w:spacing w:before="0" w:after="40"/>
+        <w:jc w:val="left"/>
+      </w:pPr>
+      <w:r>
+        <w:rPr>
+          <w:rFonts w:ascii="Courier New" w:hAnsi="Courier New"/>
+          <w:b w:val="0"/>
+          <w:sz w:val="20"/>
+        </w:rPr>
+        <w:t xml:space="preserve">  [X] Form 1098 — AmWest Funding Corp (4 Lauras Way — primary residence)</w:t>
+      </w:r>
+    </w:p>
+    <w:p>
+      <w:pPr>
+        <w:spacing w:before="0" w:after="40"/>
+        <w:jc w:val="left"/>
+      </w:pPr>
+      <w:r>
+        <w:rPr>
+          <w:rFonts w:ascii="Courier New" w:hAnsi="Courier New"/>
+          <w:b w:val="0"/>
+          <w:sz w:val="20"/>
+        </w:rPr>
+        <w:t xml:space="preserve">  [X] Form 1098 — Radius Financial Group Inc. (4 Lauras Way — primary residence)</w:t>
+      </w:r>
+    </w:p>
+    <w:p>
+      <w:pPr>
+        <w:spacing w:before="0" w:after="40"/>
+        <w:jc w:val="left"/>
+      </w:pPr>
+      <w:r>
+        <w:rPr>
+          <w:rFonts w:ascii="Courier New" w:hAnsi="Courier New"/>
+          <w:b w:val="0"/>
+          <w:sz w:val="20"/>
+        </w:rPr>
+        <w:t xml:space="preserve">  [X] Form 1098 — Dovenmuehle Mortgage (27 Cormorant Circle — Schedule E only)</w:t>
+      </w:r>
+    </w:p>
+    <w:p>
+      <w:pPr>
+        <w:spacing w:before="0" w:after="80"/>
+        <w:jc w:val="left"/>
+      </w:pPr>
+      <w:r>
+        <w:rPr>
+          <w:rFonts w:ascii="Courier New" w:hAnsi="Courier New"/>
+          <w:b w:val="0"/>
+          <w:sz w:val="20"/>
+        </w:rPr>
+        <w:t xml:space="preserve">  [X] Form 1098 — Dovenmuehle Mortgage (7 Briarwood Dr — Schedule E only)</w:t>
+      </w:r>
+    </w:p>
+    <w:p>
+      <w:pPr>
+        <w:spacing w:before="80" w:after="40"/>
+        <w:jc w:val="left"/>
+      </w:pPr>
+      <w:r>
+        <w:rPr>
+          <w:rFonts w:ascii="Courier New" w:hAnsi="Courier New"/>
+          <w:b w:val="0"/>
+          <w:sz w:val="18"/>
+        </w:rPr>
+        <w:t>========================================================================</w:t>
+      </w:r>
+    </w:p>
+    <w:p>
+      <w:pPr>
+        <w:spacing w:before="40" w:after="40"/>
+        <w:jc w:val="left"/>
+      </w:pPr>
+      <w:r>
+        <w:rPr>
+          <w:rFonts w:ascii="Times New Roman" w:hAnsi="Times New Roman"/>
+          <w:b/>
+          <w:sz w:val="22"/>
+        </w:rPr>
+        <w:t>ITEM 2 — FORM 8995: QUALIFIED BUSINESS INCOME (QBI) DEDUCTION</w:t>
+      </w:r>
+    </w:p>
+    <w:p>
+      <w:pPr>
+        <w:spacing w:before="80" w:after="40"/>
+        <w:jc w:val="left"/>
+      </w:pPr>
+      <w:r>
+        <w:rPr>
+          <w:rFonts w:ascii="Courier New" w:hAnsi="Courier New"/>
+          <w:b w:val="0"/>
+          <w:sz w:val="18"/>
+        </w:rPr>
+        <w:t>========================================================================</w:t>
       </w:r>
     </w:p>
     <w:p>
@@ -68,7 +909,133 @@
           <w:b w:val="0"/>
           <w:sz w:val="22"/>
         </w:rPr>
-        <w:t>Memphis, TN 38130-0911</w:t>
+        <w:t>The QBI deduction of $5,196 claimed on my return was calculated as follows:</w:t>
+      </w:r>
+    </w:p>
+    <w:p>
+      <w:pPr>
+        <w:spacing w:before="0" w:after="40"/>
+        <w:jc w:val="left"/>
+      </w:pPr>
+      <w:r>
+        <w:rPr>
+          <w:rFonts w:ascii="Courier New" w:hAnsi="Courier New"/>
+          <w:b w:val="0"/>
+          <w:sz w:val="20"/>
+        </w:rPr>
+        <w:t xml:space="preserve">  QBI Components:</w:t>
+      </w:r>
+    </w:p>
+    <w:p>
+      <w:pPr>
+        <w:spacing w:before="0" w:after="40"/>
+        <w:jc w:val="left"/>
+      </w:pPr>
+      <w:r>
+        <w:rPr>
+          <w:rFonts w:ascii="Courier New" w:hAnsi="Courier New"/>
+          <w:b w:val="0"/>
+          <w:sz w:val="20"/>
+        </w:rPr>
+        <w:t xml:space="preserve">    Schedule C — Housecleaning Service:    $  75,630</w:t>
+      </w:r>
+    </w:p>
+    <w:p>
+      <w:pPr>
+        <w:spacing w:before="0" w:after="40"/>
+        <w:jc w:val="left"/>
+      </w:pPr>
+      <w:r>
+        <w:rPr>
+          <w:rFonts w:ascii="Courier New" w:hAnsi="Courier New"/>
+          <w:b w:val="0"/>
+          <w:sz w:val="20"/>
+        </w:rPr>
+        <w:t xml:space="preserve">    Schedule E — 27 Cormorant Circle:      $  42,054</w:t>
+      </w:r>
+    </w:p>
+    <w:p>
+      <w:pPr>
+        <w:spacing w:before="0" w:after="40"/>
+        <w:jc w:val="left"/>
+      </w:pPr>
+      <w:r>
+        <w:rPr>
+          <w:rFonts w:ascii="Courier New" w:hAnsi="Courier New"/>
+          <w:b w:val="0"/>
+          <w:sz w:val="20"/>
+        </w:rPr>
+        <w:t xml:space="preserve">    Schedule E — 7 Briarwood Dr:           $  30,405</w:t>
+      </w:r>
+    </w:p>
+    <w:p>
+      <w:pPr>
+        <w:spacing w:before="0" w:after="80"/>
+        <w:jc w:val="left"/>
+      </w:pPr>
+      <w:r>
+        <w:rPr>
+          <w:rFonts w:ascii="Courier New" w:hAnsi="Courier New"/>
+          <w:b w:val="0"/>
+          <w:sz w:val="20"/>
+        </w:rPr>
+        <w:t xml:space="preserve">    Total QBI:                             $ 148,089</w:t>
+      </w:r>
+    </w:p>
+    <w:p>
+      <w:pPr>
+        <w:spacing w:before="0" w:after="80"/>
+        <w:jc w:val="left"/>
+      </w:pPr>
+      <w:r>
+        <w:rPr>
+          <w:rFonts w:ascii="Courier New" w:hAnsi="Courier New"/>
+          <w:b w:val="0"/>
+          <w:sz w:val="20"/>
+        </w:rPr>
+        <w:t xml:space="preserve">  Standard QBI deduction (20% x $148,089): $  29,618</w:t>
+      </w:r>
+    </w:p>
+    <w:p>
+      <w:pPr>
+        <w:spacing w:before="0" w:after="40"/>
+        <w:jc w:val="left"/>
+      </w:pPr>
+      <w:r>
+        <w:rPr>
+          <w:rFonts w:ascii="Courier New" w:hAnsi="Courier New"/>
+          <w:b w:val="0"/>
+          <w:sz w:val="20"/>
+        </w:rPr>
+        <w:t xml:space="preserve">  Income Limitation:</w:t>
+      </w:r>
+    </w:p>
+    <w:p>
+      <w:pPr>
+        <w:spacing w:before="0" w:after="40"/>
+        <w:jc w:val="left"/>
+      </w:pPr>
+      <w:r>
+        <w:rPr>
+          <w:rFonts w:ascii="Courier New" w:hAnsi="Courier New"/>
+          <w:b w:val="0"/>
+          <w:sz w:val="20"/>
+        </w:rPr>
+        <w:t xml:space="preserve">    Taxable income before QBI deduction:   $  25,980</w:t>
+      </w:r>
+    </w:p>
+    <w:p>
+      <w:pPr>
+        <w:spacing w:before="0" w:after="80"/>
+        <w:jc w:val="left"/>
+      </w:pPr>
+      <w:r>
+        <w:rPr>
+          <w:rFonts w:ascii="Courier New" w:hAnsi="Courier New"/>
+          <w:b w:val="0"/>
+          <w:sz w:val="20"/>
+        </w:rPr>
+        <w:t xml:space="preserve">    20% of taxable income:                 $   5,196</w:t>
       </w:r>
     </w:p>
     <w:p>
@@ -78,15 +1045,30 @@
       </w:pPr>
       <w:r>
         <w:rPr>
+          <w:rFonts w:ascii="Courier New" w:hAnsi="Courier New"/>
+          <w:b/>
+          <w:sz w:val="20"/>
+        </w:rPr>
+        <w:t xml:space="preserve">  QBI DEDUCTION ALLOWED (lesser amount):   $   5,196</w:t>
+      </w:r>
+    </w:p>
+    <w:p>
+      <w:pPr>
+        <w:spacing w:before="0" w:after="160"/>
+        <w:jc w:val="left"/>
+      </w:pPr>
+      <w:r>
+        <w:rPr>
           <w:rFonts w:ascii="Times New Roman" w:hAnsi="Times New Roman"/>
           <w:b w:val="0"/>
           <w:sz w:val="22"/>
         </w:rPr>
+        <w:t>The deduction is correctly limited to $5,196 by the taxable income limitation under IRC Section 199A(a). This deduction was calculated correctly as filed.</w:t>
       </w:r>
     </w:p>
     <w:p>
       <w:pPr>
-        <w:spacing w:before="0" w:after="120"/>
+        <w:spacing w:before="0" w:after="80"/>
         <w:jc w:val="left"/>
       </w:pPr>
       <w:r>
@@ -95,12 +1077,68 @@
           <w:b/>
           <w:sz w:val="22"/>
         </w:rPr>
-        <w:t>Re:     Response to Notice LTR566T</w:t>
+        <w:t>Documents enclosed for Item 2:</w:t>
       </w:r>
     </w:p>
     <w:p>
       <w:pPr>
-        <w:spacing w:before="0" w:after="120"/>
+        <w:spacing w:before="0" w:after="40"/>
+        <w:jc w:val="left"/>
+      </w:pPr>
+      <w:r>
+        <w:rPr>
+          <w:rFonts w:ascii="Courier New" w:hAnsi="Courier New"/>
+          <w:b w:val="0"/>
+          <w:sz w:val="20"/>
+        </w:rPr>
+        <w:t xml:space="preserve">  [X] Form 8995 — QBI Deduction Worksheet</w:t>
+      </w:r>
+    </w:p>
+    <w:p>
+      <w:pPr>
+        <w:spacing w:before="0" w:after="40"/>
+        <w:jc w:val="left"/>
+      </w:pPr>
+      <w:r>
+        <w:rPr>
+          <w:rFonts w:ascii="Courier New" w:hAnsi="Courier New"/>
+          <w:b w:val="0"/>
+          <w:sz w:val="20"/>
+        </w:rPr>
+        <w:t xml:space="preserve">  [X] Schedule C — Housecleaning Service net income</w:t>
+      </w:r>
+    </w:p>
+    <w:p>
+      <w:pPr>
+        <w:spacing w:before="0" w:after="80"/>
+        <w:jc w:val="left"/>
+      </w:pPr>
+      <w:r>
+        <w:rPr>
+          <w:rFonts w:ascii="Courier New" w:hAnsi="Courier New"/>
+          <w:b w:val="0"/>
+          <w:sz w:val="20"/>
+        </w:rPr>
+        <w:t xml:space="preserve">  [X] Schedule E — Rental income summary (both properties)</w:t>
+      </w:r>
+    </w:p>
+    <w:p>
+      <w:pPr>
+        <w:spacing w:before="80" w:after="40"/>
+        <w:jc w:val="left"/>
+      </w:pPr>
+      <w:r>
+        <w:rPr>
+          <w:rFonts w:ascii="Courier New" w:hAnsi="Courier New"/>
+          <w:b w:val="0"/>
+          <w:sz w:val="18"/>
+        </w:rPr>
+        <w:t>========================================================================</w:t>
+      </w:r>
+    </w:p>
+    <w:p>
+      <w:pPr>
+        <w:spacing w:before="120" w:after="160"/>
         <w:jc w:val="left"/>
       </w:pPr>
       <w:r>
@@ -109,530 +1147,12 @@
           <w:b w:val="0"/>
           <w:sz w:val="22"/>
         </w:rPr>
-        <w:t xml:space="preserve">        Taxpayer:       Eliana Machado de Almeida</w:t>
+        <w:t>I trust this response fully addresses the items raised in Notice LTR566T. Should you require additional information, please contact me at the address or phone number below.</w:t>
       </w:r>
     </w:p>
     <w:p>
       <w:pPr>
-        <w:spacing w:before="0" w:after="120"/>
-        <w:jc w:val="left"/>
-      </w:pPr>
-      <w:r>
-        <w:rPr>
-          <w:rFonts w:ascii="Times New Roman" w:hAnsi="Times New Roman"/>
-          <w:b w:val="0"/>
-          <w:sz w:val="22"/>
-        </w:rPr>
-        <w:t xml:space="preserve">        SSN:            697-75-6336</w:t>
-      </w:r>
-    </w:p>
-    <w:p>
-      <w:pPr>
-        <w:spacing w:before="0" w:after="120"/>
-        <w:jc w:val="left"/>
-      </w:pPr>
-      <w:r>
-        <w:rPr>
-          <w:rFonts w:ascii="Times New Roman" w:hAnsi="Times New Roman"/>
-          <w:b w:val="0"/>
-          <w:sz w:val="22"/>
-        </w:rPr>
-        <w:t xml:space="preserve">        Tax Year:       2024 (Form 1040)</w:t>
-      </w:r>
-    </w:p>
-    <w:p>
-      <w:pPr>
-        <w:spacing w:before="0" w:after="120"/>
-        <w:jc w:val="left"/>
-      </w:pPr>
-      <w:r>
-        <w:rPr>
-          <w:rFonts w:ascii="Times New Roman" w:hAnsi="Times New Roman"/>
-          <w:b w:val="0"/>
-          <w:sz w:val="22"/>
-        </w:rPr>
-        <w:t xml:space="preserve">        Notice Date:    May 18, 2026</w:t>
-      </w:r>
-    </w:p>
-    <w:p>
-      <w:pPr>
-        <w:spacing w:before="0" w:after="120"/>
-        <w:jc w:val="left"/>
-      </w:pPr>
-      <w:r>
-        <w:rPr>
-          <w:rFonts w:ascii="Times New Roman" w:hAnsi="Times New Roman"/>
-          <w:b w:val="0"/>
-          <w:sz w:val="22"/>
-        </w:rPr>
-        <w:t xml:space="preserve">        Project Code:   0417</w:t>
-      </w:r>
-    </w:p>
-    <w:p>
-      <w:pPr>
-        <w:spacing w:before="0" w:after="120"/>
-        <w:jc w:val="left"/>
-      </w:pPr>
-      <w:r>
-        <w:rPr>
-          <w:rFonts w:ascii="Times New Roman" w:hAnsi="Times New Roman"/>
-          <w:b w:val="0"/>
-          <w:sz w:val="22"/>
-        </w:rPr>
-      </w:r>
-    </w:p>
-    <w:p>
-      <w:pPr>
-        <w:spacing w:before="0" w:after="120"/>
-        <w:jc w:val="left"/>
-      </w:pPr>
-      <w:r>
-        <w:rPr>
-          <w:rFonts w:ascii="Times New Roman" w:hAnsi="Times New Roman"/>
-          <w:b w:val="0"/>
-          <w:sz w:val="22"/>
-        </w:rPr>
-        <w:t>Dear IRS Examiner,</w:t>
-      </w:r>
-    </w:p>
-    <w:p>
-      <w:pPr>
-        <w:spacing w:before="0" w:after="120"/>
-        <w:jc w:val="left"/>
-      </w:pPr>
-      <w:r>
-        <w:rPr>
-          <w:rFonts w:ascii="Times New Roman" w:hAnsi="Times New Roman"/>
-          <w:b w:val="0"/>
-          <w:sz w:val="22"/>
-        </w:rPr>
-      </w:r>
-    </w:p>
-    <w:p>
-      <w:pPr>
-        <w:spacing w:before="0" w:after="120"/>
-        <w:jc w:val="left"/>
-      </w:pPr>
-      <w:r>
-        <w:rPr>
-          <w:rFonts w:ascii="Times New Roman" w:hAnsi="Times New Roman"/>
-          <w:b w:val="0"/>
-          <w:sz w:val="22"/>
-        </w:rPr>
-        <w:t>I am writing in response to Notice LTR566T dated May 18, 2026, requesting additional information to support the following items claimed on my 2024 federal income tax return:</w:t>
-      </w:r>
-    </w:p>
-    <w:p>
-      <w:pPr>
-        <w:spacing w:before="0" w:after="120"/>
-        <w:jc w:val="left"/>
-      </w:pPr>
-      <w:r>
-        <w:rPr>
-          <w:rFonts w:ascii="Times New Roman" w:hAnsi="Times New Roman"/>
-          <w:b w:val="0"/>
-          <w:sz w:val="22"/>
-        </w:rPr>
-      </w:r>
-    </w:p>
-    <w:p>
-      <w:pPr>
-        <w:spacing w:before="0" w:after="120"/>
-        <w:jc w:val="left"/>
-      </w:pPr>
-      <w:r>
-        <w:rPr>
-          <w:rFonts w:ascii="Times New Roman" w:hAnsi="Times New Roman"/>
-          <w:b w:val="0"/>
-          <w:sz w:val="22"/>
-        </w:rPr>
-        <w:t xml:space="preserve">      •   Schedule A — Home Mortgage Interest (Form 1098)</w:t>
-      </w:r>
-    </w:p>
-    <w:p>
-      <w:pPr>
-        <w:spacing w:before="0" w:after="120"/>
-        <w:jc w:val="left"/>
-      </w:pPr>
-      <w:r>
-        <w:rPr>
-          <w:rFonts w:ascii="Times New Roman" w:hAnsi="Times New Roman"/>
-          <w:b w:val="0"/>
-          <w:sz w:val="22"/>
-        </w:rPr>
-        <w:t xml:space="preserve">      •   Qualified Business Income Deduction (Form 8995 / Form 14997)</w:t>
-      </w:r>
-    </w:p>
-    <w:p>
-      <w:pPr>
-        <w:spacing w:before="0" w:after="120"/>
-        <w:jc w:val="left"/>
-      </w:pPr>
-      <w:r>
-        <w:rPr>
-          <w:rFonts w:ascii="Times New Roman" w:hAnsi="Times New Roman"/>
-          <w:b w:val="0"/>
-          <w:sz w:val="22"/>
-        </w:rPr>
-      </w:r>
-    </w:p>
-    <w:p>
-      <w:pPr>
-        <w:spacing w:before="0" w:after="120"/>
-        <w:jc w:val="left"/>
-      </w:pPr>
-      <w:r>
-        <w:rPr>
-          <w:rFonts w:ascii="Times New Roman" w:hAnsi="Times New Roman"/>
-          <w:b w:val="0"/>
-          <w:sz w:val="22"/>
-        </w:rPr>
-        <w:t>Please find enclosed the documents requested to substantiate each item, as described below.</w:t>
-      </w:r>
-    </w:p>
-    <w:p>
-      <w:pPr>
-        <w:spacing w:before="0" w:after="120"/>
-        <w:jc w:val="left"/>
-      </w:pPr>
-      <w:r>
-        <w:rPr>
-          <w:rFonts w:ascii="Times New Roman" w:hAnsi="Times New Roman"/>
-          <w:b w:val="0"/>
-          <w:sz w:val="22"/>
-        </w:rPr>
-      </w:r>
-    </w:p>
-    <w:p>
-      <w:pPr>
-        <w:spacing w:before="0" w:after="120"/>
-        <w:jc w:val="left"/>
-      </w:pPr>
-      <w:r>
-        <w:rPr>
-          <w:rFonts w:ascii="Times New Roman" w:hAnsi="Times New Roman"/>
-          <w:b/>
-          <w:sz w:val="22"/>
-        </w:rPr>
-        <w:t>1.   SCHEDULE A — HOME MORTGAGE INTEREST</w:t>
-      </w:r>
-    </w:p>
-    <w:p>
-      <w:pPr>
-        <w:spacing w:before="0" w:after="120"/>
-        <w:jc w:val="left"/>
-      </w:pPr>
-      <w:r>
-        <w:rPr>
-          <w:rFonts w:ascii="Times New Roman" w:hAnsi="Times New Roman"/>
-          <w:b w:val="0"/>
-          <w:sz w:val="22"/>
-        </w:rPr>
-      </w:r>
-    </w:p>
-    <w:p>
-      <w:pPr>
-        <w:spacing w:before="0" w:after="120"/>
-        <w:jc w:val="left"/>
-      </w:pPr>
-      <w:r>
-        <w:rPr>
-          <w:rFonts w:ascii="Times New Roman" w:hAnsi="Times New Roman"/>
-          <w:b w:val="0"/>
-          <w:sz w:val="22"/>
-        </w:rPr>
-        <w:t>I deducted a total of $114,034 in mortgage interest on Schedule A of my 2024 Form 1040, as reported on Forms 1098 received from my lenders. This amount covers the mortgages on my primary residence and rental properties.</w:t>
-      </w:r>
-    </w:p>
-    <w:p>
-      <w:pPr>
-        <w:spacing w:before="0" w:after="120"/>
-        <w:jc w:val="left"/>
-      </w:pPr>
-      <w:r>
-        <w:rPr>
-          <w:rFonts w:ascii="Times New Roman" w:hAnsi="Times New Roman"/>
-          <w:b w:val="0"/>
-          <w:sz w:val="22"/>
-        </w:rPr>
-      </w:r>
-    </w:p>
-    <w:p>
-      <w:pPr>
-        <w:spacing w:before="0" w:after="120"/>
-        <w:jc w:val="left"/>
-      </w:pPr>
-      <w:r>
-        <w:rPr>
-          <w:rFonts w:ascii="Times New Roman" w:hAnsi="Times New Roman"/>
-          <w:b w:val="0"/>
-          <w:sz w:val="22"/>
-        </w:rPr>
-        <w:t>In response to Form 886-H-INT, I am enclosing the following:</w:t>
-      </w:r>
-    </w:p>
-    <w:p>
-      <w:pPr>
-        <w:spacing w:before="0" w:after="120"/>
-        <w:jc w:val="left"/>
-      </w:pPr>
-      <w:r>
-        <w:rPr>
-          <w:rFonts w:ascii="Times New Roman" w:hAnsi="Times New Roman"/>
-          <w:b w:val="0"/>
-          <w:sz w:val="22"/>
-        </w:rPr>
-      </w:r>
-    </w:p>
-    <w:p>
-      <w:pPr>
-        <w:spacing w:before="0" w:after="120"/>
-        <w:jc w:val="left"/>
-      </w:pPr>
-      <w:r>
-        <w:rPr>
-          <w:rFonts w:ascii="Times New Roman" w:hAnsi="Times New Roman"/>
-          <w:b w:val="0"/>
-          <w:sz w:val="22"/>
-        </w:rPr>
-        <w:t xml:space="preserve">      [X]  Forms 1098 — Annual Mortgage Interest Statements for all loans, showing interest paid, and beginning and ending principal balances</w:t>
-      </w:r>
-    </w:p>
-    <w:p>
-      <w:pPr>
-        <w:spacing w:before="0" w:after="120"/>
-        <w:jc w:val="left"/>
-      </w:pPr>
-      <w:r>
-        <w:rPr>
-          <w:rFonts w:ascii="Times New Roman" w:hAnsi="Times New Roman"/>
-          <w:b w:val="0"/>
-          <w:sz w:val="22"/>
-        </w:rPr>
-        <w:t xml:space="preserve">      [X]  Original loan agreements / mortgage contracts for each loan</w:t>
-      </w:r>
-    </w:p>
-    <w:p>
-      <w:pPr>
-        <w:spacing w:before="0" w:after="120"/>
-        <w:jc w:val="left"/>
-      </w:pPr>
-      <w:r>
-        <w:rPr>
-          <w:rFonts w:ascii="Times New Roman" w:hAnsi="Times New Roman"/>
-          <w:b w:val="0"/>
-          <w:sz w:val="22"/>
-        </w:rPr>
-        <w:t xml:space="preserve">      [X]  Form HUD-1 Settlement Statements for each property</w:t>
-      </w:r>
-    </w:p>
-    <w:p>
-      <w:pPr>
-        <w:spacing w:before="0" w:after="120"/>
-        <w:jc w:val="left"/>
-      </w:pPr>
-      <w:r>
-        <w:rPr>
-          <w:rFonts w:ascii="Times New Roman" w:hAnsi="Times New Roman"/>
-          <w:b w:val="0"/>
-          <w:sz w:val="22"/>
-        </w:rPr>
-        <w:t xml:space="preserve">      [X]  Completed Form 14900 — Worksheet for Qualified Loan Limit and Deductible Home Mortgage Interest</w:t>
-      </w:r>
-    </w:p>
-    <w:p>
-      <w:pPr>
-        <w:spacing w:before="0" w:after="120"/>
-        <w:jc w:val="left"/>
-      </w:pPr>
-      <w:r>
-        <w:rPr>
-          <w:rFonts w:ascii="Times New Roman" w:hAnsi="Times New Roman"/>
-          <w:b w:val="0"/>
-          <w:sz w:val="22"/>
-        </w:rPr>
-      </w:r>
-    </w:p>
-    <w:p>
-      <w:pPr>
-        <w:spacing w:before="0" w:after="120"/>
-        <w:jc w:val="left"/>
-      </w:pPr>
-      <w:r>
-        <w:rPr>
-          <w:rFonts w:ascii="Times New Roman" w:hAnsi="Times New Roman"/>
-          <w:b/>
-          <w:sz w:val="22"/>
-        </w:rPr>
-        <w:t>2.   QUALIFIED BUSINESS INCOME DEDUCTION — FORM 8995</w:t>
-      </w:r>
-    </w:p>
-    <w:p>
-      <w:pPr>
-        <w:spacing w:before="0" w:after="120"/>
-        <w:jc w:val="left"/>
-      </w:pPr>
-      <w:r>
-        <w:rPr>
-          <w:rFonts w:ascii="Times New Roman" w:hAnsi="Times New Roman"/>
-          <w:b w:val="0"/>
-          <w:sz w:val="22"/>
-        </w:rPr>
-      </w:r>
-    </w:p>
-    <w:p>
-      <w:pPr>
-        <w:spacing w:before="0" w:after="120"/>
-        <w:jc w:val="left"/>
-      </w:pPr>
-      <w:r>
-        <w:rPr>
-          <w:rFonts w:ascii="Times New Roman" w:hAnsi="Times New Roman"/>
-          <w:b w:val="0"/>
-          <w:sz w:val="22"/>
-        </w:rPr>
-        <w:t>I claimed a Qualified Business Income Deduction (QBID) of $5,196 on my 2024 Form 1040, calculated on Form 8995. The deduction was limited by my taxable income (20% x $25,980 = $5,196) and is based on income from my housecleaning sole proprietorship (Schedule C) and rental properties (Schedule E).</w:t>
-      </w:r>
-    </w:p>
-    <w:p>
-      <w:pPr>
-        <w:spacing w:before="0" w:after="120"/>
-        <w:jc w:val="left"/>
-      </w:pPr>
-      <w:r>
-        <w:rPr>
-          <w:rFonts w:ascii="Times New Roman" w:hAnsi="Times New Roman"/>
-          <w:b w:val="0"/>
-          <w:sz w:val="22"/>
-        </w:rPr>
-      </w:r>
-    </w:p>
-    <w:p>
-      <w:pPr>
-        <w:spacing w:before="0" w:after="120"/>
-        <w:jc w:val="left"/>
-      </w:pPr>
-      <w:r>
-        <w:rPr>
-          <w:rFonts w:ascii="Times New Roman" w:hAnsi="Times New Roman"/>
-          <w:b w:val="0"/>
-          <w:sz w:val="22"/>
-        </w:rPr>
-        <w:t>In response to Form 14997, I am enclosing the following:</w:t>
-      </w:r>
-    </w:p>
-    <w:p>
-      <w:pPr>
-        <w:spacing w:before="0" w:after="120"/>
-        <w:jc w:val="left"/>
-      </w:pPr>
-      <w:r>
-        <w:rPr>
-          <w:rFonts w:ascii="Times New Roman" w:hAnsi="Times New Roman"/>
-          <w:b w:val="0"/>
-          <w:sz w:val="22"/>
-        </w:rPr>
-      </w:r>
-    </w:p>
-    <w:p>
-      <w:pPr>
-        <w:spacing w:before="0" w:after="120"/>
-        <w:jc w:val="left"/>
-      </w:pPr>
-      <w:r>
-        <w:rPr>
-          <w:rFonts w:ascii="Times New Roman" w:hAnsi="Times New Roman"/>
-          <w:b w:val="0"/>
-          <w:sz w:val="22"/>
-        </w:rPr>
-        <w:t xml:space="preserve">      [X]  Copy of Form 8995 — Qualified Business Income Deduction (as filed)</w:t>
-      </w:r>
-    </w:p>
-    <w:p>
-      <w:pPr>
-        <w:spacing w:before="0" w:after="120"/>
-        <w:jc w:val="left"/>
-      </w:pPr>
-      <w:r>
-        <w:rPr>
-          <w:rFonts w:ascii="Times New Roman" w:hAnsi="Times New Roman"/>
-          <w:b w:val="0"/>
-          <w:sz w:val="22"/>
-        </w:rPr>
-        <w:t xml:space="preserve">      [X]  Schedule C — Net profit from housecleaning business: $81,379</w:t>
-      </w:r>
-    </w:p>
-    <w:p>
-      <w:pPr>
-        <w:spacing w:before="0" w:after="120"/>
-        <w:jc w:val="left"/>
-      </w:pPr>
-      <w:r>
-        <w:rPr>
-          <w:rFonts w:ascii="Times New Roman" w:hAnsi="Times New Roman"/>
-          <w:b w:val="0"/>
-          <w:sz w:val="22"/>
-        </w:rPr>
-        <w:t xml:space="preserve">      [X]  Schedule E — Net rental income: $72,459 (two properties)</w:t>
-      </w:r>
-    </w:p>
-    <w:p>
-      <w:pPr>
-        <w:spacing w:before="0" w:after="120"/>
-        <w:jc w:val="left"/>
-      </w:pPr>
-      <w:r>
-        <w:rPr>
-          <w:rFonts w:ascii="Times New Roman" w:hAnsi="Times New Roman"/>
-          <w:b w:val="0"/>
-          <w:sz w:val="22"/>
-        </w:rPr>
-        <w:t xml:space="preserve">      [X]  Detailed QBI calculation statement showing income components and income limitation applied</w:t>
-      </w:r>
-    </w:p>
-    <w:p>
-      <w:pPr>
-        <w:spacing w:before="0" w:after="120"/>
-        <w:jc w:val="left"/>
-      </w:pPr>
-      <w:r>
-        <w:rPr>
-          <w:rFonts w:ascii="Times New Roman" w:hAnsi="Times New Roman"/>
-          <w:b w:val="0"/>
-          <w:sz w:val="22"/>
-        </w:rPr>
-      </w:r>
-    </w:p>
-    <w:p>
-      <w:pPr>
-        <w:spacing w:before="0" w:after="120"/>
-        <w:jc w:val="left"/>
-      </w:pPr>
-      <w:r>
-        <w:rPr>
-          <w:rFonts w:ascii="Times New Roman" w:hAnsi="Times New Roman"/>
-          <w:b w:val="0"/>
-          <w:sz w:val="22"/>
-        </w:rPr>
-        <w:t>I trust these documents fully address the items raised in Notice LTR566T. Should you need any additional information, please do not hesitate to contact me.</w:t>
-      </w:r>
-    </w:p>
-    <w:p>
-      <w:pPr>
-        <w:spacing w:before="0" w:after="120"/>
-        <w:jc w:val="left"/>
-      </w:pPr>
-      <w:r>
-        <w:rPr>
-          <w:rFonts w:ascii="Times New Roman" w:hAnsi="Times New Roman"/>
-          <w:b w:val="0"/>
-          <w:sz w:val="22"/>
-        </w:rPr>
-      </w:r>
-    </w:p>
-    <w:p>
-      <w:pPr>
-        <w:spacing w:before="0" w:after="120"/>
+        <w:spacing w:before="0" w:after="320"/>
         <w:jc w:val="left"/>
       </w:pPr>
       <w:r>
@@ -646,33 +1166,7 @@
     </w:p>
     <w:p>
       <w:pPr>
-        <w:spacing w:before="0" w:after="120"/>
-        <w:jc w:val="left"/>
-      </w:pPr>
-      <w:r>
-        <w:rPr>
-          <w:rFonts w:ascii="Times New Roman" w:hAnsi="Times New Roman"/>
-          <w:b w:val="0"/>
-          <w:sz w:val="22"/>
-        </w:rPr>
-      </w:r>
-    </w:p>
-    <w:p>
-      <w:pPr>
-        <w:spacing w:before="0" w:after="120"/>
-        <w:jc w:val="left"/>
-      </w:pPr>
-      <w:r>
-        <w:rPr>
-          <w:rFonts w:ascii="Times New Roman" w:hAnsi="Times New Roman"/>
-          <w:b w:val="0"/>
-          <w:sz w:val="22"/>
-        </w:rPr>
-      </w:r>
-    </w:p>
-    <w:p>
-      <w:pPr>
-        <w:spacing w:before="0" w:after="120"/>
+        <w:spacing w:before="0" w:after="720"/>
         <w:jc w:val="left"/>
       </w:pPr>
       <w:r>
@@ -686,7 +1180,21 @@
     </w:p>
     <w:p>
       <w:pPr>
-        <w:spacing w:before="0" w:after="120"/>
+        <w:spacing w:before="0" w:after="40"/>
+        <w:jc w:val="left"/>
+      </w:pPr>
+      <w:r>
+        <w:rPr>
+          <w:rFonts w:ascii="Courier New" w:hAnsi="Courier New"/>
+          <w:b w:val="0"/>
+          <w:sz w:val="20"/>
+        </w:rPr>
+        <w:t>_________________________________        Date: ________________</w:t>
+      </w:r>
+    </w:p>
+    <w:p>
+      <w:pPr>
+        <w:spacing w:before="0" w:after="40"/>
         <w:jc w:val="left"/>
       </w:pPr>
       <w:r>
@@ -695,65 +1203,12 @@
           <w:b w:val="0"/>
           <w:sz w:val="22"/>
         </w:rPr>
-      </w:r>
-    </w:p>
-    <w:p>
-      <w:pPr>
-        <w:spacing w:before="0" w:after="120"/>
-        <w:jc w:val="left"/>
-      </w:pPr>
-      <w:r>
-        <w:rPr>
-          <w:rFonts w:ascii="Times New Roman" w:hAnsi="Times New Roman"/>
-          <w:b w:val="0"/>
-          <w:sz w:val="22"/>
-        </w:rPr>
-      </w:r>
-    </w:p>
-    <w:p>
-      <w:pPr>
-        <w:spacing w:before="0" w:after="120"/>
-        <w:jc w:val="left"/>
-      </w:pPr>
-      <w:r>
-        <w:rPr>
-          <w:rFonts w:ascii="Times New Roman" w:hAnsi="Times New Roman"/>
-          <w:b w:val="0"/>
-          <w:sz w:val="22"/>
-        </w:rPr>
-      </w:r>
-    </w:p>
-    <w:p>
-      <w:pPr>
-        <w:spacing w:before="0" w:after="120"/>
-        <w:jc w:val="left"/>
-      </w:pPr>
-      <w:r>
-        <w:rPr>
-          <w:rFonts w:ascii="Times New Roman" w:hAnsi="Times New Roman"/>
-          <w:b w:val="0"/>
-          <w:sz w:val="22"/>
-        </w:rPr>
-        <w:t>_________________________________        Date: ________________</w:t>
-      </w:r>
-    </w:p>
-    <w:p>
-      <w:pPr>
-        <w:spacing w:before="0" w:after="120"/>
-        <w:jc w:val="left"/>
-      </w:pPr>
-      <w:r>
-        <w:rPr>
-          <w:rFonts w:ascii="Times New Roman" w:hAnsi="Times New Roman"/>
-          <w:b/>
-          <w:sz w:val="22"/>
-        </w:rPr>
         <w:t>Eliana Machado de Almeida</w:t>
       </w:r>
     </w:p>
     <w:p>
       <w:pPr>
-        <w:spacing w:before="0" w:after="120"/>
+        <w:spacing w:before="0" w:after="40"/>
         <w:jc w:val="left"/>
       </w:pPr>
       <w:r>
@@ -767,7 +1222,7 @@
     </w:p>
     <w:p>
       <w:pPr>
-        <w:spacing w:before="0" w:after="120"/>
+        <w:spacing w:before="0" w:after="40"/>
         <w:jc w:val="left"/>
       </w:pPr>
       <w:r>
@@ -781,7 +1236,7 @@
     </w:p>
     <w:p>
       <w:pPr>
-        <w:spacing w:before="0" w:after="120"/>
+        <w:spacing w:before="0" w:after="40"/>
         <w:jc w:val="left"/>
       </w:pPr>
       <w:r>
@@ -795,7 +1250,7 @@
     </w:p>
     <w:p>
       <w:pPr>
-        <w:spacing w:before="0" w:after="120"/>
+        <w:spacing w:before="0" w:after="80"/>
         <w:jc w:val="left"/>
       </w:pPr>
       <w:r>
@@ -805,6 +1260,20 @@
           <w:sz w:val="22"/>
         </w:rPr>
         <w:t>Email: elly_usa@hotmail.com</w:t>
+      </w:r>
+    </w:p>
+    <w:p>
+      <w:pPr>
+        <w:spacing w:before="80" w:after="40"/>
+        <w:jc w:val="left"/>
+      </w:pPr>
+      <w:r>
+        <w:rPr>
+          <w:rFonts w:ascii="Courier New" w:hAnsi="Courier New"/>
+          <w:b w:val="0"/>
+          <w:sz w:val="18"/>
+        </w:rPr>
+        <w:t>========================================================================</w:t>
       </w:r>
     </w:p>
     <w:sectPr>

</xml_diff>

<commit_message>
Simplify response letter to cover letter only with Exhibit A (Form 14900)
https://claude.ai/code/session_019pk3CFrfADSxNgg23VPbbZ
</commit_message>
<xml_diff>
--- a/IRS_LTR566T_Response_Eliana_Machado_2024.docx
+++ b/IRS_LTR566T_Response_Eliana_Machado_2024.docx
@@ -4,21 +4,7 @@
   <w:body>
     <w:p>
       <w:pPr>
-        <w:spacing w:before="0" w:after="240"/>
-        <w:jc w:val="center"/>
-      </w:pPr>
-      <w:r>
-        <w:rPr>
-          <w:rFonts w:ascii="Times New Roman" w:hAnsi="Times New Roman"/>
-          <w:b/>
-          <w:sz w:val="28"/>
-        </w:rPr>
-        <w:t>RESPONSE TO IRS NOTICE LTR566T</w:t>
-      </w:r>
-    </w:p>
-    <w:p>
-      <w:pPr>
-        <w:spacing w:before="0" w:after="160"/>
+        <w:spacing w:before="0" w:after="200"/>
         <w:jc w:val="left"/>
       </w:pPr>
       <w:r>
@@ -83,12 +69,12 @@
           <w:b w:val="0"/>
           <w:sz w:val="18"/>
         </w:rPr>
-        <w:t>------------------------------------------------------------------------</w:t>
+        <w:t>--------------------------------------------------------------------</w:t>
       </w:r>
     </w:p>
     <w:p>
       <w:pPr>
-        <w:spacing w:before="0" w:after="120"/>
+        <w:spacing w:before="0" w:after="40"/>
         <w:jc w:val="left"/>
       </w:pPr>
       <w:r>
@@ -102,7 +88,7 @@
     </w:p>
     <w:p>
       <w:pPr>
-        <w:spacing w:before="0" w:after="120"/>
+        <w:spacing w:before="0" w:after="40"/>
         <w:jc w:val="left"/>
       </w:pPr>
       <w:r>
@@ -116,7 +102,7 @@
     </w:p>
     <w:p>
       <w:pPr>
-        <w:spacing w:before="0" w:after="120"/>
+        <w:spacing w:before="0" w:after="40"/>
         <w:jc w:val="left"/>
       </w:pPr>
       <w:r>
@@ -130,7 +116,7 @@
     </w:p>
     <w:p>
       <w:pPr>
-        <w:spacing w:before="0" w:after="120"/>
+        <w:spacing w:before="0" w:after="40"/>
         <w:jc w:val="left"/>
       </w:pPr>
       <w:r>
@@ -144,21 +130,7 @@
     </w:p>
     <w:p>
       <w:pPr>
-        <w:spacing w:before="0" w:after="120"/>
-        <w:jc w:val="left"/>
-      </w:pPr>
-      <w:r>
-        <w:rPr>
-          <w:rFonts w:ascii="Courier New" w:hAnsi="Courier New"/>
-          <w:b w:val="0"/>
-          <w:sz w:val="20"/>
-        </w:rPr>
-        <w:t xml:space="preserve">        Notice:     LTR566T</w:t>
-      </w:r>
-    </w:p>
-    <w:p>
-      <w:pPr>
-        <w:spacing w:before="0" w:after="120"/>
+        <w:spacing w:before="0" w:after="40"/>
         <w:jc w:val="left"/>
       </w:pPr>
       <w:r>
@@ -172,7 +144,7 @@
     </w:p>
     <w:p>
       <w:pPr>
-        <w:spacing w:before="0" w:after="160"/>
+        <w:spacing w:before="0" w:after="200"/>
         <w:jc w:val="left"/>
       </w:pPr>
       <w:r>
@@ -181,12 +153,12 @@
           <w:b w:val="0"/>
           <w:sz w:val="18"/>
         </w:rPr>
-        <w:t>------------------------------------------------------------------------</w:t>
+        <w:t>--------------------------------------------------------------------</w:t>
       </w:r>
     </w:p>
     <w:p>
       <w:pPr>
-        <w:spacing w:before="0" w:after="160"/>
+        <w:spacing w:before="0" w:after="200"/>
         <w:jc w:val="left"/>
       </w:pPr>
       <w:r>
@@ -200,7 +172,7 @@
     </w:p>
     <w:p>
       <w:pPr>
-        <w:spacing w:before="0" w:after="160"/>
+        <w:spacing w:before="0" w:after="200"/>
         <w:jc w:val="left"/>
       </w:pPr>
       <w:r>
@@ -209,7 +181,143 @@
           <w:b w:val="0"/>
           <w:sz w:val="22"/>
         </w:rPr>
-        <w:t>I, Eliana Machado de Almeida, am writing in response to the LTR566T dated May 18, 2026, regarding my 2024 Federal Income Tax Return (Form 1040), electronically filed on September 26, 2025 (Submission ID: XXXXXX2025269pe21o4g).</w:t>
+        <w:t>I am writing in response to Notice LTR566T dated May 18, 2026, regarding my 2024 Federal Income Tax Return.</w:t>
+      </w:r>
+    </w:p>
+    <w:p>
+      <w:pPr>
+        <w:spacing w:before="0" w:after="200"/>
+        <w:jc w:val="left"/>
+      </w:pPr>
+      <w:r>
+        <w:rPr>
+          <w:rFonts w:ascii="Times New Roman" w:hAnsi="Times New Roman"/>
+          <w:b w:val="0"/>
+          <w:sz w:val="22"/>
+        </w:rPr>
+        <w:t>In response to the request for documentation supporting my home mortgage interest deduction (Schedule A), I have completed the enclosed Form 14900 — Worksheet for Qualified Loan Limit and Deductible Home Mortgage Interest (Exhibit A).</w:t>
+      </w:r>
+    </w:p>
+    <w:p>
+      <w:pPr>
+        <w:spacing w:before="0" w:after="200"/>
+        <w:jc w:val="left"/>
+      </w:pPr>
+      <w:r>
+        <w:rPr>
+          <w:rFonts w:ascii="Times New Roman" w:hAnsi="Times New Roman"/>
+          <w:b w:val="0"/>
+          <w:sz w:val="22"/>
+        </w:rPr>
+        <w:t>As shown on the enclosed Form 14900, my two home mortgage loans (4 Lauras Way, Edgartown, MA 02539) were both originated after December 15, 2017, and are subject to the $750,000 qualified loan limit under IRC Section 163(h)(3)(F).</w:t>
+      </w:r>
+    </w:p>
+    <w:p>
+      <w:pPr>
+        <w:spacing w:before="0" w:after="240"/>
+        <w:jc w:val="left"/>
+      </w:pPr>
+      <w:r>
+        <w:rPr>
+          <w:rFonts w:ascii="Times New Roman" w:hAnsi="Times New Roman"/>
+          <w:b w:val="0"/>
+          <w:sz w:val="22"/>
+        </w:rPr>
+        <w:t>The corrected deductible home mortgage interest for tax year 2024 is $74,790.34, as calculated on Form 14900 (Line 15).</w:t>
+      </w:r>
+    </w:p>
+    <w:p>
+      <w:pPr>
+        <w:spacing w:before="0" w:after="120"/>
+        <w:jc w:val="left"/>
+      </w:pPr>
+      <w:r>
+        <w:rPr>
+          <w:rFonts w:ascii="Times New Roman" w:hAnsi="Times New Roman"/>
+          <w:b/>
+          <w:sz w:val="22"/>
+        </w:rPr>
+        <w:t>The following documents are enclosed:</w:t>
+      </w:r>
+    </w:p>
+    <w:p>
+      <w:pPr>
+        <w:spacing w:before="0" w:after="60"/>
+        <w:jc w:val="left"/>
+      </w:pPr>
+      <w:r>
+        <w:rPr>
+          <w:rFonts w:ascii="Courier New" w:hAnsi="Courier New"/>
+          <w:b w:val="0"/>
+          <w:sz w:val="20"/>
+        </w:rPr>
+        <w:t xml:space="preserve">  Exhibit A  —  Form 14900 (Worksheet for Qualified Loan Limit,</w:t>
+        <w:br/>
+        <w:t xml:space="preserve">              completed for tax year 2024)</w:t>
+      </w:r>
+    </w:p>
+    <w:p>
+      <w:pPr>
+        <w:spacing w:before="0" w:after="60"/>
+        <w:jc w:val="left"/>
+      </w:pPr>
+      <w:r>
+        <w:rPr>
+          <w:rFonts w:ascii="Courier New" w:hAnsi="Courier New"/>
+          <w:b w:val="0"/>
+          <w:sz w:val="20"/>
+        </w:rPr>
+        <w:t xml:space="preserve">  Exhibit B  —  Form 1098, AmWest Funding Corp</w:t>
+        <w:br/>
+        <w:t xml:space="preserve">              (4 Lauras Way — interest paid: $95,134.47)</w:t>
+      </w:r>
+    </w:p>
+    <w:p>
+      <w:pPr>
+        <w:spacing w:before="0" w:after="60"/>
+        <w:jc w:val="left"/>
+      </w:pPr>
+      <w:r>
+        <w:rPr>
+          <w:rFonts w:ascii="Courier New" w:hAnsi="Courier New"/>
+          <w:b w:val="0"/>
+          <w:sz w:val="20"/>
+        </w:rPr>
+        <w:t xml:space="preserve">  Exhibit C  —  Form 1098, Radius Financial Group Inc.</w:t>
+        <w:br/>
+        <w:t xml:space="preserve">              (4 Lauras Way — interest paid: $1,869.86)</w:t>
+      </w:r>
+    </w:p>
+    <w:p>
+      <w:pPr>
+        <w:spacing w:before="0" w:after="60"/>
+        <w:jc w:val="left"/>
+      </w:pPr>
+      <w:r>
+        <w:rPr>
+          <w:rFonts w:ascii="Courier New" w:hAnsi="Courier New"/>
+          <w:b w:val="0"/>
+          <w:sz w:val="20"/>
+        </w:rPr>
+        <w:t xml:space="preserve">  Exhibit D  —  Form 1098, Dovenmuehle Mortgage</w:t>
+        <w:br/>
+        <w:t xml:space="preserve">              (27 Cormorant Circle — Schedule E rental property)</w:t>
+      </w:r>
+    </w:p>
+    <w:p>
+      <w:pPr>
+        <w:spacing w:before="0" w:after="60"/>
+        <w:jc w:val="left"/>
+      </w:pPr>
+      <w:r>
+        <w:rPr>
+          <w:rFonts w:ascii="Courier New" w:hAnsi="Courier New"/>
+          <w:b w:val="0"/>
+          <w:sz w:val="20"/>
+        </w:rPr>
+        <w:t xml:space="preserve">  Exhibit E  —  Form 1098, Dovenmuehle Mortgage</w:t>
+        <w:br/>
+        <w:t xml:space="preserve">              (7 Briarwood Dr — Schedule E rental property)</w:t>
       </w:r>
     </w:p>
     <w:p>
@@ -223,931 +331,6 @@
           <w:b w:val="0"/>
           <w:sz w:val="22"/>
         </w:rPr>
-        <w:t>I understand that the IRS is reviewing two items on my return:</w:t>
-      </w:r>
-    </w:p>
-    <w:p>
-      <w:pPr>
-        <w:spacing w:before="0" w:after="40"/>
-        <w:jc w:val="left"/>
-      </w:pPr>
-      <w:r>
-        <w:rPr>
-          <w:rFonts w:ascii="Courier New" w:hAnsi="Courier New"/>
-          <w:b w:val="0"/>
-          <w:sz w:val="20"/>
-        </w:rPr>
-        <w:t xml:space="preserve">  (1)  Schedule A — Home Mortgage Interest (Form 1098)</w:t>
-      </w:r>
-    </w:p>
-    <w:p>
-      <w:pPr>
-        <w:spacing w:before="0" w:after="160"/>
-        <w:jc w:val="left"/>
-      </w:pPr>
-      <w:r>
-        <w:rPr>
-          <w:rFonts w:ascii="Courier New" w:hAnsi="Courier New"/>
-          <w:b w:val="0"/>
-          <w:sz w:val="20"/>
-        </w:rPr>
-        <w:t xml:space="preserve">  (2)  Form 8995 — Qualified Business Income (QBI) Deduction</w:t>
-      </w:r>
-    </w:p>
-    <w:p>
-      <w:pPr>
-        <w:spacing w:before="0" w:after="80"/>
-        <w:jc w:val="left"/>
-      </w:pPr>
-      <w:r>
-        <w:rPr>
-          <w:rFonts w:ascii="Times New Roman" w:hAnsi="Times New Roman"/>
-          <w:b w:val="0"/>
-          <w:sz w:val="22"/>
-        </w:rPr>
-        <w:t>Below I address each item with supporting documentation.</w:t>
-      </w:r>
-    </w:p>
-    <w:p>
-      <w:pPr>
-        <w:spacing w:before="80" w:after="40"/>
-        <w:jc w:val="left"/>
-      </w:pPr>
-      <w:r>
-        <w:rPr>
-          <w:rFonts w:ascii="Courier New" w:hAnsi="Courier New"/>
-          <w:b w:val="0"/>
-          <w:sz w:val="18"/>
-        </w:rPr>
-        <w:t>========================================================================</w:t>
-      </w:r>
-    </w:p>
-    <w:p>
-      <w:pPr>
-        <w:spacing w:before="40" w:after="40"/>
-        <w:jc w:val="left"/>
-      </w:pPr>
-      <w:r>
-        <w:rPr>
-          <w:rFonts w:ascii="Times New Roman" w:hAnsi="Times New Roman"/>
-          <w:b/>
-          <w:sz w:val="22"/>
-        </w:rPr>
-        <w:t>ITEM 1 — SCHEDULE A: HOME MORTGAGE INTEREST</w:t>
-      </w:r>
-    </w:p>
-    <w:p>
-      <w:pPr>
-        <w:spacing w:before="80" w:after="40"/>
-        <w:jc w:val="left"/>
-      </w:pPr>
-      <w:r>
-        <w:rPr>
-          <w:rFonts w:ascii="Courier New" w:hAnsi="Courier New"/>
-          <w:b w:val="0"/>
-          <w:sz w:val="18"/>
-        </w:rPr>
-        <w:t>========================================================================</w:t>
-      </w:r>
-    </w:p>
-    <w:p>
-      <w:pPr>
-        <w:spacing w:before="0" w:after="40"/>
-        <w:jc w:val="left"/>
-      </w:pPr>
-      <w:r>
-        <w:rPr>
-          <w:rFonts w:ascii="Times New Roman" w:hAnsi="Times New Roman"/>
-          <w:b w:val="0"/>
-          <w:sz w:val="22"/>
-        </w:rPr>
-        <w:t>My primary residence is located at:</w:t>
-      </w:r>
-    </w:p>
-    <w:p>
-      <w:pPr>
-        <w:spacing w:before="0" w:after="160"/>
-        <w:jc w:val="left"/>
-      </w:pPr>
-      <w:r>
-        <w:rPr>
-          <w:rFonts w:ascii="Courier New" w:hAnsi="Courier New"/>
-          <w:b w:val="0"/>
-          <w:sz w:val="20"/>
-        </w:rPr>
-        <w:t xml:space="preserve">  4 Lauras Way, Edgartown, MA 02539</w:t>
-      </w:r>
-    </w:p>
-    <w:p>
-      <w:pPr>
-        <w:spacing w:before="0" w:after="120"/>
-        <w:jc w:val="left"/>
-      </w:pPr>
-      <w:r>
-        <w:rPr>
-          <w:rFonts w:ascii="Times New Roman" w:hAnsi="Times New Roman"/>
-          <w:b w:val="0"/>
-          <w:sz w:val="22"/>
-        </w:rPr>
-        <w:t>During tax year 2024, two lenders reported mortgage interest for this property:</w:t>
-      </w:r>
-    </w:p>
-    <w:p>
-      <w:pPr>
-        <w:spacing w:before="0" w:after="40"/>
-        <w:jc w:val="left"/>
-      </w:pPr>
-      <w:r>
-        <w:rPr>
-          <w:rFonts w:ascii="Courier New" w:hAnsi="Courier New"/>
-          <w:b w:val="0"/>
-          <w:sz w:val="20"/>
-        </w:rPr>
-        <w:t xml:space="preserve">  Lender 1: AmWest Funding Corp (originated 10/20/2023)</w:t>
-      </w:r>
-    </w:p>
-    <w:p>
-      <w:pPr>
-        <w:spacing w:before="0" w:after="40"/>
-        <w:jc w:val="left"/>
-      </w:pPr>
-      <w:r>
-        <w:rPr>
-          <w:rFonts w:ascii="Courier New" w:hAnsi="Courier New"/>
-          <w:b w:val="0"/>
-          <w:sz w:val="20"/>
-        </w:rPr>
-        <w:t xml:space="preserve">    Box 1 — Interest paid:              $  95,134.47</w:t>
-      </w:r>
-    </w:p>
-    <w:p>
-      <w:pPr>
-        <w:spacing w:before="0" w:after="120"/>
-        <w:jc w:val="left"/>
-      </w:pPr>
-      <w:r>
-        <w:rPr>
-          <w:rFonts w:ascii="Courier New" w:hAnsi="Courier New"/>
-          <w:b w:val="0"/>
-          <w:sz w:val="20"/>
-        </w:rPr>
-        <w:t xml:space="preserve">    Box 2 — Outstanding principal:      $1,039,488.45</w:t>
-      </w:r>
-    </w:p>
-    <w:p>
-      <w:pPr>
-        <w:spacing w:before="0" w:after="40"/>
-        <w:jc w:val="left"/>
-      </w:pPr>
-      <w:r>
-        <w:rPr>
-          <w:rFonts w:ascii="Courier New" w:hAnsi="Courier New"/>
-          <w:b w:val="0"/>
-          <w:sz w:val="20"/>
-        </w:rPr>
-        <w:t xml:space="preserve">  Lender 2: Radius Financial Group Inc. (originated 11/13/2024)</w:t>
-      </w:r>
-    </w:p>
-    <w:p>
-      <w:pPr>
-        <w:spacing w:before="0" w:after="40"/>
-        <w:jc w:val="left"/>
-      </w:pPr>
-      <w:r>
-        <w:rPr>
-          <w:rFonts w:ascii="Courier New" w:hAnsi="Courier New"/>
-          <w:b w:val="0"/>
-          <w:sz w:val="20"/>
-        </w:rPr>
-        <w:t xml:space="preserve">    Box 1 — Interest paid:              $   1,869.86</w:t>
-      </w:r>
-    </w:p>
-    <w:p>
-      <w:pPr>
-        <w:spacing w:before="0" w:after="120"/>
-        <w:jc w:val="left"/>
-      </w:pPr>
-      <w:r>
-        <w:rPr>
-          <w:rFonts w:ascii="Courier New" w:hAnsi="Courier New"/>
-          <w:b w:val="0"/>
-          <w:sz w:val="20"/>
-        </w:rPr>
-        <w:t xml:space="preserve">    Box 2 — Outstanding principal:      $  840,000.00</w:t>
-      </w:r>
-    </w:p>
-    <w:p>
-      <w:pPr>
-        <w:spacing w:before="0" w:after="200"/>
-        <w:jc w:val="left"/>
-      </w:pPr>
-      <w:r>
-        <w:rPr>
-          <w:rFonts w:ascii="Courier New" w:hAnsi="Courier New"/>
-          <w:b/>
-          <w:sz w:val="20"/>
-        </w:rPr>
-        <w:t xml:space="preserve">  Total interest from Forms 1098 (primary residence):  $ 97,004.33</w:t>
-      </w:r>
-    </w:p>
-    <w:p>
-      <w:pPr>
-        <w:spacing w:before="0" w:after="80"/>
-        <w:jc w:val="left"/>
-      </w:pPr>
-      <w:r>
-        <w:rPr>
-          <w:rFonts w:ascii="Times New Roman" w:hAnsi="Times New Roman"/>
-          <w:b/>
-          <w:sz w:val="22"/>
-        </w:rPr>
-        <w:t>TCJA LOAN LIMIT CALCULATION (Form 14900):</w:t>
-      </w:r>
-    </w:p>
-    <w:p>
-      <w:pPr>
-        <w:spacing w:before="0" w:after="120"/>
-        <w:jc w:val="left"/>
-      </w:pPr>
-      <w:r>
-        <w:rPr>
-          <w:rFonts w:ascii="Times New Roman" w:hAnsi="Times New Roman"/>
-          <w:b w:val="0"/>
-          <w:sz w:val="22"/>
-        </w:rPr>
-        <w:t>Because both loans were originated after December 15, 2017, the deductible home mortgage interest is subject to the $750,000 qualified loan limit under IRC Section 163(h)(3)(F).</w:t>
-      </w:r>
-    </w:p>
-    <w:p>
-      <w:pPr>
-        <w:spacing w:before="0" w:after="80"/>
-        <w:jc w:val="left"/>
-      </w:pPr>
-      <w:r>
-        <w:rPr>
-          <w:rFonts w:ascii="Times New Roman" w:hAnsi="Times New Roman"/>
-          <w:b w:val="0"/>
-          <w:sz w:val="22"/>
-        </w:rPr>
-        <w:t>Applying the weighted-average balance method per IRS Publication 936:</w:t>
-      </w:r>
-    </w:p>
-    <w:p>
-      <w:pPr>
-        <w:spacing w:before="0" w:after="40"/>
-        <w:jc w:val="left"/>
-      </w:pPr>
-      <w:r>
-        <w:rPr>
-          <w:rFonts w:ascii="Courier New" w:hAnsi="Courier New"/>
-          <w:b w:val="0"/>
-          <w:sz w:val="20"/>
-        </w:rPr>
-        <w:t xml:space="preserve">  AmWest (319 days in 2024): $1,040,000 x (319/366) = $  906,449</w:t>
-      </w:r>
-    </w:p>
-    <w:p>
-      <w:pPr>
-        <w:spacing w:before="0" w:after="40"/>
-        <w:jc w:val="left"/>
-      </w:pPr>
-      <w:r>
-        <w:rPr>
-          <w:rFonts w:ascii="Courier New" w:hAnsi="Courier New"/>
-          <w:b w:val="0"/>
-          <w:sz w:val="20"/>
-        </w:rPr>
-        <w:t xml:space="preserve">  Radius  ( 47 days in 2024): $  840,000 x ( 47/366) = $  107,869</w:t>
-      </w:r>
-    </w:p>
-    <w:p>
-      <w:pPr>
-        <w:spacing w:before="0" w:after="80"/>
-        <w:jc w:val="left"/>
-      </w:pPr>
-      <w:r>
-        <w:rPr>
-          <w:rFonts w:ascii="Courier New" w:hAnsi="Courier New"/>
-          <w:b w:val="0"/>
-          <w:sz w:val="20"/>
-        </w:rPr>
-        <w:t xml:space="preserve">  Weighted average balance (Line 7):                    $  972,642</w:t>
-      </w:r>
-    </w:p>
-    <w:p>
-      <w:pPr>
-        <w:spacing w:before="0" w:after="40"/>
-        <w:jc w:val="left"/>
-      </w:pPr>
-      <w:r>
-        <w:rPr>
-          <w:rFonts w:ascii="Courier New" w:hAnsi="Courier New"/>
-          <w:b w:val="0"/>
-          <w:sz w:val="20"/>
-        </w:rPr>
-        <w:t xml:space="preserve">  Qualified loan limit (Line 11):                       $  750,000</w:t>
-      </w:r>
-    </w:p>
-    <w:p>
-      <w:pPr>
-        <w:spacing w:before="0" w:after="80"/>
-        <w:jc w:val="left"/>
-      </w:pPr>
-      <w:r>
-        <w:rPr>
-          <w:rFonts w:ascii="Courier New" w:hAnsi="Courier New"/>
-          <w:b w:val="0"/>
-          <w:sz w:val="20"/>
-        </w:rPr>
-        <w:t xml:space="preserve">  Limitation ratio (Line 14): $750,000 / $972,642  =       0.771</w:t>
-      </w:r>
-    </w:p>
-    <w:p>
-      <w:pPr>
-        <w:spacing w:before="0" w:after="40"/>
-        <w:jc w:val="left"/>
-      </w:pPr>
-      <w:r>
-        <w:rPr>
-          <w:rFonts w:ascii="Courier New" w:hAnsi="Courier New"/>
-          <w:b w:val="0"/>
-          <w:sz w:val="20"/>
-        </w:rPr>
-        <w:t xml:space="preserve">  Deductible home mortgage interest (Line 15):</w:t>
-      </w:r>
-    </w:p>
-    <w:p>
-      <w:pPr>
-        <w:spacing w:before="0" w:after="40"/>
-        <w:jc w:val="left"/>
-      </w:pPr>
-      <w:r>
-        <w:rPr>
-          <w:rFonts w:ascii="Courier New" w:hAnsi="Courier New"/>
-          <w:b/>
-          <w:sz w:val="20"/>
-        </w:rPr>
-        <w:t xml:space="preserve">    $97,004.33 x 0.771 =                               $  74,790.34</w:t>
-      </w:r>
-    </w:p>
-    <w:p>
-      <w:pPr>
-        <w:spacing w:before="0" w:after="120"/>
-        <w:jc w:val="left"/>
-      </w:pPr>
-      <w:r>
-        <w:rPr>
-          <w:rFonts w:ascii="Courier New" w:hAnsi="Courier New"/>
-          <w:b w:val="0"/>
-          <w:sz w:val="20"/>
-        </w:rPr>
-        <w:t xml:space="preserve">  Non-deductible portion (Line 16):                    $  22,213.99</w:t>
-      </w:r>
-    </w:p>
-    <w:p>
-      <w:pPr>
-        <w:spacing w:before="0" w:after="200"/>
-        <w:jc w:val="left"/>
-      </w:pPr>
-      <w:r>
-        <w:rPr>
-          <w:rFonts w:ascii="Times New Roman" w:hAnsi="Times New Roman"/>
-          <w:b w:val="0"/>
-          <w:sz w:val="22"/>
-        </w:rPr>
-        <w:t>The completed Form 14900 is enclosed with this response.</w:t>
-      </w:r>
-    </w:p>
-    <w:p>
-      <w:pPr>
-        <w:spacing w:before="0" w:after="80"/>
-        <w:jc w:val="left"/>
-      </w:pPr>
-      <w:r>
-        <w:rPr>
-          <w:rFonts w:ascii="Times New Roman" w:hAnsi="Times New Roman"/>
-          <w:b/>
-          <w:sz w:val="22"/>
-        </w:rPr>
-        <w:t>RENTAL PROPERTY MORTGAGE INTEREST (Schedule E):</w:t>
-      </w:r>
-    </w:p>
-    <w:p>
-      <w:pPr>
-        <w:spacing w:before="0" w:after="120"/>
-        <w:jc w:val="left"/>
-      </w:pPr>
-      <w:r>
-        <w:rPr>
-          <w:rFonts w:ascii="Times New Roman" w:hAnsi="Times New Roman"/>
-          <w:b w:val="0"/>
-          <w:sz w:val="22"/>
-        </w:rPr>
-        <w:t>I also own two rental properties with separate mortgage interest, reported exclusively on Schedule E and NOT included in Schedule A:</w:t>
-      </w:r>
-    </w:p>
-    <w:p>
-      <w:pPr>
-        <w:spacing w:before="0" w:after="40"/>
-        <w:jc w:val="left"/>
-      </w:pPr>
-      <w:r>
-        <w:rPr>
-          <w:rFonts w:ascii="Courier New" w:hAnsi="Courier New"/>
-          <w:b w:val="0"/>
-          <w:sz w:val="20"/>
-        </w:rPr>
-        <w:t xml:space="preserve">  27 Cormorant Circle, Edgartown, MA (Dovenmuehle Mortgage):</w:t>
-      </w:r>
-    </w:p>
-    <w:p>
-      <w:pPr>
-        <w:spacing w:before="0" w:after="80"/>
-        <w:jc w:val="left"/>
-      </w:pPr>
-      <w:r>
-        <w:rPr>
-          <w:rFonts w:ascii="Courier New" w:hAnsi="Courier New"/>
-          <w:b w:val="0"/>
-          <w:sz w:val="20"/>
-        </w:rPr>
-        <w:t xml:space="preserve">    Mortgage interest on Schedule E:  $ 33,397 (two loans: $16,880 + $16,517)</w:t>
-      </w:r>
-    </w:p>
-    <w:p>
-      <w:pPr>
-        <w:spacing w:before="0" w:after="40"/>
-        <w:jc w:val="left"/>
-      </w:pPr>
-      <w:r>
-        <w:rPr>
-          <w:rFonts w:ascii="Courier New" w:hAnsi="Courier New"/>
-          <w:b w:val="0"/>
-          <w:sz w:val="20"/>
-        </w:rPr>
-        <w:t xml:space="preserve">  7 Briarwood Dr, Edgartown, MA (Dovenmuehle Mortgage):</w:t>
-      </w:r>
-    </w:p>
-    <w:p>
-      <w:pPr>
-        <w:spacing w:before="0" w:after="120"/>
-        <w:jc w:val="left"/>
-      </w:pPr>
-      <w:r>
-        <w:rPr>
-          <w:rFonts w:ascii="Courier New" w:hAnsi="Courier New"/>
-          <w:b w:val="0"/>
-          <w:sz w:val="20"/>
-        </w:rPr>
-        <w:t xml:space="preserve">    Mortgage interest on Schedule E:  $ 14,292</w:t>
-      </w:r>
-    </w:p>
-    <w:p>
-      <w:pPr>
-        <w:spacing w:before="0" w:after="200"/>
-        <w:jc w:val="left"/>
-      </w:pPr>
-      <w:r>
-        <w:rPr>
-          <w:rFonts w:ascii="Times New Roman" w:hAnsi="Times New Roman"/>
-          <w:b w:val="0"/>
-          <w:sz w:val="22"/>
-        </w:rPr>
-        <w:t>There is no double-counting of rental mortgage interest on Schedule A.</w:t>
-      </w:r>
-    </w:p>
-    <w:p>
-      <w:pPr>
-        <w:spacing w:before="0" w:after="80"/>
-        <w:jc w:val="left"/>
-      </w:pPr>
-      <w:r>
-        <w:rPr>
-          <w:rFonts w:ascii="Times New Roman" w:hAnsi="Times New Roman"/>
-          <w:b/>
-          <w:sz w:val="22"/>
-        </w:rPr>
-        <w:t>CORRECTED SCHEDULE A — HOME MORTGAGE INTEREST:</w:t>
-      </w:r>
-    </w:p>
-    <w:p>
-      <w:pPr>
-        <w:spacing w:before="0" w:after="40"/>
-        <w:jc w:val="left"/>
-      </w:pPr>
-      <w:r>
-        <w:rPr>
-          <w:rFonts w:ascii="Courier New" w:hAnsi="Courier New"/>
-          <w:b/>
-          <w:sz w:val="20"/>
-        </w:rPr>
-        <w:t xml:space="preserve">  Home mortgage interest per Form 14900 (deductible):  $  74,790</w:t>
-      </w:r>
-    </w:p>
-    <w:p>
-      <w:pPr>
-        <w:spacing w:before="0" w:after="120"/>
-        <w:jc w:val="left"/>
-      </w:pPr>
-      <w:r>
-        <w:rPr>
-          <w:rFonts w:ascii="Courier New" w:hAnsi="Courier New"/>
-          <w:b w:val="0"/>
-          <w:sz w:val="20"/>
-        </w:rPr>
-        <w:t xml:space="preserve">  (Reduced from $114,034 as filed)</w:t>
-      </w:r>
-    </w:p>
-    <w:p>
-      <w:pPr>
-        <w:spacing w:before="0" w:after="200"/>
-        <w:jc w:val="left"/>
-      </w:pPr>
-      <w:r>
-        <w:rPr>
-          <w:rFonts w:ascii="Times New Roman" w:hAnsi="Times New Roman"/>
-          <w:b w:val="0"/>
-          <w:sz w:val="22"/>
-        </w:rPr>
-        <w:t>I acknowledge and accept the adjustment to the deductible home mortgage interest as calculated on the enclosed Form 14900.</w:t>
-      </w:r>
-    </w:p>
-    <w:p>
-      <w:pPr>
-        <w:spacing w:before="0" w:after="80"/>
-        <w:jc w:val="left"/>
-      </w:pPr>
-      <w:r>
-        <w:rPr>
-          <w:rFonts w:ascii="Times New Roman" w:hAnsi="Times New Roman"/>
-          <w:b/>
-          <w:sz w:val="22"/>
-        </w:rPr>
-        <w:t>Documents enclosed for Item 1:</w:t>
-      </w:r>
-    </w:p>
-    <w:p>
-      <w:pPr>
-        <w:spacing w:before="0" w:after="40"/>
-        <w:jc w:val="left"/>
-      </w:pPr>
-      <w:r>
-        <w:rPr>
-          <w:rFonts w:ascii="Courier New" w:hAnsi="Courier New"/>
-          <w:b w:val="0"/>
-          <w:sz w:val="20"/>
-        </w:rPr>
-        <w:t xml:space="preserve">  [X] Form 14900 — Worksheet for Qualified Loan Limit (completed)</w:t>
-      </w:r>
-    </w:p>
-    <w:p>
-      <w:pPr>
-        <w:spacing w:before="0" w:after="40"/>
-        <w:jc w:val="left"/>
-      </w:pPr>
-      <w:r>
-        <w:rPr>
-          <w:rFonts w:ascii="Courier New" w:hAnsi="Courier New"/>
-          <w:b w:val="0"/>
-          <w:sz w:val="20"/>
-        </w:rPr>
-        <w:t xml:space="preserve">  [X] Form 1098 — AmWest Funding Corp (4 Lauras Way — primary residence)</w:t>
-      </w:r>
-    </w:p>
-    <w:p>
-      <w:pPr>
-        <w:spacing w:before="0" w:after="40"/>
-        <w:jc w:val="left"/>
-      </w:pPr>
-      <w:r>
-        <w:rPr>
-          <w:rFonts w:ascii="Courier New" w:hAnsi="Courier New"/>
-          <w:b w:val="0"/>
-          <w:sz w:val="20"/>
-        </w:rPr>
-        <w:t xml:space="preserve">  [X] Form 1098 — Radius Financial Group Inc. (4 Lauras Way — primary residence)</w:t>
-      </w:r>
-    </w:p>
-    <w:p>
-      <w:pPr>
-        <w:spacing w:before="0" w:after="40"/>
-        <w:jc w:val="left"/>
-      </w:pPr>
-      <w:r>
-        <w:rPr>
-          <w:rFonts w:ascii="Courier New" w:hAnsi="Courier New"/>
-          <w:b w:val="0"/>
-          <w:sz w:val="20"/>
-        </w:rPr>
-        <w:t xml:space="preserve">  [X] Form 1098 — Dovenmuehle Mortgage (27 Cormorant Circle — Schedule E only)</w:t>
-      </w:r>
-    </w:p>
-    <w:p>
-      <w:pPr>
-        <w:spacing w:before="0" w:after="80"/>
-        <w:jc w:val="left"/>
-      </w:pPr>
-      <w:r>
-        <w:rPr>
-          <w:rFonts w:ascii="Courier New" w:hAnsi="Courier New"/>
-          <w:b w:val="0"/>
-          <w:sz w:val="20"/>
-        </w:rPr>
-        <w:t xml:space="preserve">  [X] Form 1098 — Dovenmuehle Mortgage (7 Briarwood Dr — Schedule E only)</w:t>
-      </w:r>
-    </w:p>
-    <w:p>
-      <w:pPr>
-        <w:spacing w:before="80" w:after="40"/>
-        <w:jc w:val="left"/>
-      </w:pPr>
-      <w:r>
-        <w:rPr>
-          <w:rFonts w:ascii="Courier New" w:hAnsi="Courier New"/>
-          <w:b w:val="0"/>
-          <w:sz w:val="18"/>
-        </w:rPr>
-        <w:t>========================================================================</w:t>
-      </w:r>
-    </w:p>
-    <w:p>
-      <w:pPr>
-        <w:spacing w:before="40" w:after="40"/>
-        <w:jc w:val="left"/>
-      </w:pPr>
-      <w:r>
-        <w:rPr>
-          <w:rFonts w:ascii="Times New Roman" w:hAnsi="Times New Roman"/>
-          <w:b/>
-          <w:sz w:val="22"/>
-        </w:rPr>
-        <w:t>ITEM 2 — FORM 8995: QUALIFIED BUSINESS INCOME (QBI) DEDUCTION</w:t>
-      </w:r>
-    </w:p>
-    <w:p>
-      <w:pPr>
-        <w:spacing w:before="80" w:after="40"/>
-        <w:jc w:val="left"/>
-      </w:pPr>
-      <w:r>
-        <w:rPr>
-          <w:rFonts w:ascii="Courier New" w:hAnsi="Courier New"/>
-          <w:b w:val="0"/>
-          <w:sz w:val="18"/>
-        </w:rPr>
-        <w:t>========================================================================</w:t>
-      </w:r>
-    </w:p>
-    <w:p>
-      <w:pPr>
-        <w:spacing w:before="0" w:after="120"/>
-        <w:jc w:val="left"/>
-      </w:pPr>
-      <w:r>
-        <w:rPr>
-          <w:rFonts w:ascii="Times New Roman" w:hAnsi="Times New Roman"/>
-          <w:b w:val="0"/>
-          <w:sz w:val="22"/>
-        </w:rPr>
-        <w:t>The QBI deduction of $5,196 claimed on my return was calculated as follows:</w:t>
-      </w:r>
-    </w:p>
-    <w:p>
-      <w:pPr>
-        <w:spacing w:before="0" w:after="40"/>
-        <w:jc w:val="left"/>
-      </w:pPr>
-      <w:r>
-        <w:rPr>
-          <w:rFonts w:ascii="Courier New" w:hAnsi="Courier New"/>
-          <w:b w:val="0"/>
-          <w:sz w:val="20"/>
-        </w:rPr>
-        <w:t xml:space="preserve">  QBI Components:</w:t>
-      </w:r>
-    </w:p>
-    <w:p>
-      <w:pPr>
-        <w:spacing w:before="0" w:after="40"/>
-        <w:jc w:val="left"/>
-      </w:pPr>
-      <w:r>
-        <w:rPr>
-          <w:rFonts w:ascii="Courier New" w:hAnsi="Courier New"/>
-          <w:b w:val="0"/>
-          <w:sz w:val="20"/>
-        </w:rPr>
-        <w:t xml:space="preserve">    Schedule C — Housecleaning Service:    $  75,630</w:t>
-      </w:r>
-    </w:p>
-    <w:p>
-      <w:pPr>
-        <w:spacing w:before="0" w:after="40"/>
-        <w:jc w:val="left"/>
-      </w:pPr>
-      <w:r>
-        <w:rPr>
-          <w:rFonts w:ascii="Courier New" w:hAnsi="Courier New"/>
-          <w:b w:val="0"/>
-          <w:sz w:val="20"/>
-        </w:rPr>
-        <w:t xml:space="preserve">    Schedule E — 27 Cormorant Circle:      $  42,054</w:t>
-      </w:r>
-    </w:p>
-    <w:p>
-      <w:pPr>
-        <w:spacing w:before="0" w:after="40"/>
-        <w:jc w:val="left"/>
-      </w:pPr>
-      <w:r>
-        <w:rPr>
-          <w:rFonts w:ascii="Courier New" w:hAnsi="Courier New"/>
-          <w:b w:val="0"/>
-          <w:sz w:val="20"/>
-        </w:rPr>
-        <w:t xml:space="preserve">    Schedule E — 7 Briarwood Dr:           $  30,405</w:t>
-      </w:r>
-    </w:p>
-    <w:p>
-      <w:pPr>
-        <w:spacing w:before="0" w:after="80"/>
-        <w:jc w:val="left"/>
-      </w:pPr>
-      <w:r>
-        <w:rPr>
-          <w:rFonts w:ascii="Courier New" w:hAnsi="Courier New"/>
-          <w:b w:val="0"/>
-          <w:sz w:val="20"/>
-        </w:rPr>
-        <w:t xml:space="preserve">    Total QBI:                             $ 148,089</w:t>
-      </w:r>
-    </w:p>
-    <w:p>
-      <w:pPr>
-        <w:spacing w:before="0" w:after="80"/>
-        <w:jc w:val="left"/>
-      </w:pPr>
-      <w:r>
-        <w:rPr>
-          <w:rFonts w:ascii="Courier New" w:hAnsi="Courier New"/>
-          <w:b w:val="0"/>
-          <w:sz w:val="20"/>
-        </w:rPr>
-        <w:t xml:space="preserve">  Standard QBI deduction (20% x $148,089): $  29,618</w:t>
-      </w:r>
-    </w:p>
-    <w:p>
-      <w:pPr>
-        <w:spacing w:before="0" w:after="40"/>
-        <w:jc w:val="left"/>
-      </w:pPr>
-      <w:r>
-        <w:rPr>
-          <w:rFonts w:ascii="Courier New" w:hAnsi="Courier New"/>
-          <w:b w:val="0"/>
-          <w:sz w:val="20"/>
-        </w:rPr>
-        <w:t xml:space="preserve">  Income Limitation:</w:t>
-      </w:r>
-    </w:p>
-    <w:p>
-      <w:pPr>
-        <w:spacing w:before="0" w:after="40"/>
-        <w:jc w:val="left"/>
-      </w:pPr>
-      <w:r>
-        <w:rPr>
-          <w:rFonts w:ascii="Courier New" w:hAnsi="Courier New"/>
-          <w:b w:val="0"/>
-          <w:sz w:val="20"/>
-        </w:rPr>
-        <w:t xml:space="preserve">    Taxable income before QBI deduction:   $  25,980</w:t>
-      </w:r>
-    </w:p>
-    <w:p>
-      <w:pPr>
-        <w:spacing w:before="0" w:after="80"/>
-        <w:jc w:val="left"/>
-      </w:pPr>
-      <w:r>
-        <w:rPr>
-          <w:rFonts w:ascii="Courier New" w:hAnsi="Courier New"/>
-          <w:b w:val="0"/>
-          <w:sz w:val="20"/>
-        </w:rPr>
-        <w:t xml:space="preserve">    20% of taxable income:                 $   5,196</w:t>
-      </w:r>
-    </w:p>
-    <w:p>
-      <w:pPr>
-        <w:spacing w:before="0" w:after="120"/>
-        <w:jc w:val="left"/>
-      </w:pPr>
-      <w:r>
-        <w:rPr>
-          <w:rFonts w:ascii="Courier New" w:hAnsi="Courier New"/>
-          <w:b/>
-          <w:sz w:val="20"/>
-        </w:rPr>
-        <w:t xml:space="preserve">  QBI DEDUCTION ALLOWED (lesser amount):   $   5,196</w:t>
-      </w:r>
-    </w:p>
-    <w:p>
-      <w:pPr>
-        <w:spacing w:before="0" w:after="160"/>
-        <w:jc w:val="left"/>
-      </w:pPr>
-      <w:r>
-        <w:rPr>
-          <w:rFonts w:ascii="Times New Roman" w:hAnsi="Times New Roman"/>
-          <w:b w:val="0"/>
-          <w:sz w:val="22"/>
-        </w:rPr>
-        <w:t>The deduction is correctly limited to $5,196 by the taxable income limitation under IRC Section 199A(a). This deduction was calculated correctly as filed.</w:t>
-      </w:r>
-    </w:p>
-    <w:p>
-      <w:pPr>
-        <w:spacing w:before="0" w:after="80"/>
-        <w:jc w:val="left"/>
-      </w:pPr>
-      <w:r>
-        <w:rPr>
-          <w:rFonts w:ascii="Times New Roman" w:hAnsi="Times New Roman"/>
-          <w:b/>
-          <w:sz w:val="22"/>
-        </w:rPr>
-        <w:t>Documents enclosed for Item 2:</w:t>
-      </w:r>
-    </w:p>
-    <w:p>
-      <w:pPr>
-        <w:spacing w:before="0" w:after="40"/>
-        <w:jc w:val="left"/>
-      </w:pPr>
-      <w:r>
-        <w:rPr>
-          <w:rFonts w:ascii="Courier New" w:hAnsi="Courier New"/>
-          <w:b w:val="0"/>
-          <w:sz w:val="20"/>
-        </w:rPr>
-        <w:t xml:space="preserve">  [X] Form 8995 — QBI Deduction Worksheet</w:t>
-      </w:r>
-    </w:p>
-    <w:p>
-      <w:pPr>
-        <w:spacing w:before="0" w:after="40"/>
-        <w:jc w:val="left"/>
-      </w:pPr>
-      <w:r>
-        <w:rPr>
-          <w:rFonts w:ascii="Courier New" w:hAnsi="Courier New"/>
-          <w:b w:val="0"/>
-          <w:sz w:val="20"/>
-        </w:rPr>
-        <w:t xml:space="preserve">  [X] Schedule C — Housecleaning Service net income</w:t>
-      </w:r>
-    </w:p>
-    <w:p>
-      <w:pPr>
-        <w:spacing w:before="0" w:after="80"/>
-        <w:jc w:val="left"/>
-      </w:pPr>
-      <w:r>
-        <w:rPr>
-          <w:rFonts w:ascii="Courier New" w:hAnsi="Courier New"/>
-          <w:b w:val="0"/>
-          <w:sz w:val="20"/>
-        </w:rPr>
-        <w:t xml:space="preserve">  [X] Schedule E — Rental income summary (both properties)</w:t>
-      </w:r>
-    </w:p>
-    <w:p>
-      <w:pPr>
-        <w:spacing w:before="80" w:after="40"/>
-        <w:jc w:val="left"/>
-      </w:pPr>
-      <w:r>
-        <w:rPr>
-          <w:rFonts w:ascii="Courier New" w:hAnsi="Courier New"/>
-          <w:b w:val="0"/>
-          <w:sz w:val="18"/>
-        </w:rPr>
-        <w:t>========================================================================</w:t>
-      </w:r>
-    </w:p>
-    <w:p>
-      <w:pPr>
-        <w:spacing w:before="120" w:after="160"/>
-        <w:jc w:val="left"/>
-      </w:pPr>
-      <w:r>
-        <w:rPr>
-          <w:rFonts w:ascii="Times New Roman" w:hAnsi="Times New Roman"/>
-          <w:b w:val="0"/>
-          <w:sz w:val="22"/>
-        </w:rPr>
-        <w:t>I trust this response fully addresses the items raised in Notice LTR566T. Should you require additional information, please contact me at the address or phone number below.</w:t>
       </w:r>
     </w:p>
     <w:p>
@@ -1250,7 +433,7 @@
     </w:p>
     <w:p>
       <w:pPr>
-        <w:spacing w:before="0" w:after="80"/>
+        <w:spacing w:before="0" w:after="40"/>
         <w:jc w:val="left"/>
       </w:pPr>
       <w:r>
@@ -1262,23 +445,9 @@
         <w:t>Email: elly_usa@hotmail.com</w:t>
       </w:r>
     </w:p>
-    <w:p>
-      <w:pPr>
-        <w:spacing w:before="80" w:after="40"/>
-        <w:jc w:val="left"/>
-      </w:pPr>
-      <w:r>
-        <w:rPr>
-          <w:rFonts w:ascii="Courier New" w:hAnsi="Courier New"/>
-          <w:b w:val="0"/>
-          <w:sz w:val="18"/>
-        </w:rPr>
-        <w:t>========================================================================</w:t>
-      </w:r>
-    </w:p>
     <w:sectPr>
       <w:pgSz w:w="12240" w:h="15840"/>
-      <w:pgMar w:top="1440" w:right="1728" w:bottom="1440" w:left="1728" w:header="720" w:footer="720" w:gutter="0"/>
+      <w:pgMar w:top="1584" w:right="1800" w:bottom="1584" w:left="1800" w:header="720" w:footer="720" w:gutter="0"/>
       <w:cols w:space="720"/>
       <w:docGrid w:linePitch="360"/>
     </w:sectPr>

</xml_diff>

<commit_message>
Final professional response letter — focused on Form 14900 only, no additional disclosures
https://claude.ai/code/session_019pk3CFrfADSxNgg23VPbbZ
</commit_message>
<xml_diff>
--- a/IRS_LTR566T_Response_Eliana_Machado_2024.docx
+++ b/IRS_LTR566T_Response_Eliana_Machado_2024.docx
@@ -4,450 +4,635 @@
   <w:body>
     <w:p>
       <w:pPr>
-        <w:spacing w:before="0" w:after="200"/>
+        <w:spacing w:before="0" w:after="240" w:line="280" w:lineRule="exact"/>
         <w:jc w:val="left"/>
       </w:pPr>
       <w:r>
         <w:rPr>
           <w:rFonts w:ascii="Times New Roman" w:hAnsi="Times New Roman"/>
           <w:b w:val="0"/>
+          <w:i w:val="0"/>
           <w:sz w:val="22"/>
+          <w:u w:val="none"/>
         </w:rPr>
-        <w:t>Date: June 13, 2026</w:t>
+        <w:t>June 13, 2026</w:t>
       </w:r>
     </w:p>
     <w:p>
       <w:pPr>
-        <w:spacing w:before="0" w:after="40"/>
+        <w:spacing w:before="0" w:after="60" w:line="280" w:lineRule="exact"/>
         <w:jc w:val="left"/>
       </w:pPr>
       <w:r>
         <w:rPr>
           <w:rFonts w:ascii="Times New Roman" w:hAnsi="Times New Roman"/>
           <w:b w:val="0"/>
+          <w:i w:val="0"/>
           <w:sz w:val="22"/>
+          <w:u w:val="none"/>
         </w:rPr>
         <w:t>Internal Revenue Service</w:t>
       </w:r>
     </w:p>
     <w:p>
       <w:pPr>
-        <w:spacing w:before="0" w:after="40"/>
+        <w:spacing w:before="0" w:after="60" w:line="280" w:lineRule="exact"/>
         <w:jc w:val="left"/>
       </w:pPr>
       <w:r>
         <w:rPr>
           <w:rFonts w:ascii="Times New Roman" w:hAnsi="Times New Roman"/>
           <w:b w:val="0"/>
+          <w:i w:val="0"/>
           <w:sz w:val="22"/>
+          <w:u w:val="none"/>
         </w:rPr>
         <w:t>P.O. Box 309011, AMC 8236</w:t>
       </w:r>
     </w:p>
     <w:p>
       <w:pPr>
-        <w:spacing w:before="0" w:after="200"/>
+        <w:spacing w:before="0" w:after="280" w:line="280" w:lineRule="exact"/>
         <w:jc w:val="left"/>
       </w:pPr>
       <w:r>
         <w:rPr>
           <w:rFonts w:ascii="Times New Roman" w:hAnsi="Times New Roman"/>
           <w:b w:val="0"/>
+          <w:i w:val="0"/>
           <w:sz w:val="22"/>
+          <w:u w:val="none"/>
         </w:rPr>
         <w:t>Memphis, TN 38130-0911</w:t>
       </w:r>
     </w:p>
     <w:p>
       <w:pPr>
-        <w:spacing w:before="0" w:after="40"/>
+        <w:spacing w:before="0" w:after="40" w:line="280" w:lineRule="exact"/>
         <w:jc w:val="left"/>
       </w:pPr>
       <w:r>
         <w:rPr>
           <w:rFonts w:ascii="Courier New" w:hAnsi="Courier New"/>
           <w:b w:val="0"/>
-          <w:sz w:val="18"/>
+          <w:i w:val="0"/>
+          <w:sz w:val="20"/>
+          <w:u w:val="none"/>
         </w:rPr>
-        <w:t>--------------------------------------------------------------------</w:t>
+        <w:t>Re:     Response to Notice LTR566T</w:t>
       </w:r>
     </w:p>
     <w:p>
       <w:pPr>
-        <w:spacing w:before="0" w:after="40"/>
+        <w:spacing w:before="0" w:after="40" w:line="280" w:lineRule="exact"/>
         <w:jc w:val="left"/>
       </w:pPr>
       <w:r>
         <w:rPr>
           <w:rFonts w:ascii="Courier New" w:hAnsi="Courier New"/>
           <w:b w:val="0"/>
+          <w:i w:val="0"/>
           <w:sz w:val="20"/>
+          <w:u w:val="none"/>
         </w:rPr>
-        <w:t>Re:     Response to LTR566T — Notice Date: May 18, 2026</w:t>
+        <w:t xml:space="preserve">        Notice Date:  May 18, 2026</w:t>
       </w:r>
     </w:p>
     <w:p>
       <w:pPr>
-        <w:spacing w:before="0" w:after="40"/>
+        <w:spacing w:before="0" w:after="40" w:line="280" w:lineRule="exact"/>
         <w:jc w:val="left"/>
       </w:pPr>
       <w:r>
         <w:rPr>
           <w:rFonts w:ascii="Courier New" w:hAnsi="Courier New"/>
           <w:b w:val="0"/>
+          <w:i w:val="0"/>
           <w:sz w:val="20"/>
+          <w:u w:val="none"/>
         </w:rPr>
-        <w:t xml:space="preserve">        Taxpayer:   Eliana Machado de Almeida</w:t>
+        <w:t xml:space="preserve">        Taxpayer:     Eliana Machado de Almeida</w:t>
       </w:r>
     </w:p>
     <w:p>
       <w:pPr>
-        <w:spacing w:before="0" w:after="40"/>
+        <w:spacing w:before="0" w:after="40" w:line="280" w:lineRule="exact"/>
         <w:jc w:val="left"/>
       </w:pPr>
       <w:r>
         <w:rPr>
           <w:rFonts w:ascii="Courier New" w:hAnsi="Courier New"/>
           <w:b w:val="0"/>
+          <w:i w:val="0"/>
           <w:sz w:val="20"/>
+          <w:u w:val="none"/>
         </w:rPr>
-        <w:t xml:space="preserve">        SSN:        697-75-6336</w:t>
+        <w:t xml:space="preserve">        SSN:          697-75-6336</w:t>
       </w:r>
     </w:p>
     <w:p>
       <w:pPr>
-        <w:spacing w:before="0" w:after="40"/>
+        <w:spacing w:before="0" w:after="40" w:line="280" w:lineRule="exact"/>
         <w:jc w:val="left"/>
       </w:pPr>
       <w:r>
         <w:rPr>
           <w:rFonts w:ascii="Courier New" w:hAnsi="Courier New"/>
           <w:b w:val="0"/>
+          <w:i w:val="0"/>
           <w:sz w:val="20"/>
+          <w:u w:val="none"/>
         </w:rPr>
-        <w:t xml:space="preserve">        Tax Year:   2024</w:t>
+        <w:t xml:space="preserve">        Tax Year:     2024</w:t>
       </w:r>
     </w:p>
     <w:p>
       <w:pPr>
-        <w:spacing w:before="0" w:after="40"/>
+        <w:spacing w:before="0" w:after="40" w:line="280" w:lineRule="exact"/>
         <w:jc w:val="left"/>
       </w:pPr>
       <w:r>
         <w:rPr>
           <w:rFonts w:ascii="Courier New" w:hAnsi="Courier New"/>
           <w:b w:val="0"/>
+          <w:i w:val="0"/>
           <w:sz w:val="20"/>
+          <w:u w:val="none"/>
         </w:rPr>
         <w:t xml:space="preserve">        Project Code: 0417</w:t>
       </w:r>
     </w:p>
     <w:p>
       <w:pPr>
-        <w:spacing w:before="0" w:after="200"/>
+        <w:spacing w:before="0" w:after="200" w:line="280" w:lineRule="exact"/>
+        <w:jc w:val="left"/>
+      </w:pPr>
+    </w:p>
+    <w:p>
+      <w:pPr>
+        <w:spacing w:before="0" w:after="240" w:line="280" w:lineRule="exact"/>
+        <w:jc w:val="left"/>
+      </w:pPr>
+      <w:r>
+        <w:rPr>
+          <w:rFonts w:ascii="Times New Roman" w:hAnsi="Times New Roman"/>
+          <w:b w:val="0"/>
+          <w:i w:val="0"/>
+          <w:sz w:val="22"/>
+          <w:u w:val="none"/>
+        </w:rPr>
+        <w:t>Dear IRS Examiner:</w:t>
+      </w:r>
+    </w:p>
+    <w:p>
+      <w:pPr>
+        <w:spacing w:before="0" w:after="200" w:line="280" w:lineRule="exact"/>
+        <w:jc w:val="left"/>
+      </w:pPr>
+      <w:r>
+        <w:rPr>
+          <w:rFonts w:ascii="Times New Roman" w:hAnsi="Times New Roman"/>
+          <w:b w:val="0"/>
+          <w:i w:val="0"/>
+          <w:sz w:val="22"/>
+          <w:u w:val="none"/>
+        </w:rPr>
+        <w:t>I am writing in response to Notice LTR566T dated May 18, 2026, regarding my 2024 Federal Income Tax Return (Form 1040).</w:t>
+      </w:r>
+    </w:p>
+    <w:p>
+      <w:pPr>
+        <w:spacing w:before="0" w:after="200" w:line="280" w:lineRule="exact"/>
+        <w:jc w:val="left"/>
+      </w:pPr>
+      <w:r>
+        <w:rPr>
+          <w:rFonts w:ascii="Times New Roman" w:hAnsi="Times New Roman"/>
+          <w:b w:val="0"/>
+          <w:i w:val="0"/>
+          <w:sz w:val="22"/>
+          <w:u w:val="none"/>
+        </w:rPr>
+        <w:t>In accordance with your request, I have completed and enclosed the Form 14900 — Worksheet for Qualified Loan Limit and Deductible Home Mortgage Interest for Tax Years Beginning After 2017, as requested in the notice.</w:t>
+      </w:r>
+    </w:p>
+    <w:p>
+      <w:pPr>
+        <w:spacing w:before="0" w:after="200" w:line="280" w:lineRule="exact"/>
+        <w:jc w:val="left"/>
+      </w:pPr>
+      <w:r>
+        <w:rPr>
+          <w:rFonts w:ascii="Times New Roman" w:hAnsi="Times New Roman"/>
+          <w:b w:val="0"/>
+          <w:i w:val="0"/>
+          <w:sz w:val="22"/>
+          <w:u w:val="none"/>
+        </w:rPr>
+        <w:t>My home is located at 4 Lauras Way, Edgartown, MA 02539. During tax year 2024, mortgage interest was paid to two lenders on this property, as reflected on the enclosed Forms 1098. Both loans were originated after December 15, 2017.</w:t>
+      </w:r>
+    </w:p>
+    <w:p>
+      <w:pPr>
+        <w:spacing w:before="0" w:after="200" w:line="280" w:lineRule="exact"/>
+        <w:jc w:val="left"/>
+      </w:pPr>
+      <w:r>
+        <w:rPr>
+          <w:rFonts w:ascii="Times New Roman" w:hAnsi="Times New Roman"/>
+          <w:sz w:val="22"/>
+        </w:rPr>
+        <w:t xml:space="preserve">As shown on the enclosed Form 14900, the deductible home mortgage interest for tax year 2024, after application of the $750,000 qualified loan limit under IRC Section 163(h)(3)(F), is </w:t>
+      </w:r>
+      <w:r>
+        <w:rPr>
+          <w:rFonts w:ascii="Times New Roman" w:hAnsi="Times New Roman"/>
+          <w:b/>
+          <w:sz w:val="22"/>
+        </w:rPr>
+        <w:t>$74,790.34</w:t>
+      </w:r>
+      <w:r>
+        <w:rPr>
+          <w:rFonts w:ascii="Times New Roman" w:hAnsi="Times New Roman"/>
+          <w:sz w:val="22"/>
+        </w:rPr>
+        <w:t>.</w:t>
+      </w:r>
+    </w:p>
+    <w:p>
+      <w:pPr>
+        <w:spacing w:before="0" w:after="280" w:line="280" w:lineRule="exact"/>
+        <w:jc w:val="left"/>
+      </w:pPr>
+      <w:r>
+        <w:rPr>
+          <w:rFonts w:ascii="Times New Roman" w:hAnsi="Times New Roman"/>
+          <w:b w:val="0"/>
+          <w:i w:val="0"/>
+          <w:sz w:val="22"/>
+          <w:u w:val="none"/>
+        </w:rPr>
+        <w:t>I respectfully submit this response and the enclosed documentation as a complete reply to the items requested in Notice LTR566T. No additional issues are in dispute.</w:t>
+      </w:r>
+    </w:p>
+    <w:p>
+      <w:pPr>
+        <w:spacing w:before="0" w:after="160" w:line="280" w:lineRule="exact"/>
+        <w:jc w:val="left"/>
+      </w:pPr>
+      <w:r>
+        <w:rPr>
+          <w:rFonts w:ascii="Times New Roman" w:hAnsi="Times New Roman"/>
+          <w:b/>
+          <w:i w:val="0"/>
+          <w:sz w:val="22"/>
+          <w:u w:val="none"/>
+        </w:rPr>
+        <w:t>Enclosed:</w:t>
+      </w:r>
+    </w:p>
+    <w:p>
+      <w:pPr>
+        <w:spacing w:before="0" w:after="40" w:line="280" w:lineRule="exact"/>
         <w:jc w:val="left"/>
       </w:pPr>
       <w:r>
         <w:rPr>
           <w:rFonts w:ascii="Courier New" w:hAnsi="Courier New"/>
           <w:b w:val="0"/>
-          <w:sz w:val="18"/>
+          <w:i w:val="0"/>
+          <w:sz w:val="20"/>
+          <w:u w:val="none"/>
         </w:rPr>
-        <w:t>--------------------------------------------------------------------</w:t>
+        <w:t>1.  Form 14900 — Worksheet for Qualified Loan Limit and</w:t>
       </w:r>
     </w:p>
     <w:p>
       <w:pPr>
-        <w:spacing w:before="0" w:after="200"/>
+        <w:spacing w:before="0" w:after="40" w:line="280" w:lineRule="exact"/>
+        <w:jc w:val="left"/>
+      </w:pPr>
+      <w:r>
+        <w:rPr>
+          <w:rFonts w:ascii="Courier New" w:hAnsi="Courier New"/>
+          <w:b w:val="0"/>
+          <w:i w:val="0"/>
+          <w:sz w:val="20"/>
+          <w:u w:val="none"/>
+        </w:rPr>
+        <w:t xml:space="preserve">    Deductible Home Mortgage Interest (completed)</w:t>
+      </w:r>
+    </w:p>
+    <w:p>
+      <w:pPr>
+        <w:spacing w:before="0" w:after="80" w:line="280" w:lineRule="exact"/>
+        <w:jc w:val="left"/>
+      </w:pPr>
+    </w:p>
+    <w:p>
+      <w:pPr>
+        <w:spacing w:before="0" w:after="40" w:line="280" w:lineRule="exact"/>
+        <w:jc w:val="left"/>
+      </w:pPr>
+      <w:r>
+        <w:rPr>
+          <w:rFonts w:ascii="Courier New" w:hAnsi="Courier New"/>
+          <w:b w:val="0"/>
+          <w:i w:val="0"/>
+          <w:sz w:val="20"/>
+          <w:u w:val="none"/>
+        </w:rPr>
+        <w:t>2.  Form 1098 — AmWest Funding Corp</w:t>
+      </w:r>
+    </w:p>
+    <w:p>
+      <w:pPr>
+        <w:spacing w:before="0" w:after="40" w:line="280" w:lineRule="exact"/>
+        <w:jc w:val="left"/>
+      </w:pPr>
+      <w:r>
+        <w:rPr>
+          <w:rFonts w:ascii="Courier New" w:hAnsi="Courier New"/>
+          <w:b w:val="0"/>
+          <w:i w:val="0"/>
+          <w:sz w:val="20"/>
+          <w:u w:val="none"/>
+        </w:rPr>
+        <w:t xml:space="preserve">    Property: 4 Lauras Way, Edgartown, MA 02539</w:t>
+      </w:r>
+    </w:p>
+    <w:p>
+      <w:pPr>
+        <w:spacing w:before="0" w:after="40" w:line="280" w:lineRule="exact"/>
+        <w:jc w:val="left"/>
+      </w:pPr>
+      <w:r>
+        <w:rPr>
+          <w:rFonts w:ascii="Courier New" w:hAnsi="Courier New"/>
+          <w:b w:val="0"/>
+          <w:i w:val="0"/>
+          <w:sz w:val="20"/>
+          <w:u w:val="none"/>
+        </w:rPr>
+        <w:t xml:space="preserve">    Mortgage interest paid (Box 1):   $95,134.47</w:t>
+      </w:r>
+    </w:p>
+    <w:p>
+      <w:pPr>
+        <w:spacing w:before="0" w:after="40" w:line="280" w:lineRule="exact"/>
+        <w:jc w:val="left"/>
+      </w:pPr>
+      <w:r>
+        <w:rPr>
+          <w:rFonts w:ascii="Courier New" w:hAnsi="Courier New"/>
+          <w:b w:val="0"/>
+          <w:i w:val="0"/>
+          <w:sz w:val="20"/>
+          <w:u w:val="none"/>
+        </w:rPr>
+        <w:t xml:space="preserve">    Outstanding principal (Box 2):    $1,039,488.45</w:t>
+      </w:r>
+    </w:p>
+    <w:p>
+      <w:pPr>
+        <w:spacing w:before="0" w:after="40" w:line="280" w:lineRule="exact"/>
+        <w:jc w:val="left"/>
+      </w:pPr>
+      <w:r>
+        <w:rPr>
+          <w:rFonts w:ascii="Courier New" w:hAnsi="Courier New"/>
+          <w:b w:val="0"/>
+          <w:i w:val="0"/>
+          <w:sz w:val="20"/>
+          <w:u w:val="none"/>
+        </w:rPr>
+        <w:t xml:space="preserve">    Origination date (Box 3):         10/20/2023</w:t>
+      </w:r>
+    </w:p>
+    <w:p>
+      <w:pPr>
+        <w:spacing w:before="0" w:after="80" w:line="280" w:lineRule="exact"/>
+        <w:jc w:val="left"/>
+      </w:pPr>
+    </w:p>
+    <w:p>
+      <w:pPr>
+        <w:spacing w:before="0" w:after="40" w:line="280" w:lineRule="exact"/>
+        <w:jc w:val="left"/>
+      </w:pPr>
+      <w:r>
+        <w:rPr>
+          <w:rFonts w:ascii="Courier New" w:hAnsi="Courier New"/>
+          <w:b w:val="0"/>
+          <w:i w:val="0"/>
+          <w:sz w:val="20"/>
+          <w:u w:val="none"/>
+        </w:rPr>
+        <w:t>3.  Form 1098 — Radius Financial Group Inc.</w:t>
+      </w:r>
+    </w:p>
+    <w:p>
+      <w:pPr>
+        <w:spacing w:before="0" w:after="40" w:line="280" w:lineRule="exact"/>
+        <w:jc w:val="left"/>
+      </w:pPr>
+      <w:r>
+        <w:rPr>
+          <w:rFonts w:ascii="Courier New" w:hAnsi="Courier New"/>
+          <w:b w:val="0"/>
+          <w:i w:val="0"/>
+          <w:sz w:val="20"/>
+          <w:u w:val="none"/>
+        </w:rPr>
+        <w:t xml:space="preserve">    Property: 4 Lauras Way, Edgartown, MA 02539</w:t>
+      </w:r>
+    </w:p>
+    <w:p>
+      <w:pPr>
+        <w:spacing w:before="0" w:after="40" w:line="280" w:lineRule="exact"/>
+        <w:jc w:val="left"/>
+      </w:pPr>
+      <w:r>
+        <w:rPr>
+          <w:rFonts w:ascii="Courier New" w:hAnsi="Courier New"/>
+          <w:b w:val="0"/>
+          <w:i w:val="0"/>
+          <w:sz w:val="20"/>
+          <w:u w:val="none"/>
+        </w:rPr>
+        <w:t xml:space="preserve">    Mortgage interest paid (Box 1):   $1,869.86</w:t>
+      </w:r>
+    </w:p>
+    <w:p>
+      <w:pPr>
+        <w:spacing w:before="0" w:after="40" w:line="280" w:lineRule="exact"/>
+        <w:jc w:val="left"/>
+      </w:pPr>
+      <w:r>
+        <w:rPr>
+          <w:rFonts w:ascii="Courier New" w:hAnsi="Courier New"/>
+          <w:b w:val="0"/>
+          <w:i w:val="0"/>
+          <w:sz w:val="20"/>
+          <w:u w:val="none"/>
+        </w:rPr>
+        <w:t xml:space="preserve">    Outstanding principal (Box 2):    $840,000.00</w:t>
+      </w:r>
+    </w:p>
+    <w:p>
+      <w:pPr>
+        <w:spacing w:before="0" w:after="40" w:line="280" w:lineRule="exact"/>
+        <w:jc w:val="left"/>
+      </w:pPr>
+      <w:r>
+        <w:rPr>
+          <w:rFonts w:ascii="Courier New" w:hAnsi="Courier New"/>
+          <w:b w:val="0"/>
+          <w:i w:val="0"/>
+          <w:sz w:val="20"/>
+          <w:u w:val="none"/>
+        </w:rPr>
+        <w:t xml:space="preserve">    Origination date (Box 3):         11/13/2024</w:t>
+      </w:r>
+    </w:p>
+    <w:p>
+      <w:pPr>
+        <w:spacing w:before="0" w:after="240" w:line="280" w:lineRule="exact"/>
+        <w:jc w:val="left"/>
+      </w:pPr>
+    </w:p>
+    <w:p>
+      <w:pPr>
+        <w:spacing w:before="0" w:after="360" w:line="280" w:lineRule="exact"/>
         <w:jc w:val="left"/>
       </w:pPr>
       <w:r>
         <w:rPr>
           <w:rFonts w:ascii="Times New Roman" w:hAnsi="Times New Roman"/>
           <w:b w:val="0"/>
+          <w:i w:val="0"/>
           <w:sz w:val="22"/>
+          <w:u w:val="none"/>
         </w:rPr>
-        <w:t>Dear IRS Examiner,</w:t>
+        <w:t>I declare under penalty of perjury that the foregoing is true, correct, and complete to the best of my knowledge and belief.</w:t>
       </w:r>
     </w:p>
     <w:p>
       <w:pPr>
-        <w:spacing w:before="0" w:after="200"/>
+        <w:spacing w:before="0" w:after="760" w:line="280" w:lineRule="exact"/>
         <w:jc w:val="left"/>
       </w:pPr>
       <w:r>
         <w:rPr>
           <w:rFonts w:ascii="Times New Roman" w:hAnsi="Times New Roman"/>
           <w:b w:val="0"/>
+          <w:i w:val="0"/>
           <w:sz w:val="22"/>
+          <w:u w:val="none"/>
         </w:rPr>
-        <w:t>I am writing in response to Notice LTR566T dated May 18, 2026, regarding my 2024 Federal Income Tax Return.</w:t>
+        <w:t>Sincerely,</w:t>
       </w:r>
     </w:p>
     <w:p>
       <w:pPr>
-        <w:spacing w:before="0" w:after="200"/>
+        <w:spacing w:before="0" w:after="80" w:line="280" w:lineRule="exact"/>
+        <w:jc w:val="left"/>
+      </w:pPr>
+      <w:r>
+        <w:rPr>
+          <w:rFonts w:ascii="Courier New" w:hAnsi="Courier New"/>
+          <w:b w:val="0"/>
+          <w:i w:val="0"/>
+          <w:sz w:val="20"/>
+          <w:u w:val="none"/>
+        </w:rPr>
+        <w:t>_________________________________     Date: _______________</w:t>
+      </w:r>
+    </w:p>
+    <w:p>
+      <w:pPr>
+        <w:spacing w:before="0" w:after="60" w:line="280" w:lineRule="exact"/>
         <w:jc w:val="left"/>
       </w:pPr>
       <w:r>
         <w:rPr>
           <w:rFonts w:ascii="Times New Roman" w:hAnsi="Times New Roman"/>
           <w:b w:val="0"/>
+          <w:i w:val="0"/>
           <w:sz w:val="22"/>
+          <w:u w:val="none"/>
         </w:rPr>
-        <w:t>In response to the request for documentation supporting my home mortgage interest deduction (Schedule A), I have completed the enclosed Form 14900 — Worksheet for Qualified Loan Limit and Deductible Home Mortgage Interest (Exhibit A).</w:t>
+        <w:t>Eliana Machado de Almeida</w:t>
       </w:r>
     </w:p>
     <w:p>
       <w:pPr>
-        <w:spacing w:before="0" w:after="200"/>
+        <w:spacing w:before="0" w:after="60" w:line="280" w:lineRule="exact"/>
         <w:jc w:val="left"/>
       </w:pPr>
       <w:r>
         <w:rPr>
           <w:rFonts w:ascii="Times New Roman" w:hAnsi="Times New Roman"/>
           <w:b w:val="0"/>
+          <w:i w:val="0"/>
           <w:sz w:val="22"/>
+          <w:u w:val="none"/>
         </w:rPr>
-        <w:t>As shown on the enclosed Form 14900, my two home mortgage loans (4 Lauras Way, Edgartown, MA 02539) were both originated after December 15, 2017, and are subject to the $750,000 qualified loan limit under IRC Section 163(h)(3)(F).</w:t>
+        <w:t>SSN: 697-75-6336</w:t>
       </w:r>
     </w:p>
     <w:p>
       <w:pPr>
-        <w:spacing w:before="0" w:after="240"/>
+        <w:spacing w:before="0" w:after="60" w:line="280" w:lineRule="exact"/>
         <w:jc w:val="left"/>
       </w:pPr>
       <w:r>
         <w:rPr>
           <w:rFonts w:ascii="Times New Roman" w:hAnsi="Times New Roman"/>
           <w:b w:val="0"/>
+          <w:i w:val="0"/>
           <w:sz w:val="22"/>
+          <w:u w:val="none"/>
         </w:rPr>
-        <w:t>The corrected deductible home mortgage interest for tax year 2024 is $74,790.34, as calculated on Form 14900 (Line 15).</w:t>
+        <w:t>PO Box 1467, Edgartown, MA 02539</w:t>
       </w:r>
     </w:p>
     <w:p>
       <w:pPr>
-        <w:spacing w:before="0" w:after="120"/>
-        <w:jc w:val="left"/>
-      </w:pPr>
-      <w:r>
-        <w:rPr>
-          <w:rFonts w:ascii="Times New Roman" w:hAnsi="Times New Roman"/>
-          <w:b/>
-          <w:sz w:val="22"/>
-        </w:rPr>
-        <w:t>The following documents are enclosed:</w:t>
-      </w:r>
-    </w:p>
-    <w:p>
-      <w:pPr>
-        <w:spacing w:before="0" w:after="60"/>
-        <w:jc w:val="left"/>
-      </w:pPr>
-      <w:r>
-        <w:rPr>
-          <w:rFonts w:ascii="Courier New" w:hAnsi="Courier New"/>
-          <w:b w:val="0"/>
-          <w:sz w:val="20"/>
-        </w:rPr>
-        <w:t xml:space="preserve">  Exhibit A  —  Form 14900 (Worksheet for Qualified Loan Limit,</w:t>
-        <w:br/>
-        <w:t xml:space="preserve">              completed for tax year 2024)</w:t>
-      </w:r>
-    </w:p>
-    <w:p>
-      <w:pPr>
-        <w:spacing w:before="0" w:after="60"/>
-        <w:jc w:val="left"/>
-      </w:pPr>
-      <w:r>
-        <w:rPr>
-          <w:rFonts w:ascii="Courier New" w:hAnsi="Courier New"/>
-          <w:b w:val="0"/>
-          <w:sz w:val="20"/>
-        </w:rPr>
-        <w:t xml:space="preserve">  Exhibit B  —  Form 1098, AmWest Funding Corp</w:t>
-        <w:br/>
-        <w:t xml:space="preserve">              (4 Lauras Way — interest paid: $95,134.47)</w:t>
-      </w:r>
-    </w:p>
-    <w:p>
-      <w:pPr>
-        <w:spacing w:before="0" w:after="60"/>
-        <w:jc w:val="left"/>
-      </w:pPr>
-      <w:r>
-        <w:rPr>
-          <w:rFonts w:ascii="Courier New" w:hAnsi="Courier New"/>
-          <w:b w:val="0"/>
-          <w:sz w:val="20"/>
-        </w:rPr>
-        <w:t xml:space="preserve">  Exhibit C  —  Form 1098, Radius Financial Group Inc.</w:t>
-        <w:br/>
-        <w:t xml:space="preserve">              (4 Lauras Way — interest paid: $1,869.86)</w:t>
-      </w:r>
-    </w:p>
-    <w:p>
-      <w:pPr>
-        <w:spacing w:before="0" w:after="60"/>
-        <w:jc w:val="left"/>
-      </w:pPr>
-      <w:r>
-        <w:rPr>
-          <w:rFonts w:ascii="Courier New" w:hAnsi="Courier New"/>
-          <w:b w:val="0"/>
-          <w:sz w:val="20"/>
-        </w:rPr>
-        <w:t xml:space="preserve">  Exhibit D  —  Form 1098, Dovenmuehle Mortgage</w:t>
-        <w:br/>
-        <w:t xml:space="preserve">              (27 Cormorant Circle — Schedule E rental property)</w:t>
-      </w:r>
-    </w:p>
-    <w:p>
-      <w:pPr>
-        <w:spacing w:before="0" w:after="60"/>
-        <w:jc w:val="left"/>
-      </w:pPr>
-      <w:r>
-        <w:rPr>
-          <w:rFonts w:ascii="Courier New" w:hAnsi="Courier New"/>
-          <w:b w:val="0"/>
-          <w:sz w:val="20"/>
-        </w:rPr>
-        <w:t xml:space="preserve">  Exhibit E  —  Form 1098, Dovenmuehle Mortgage</w:t>
-        <w:br/>
-        <w:t xml:space="preserve">              (7 Briarwood Dr — Schedule E rental property)</w:t>
-      </w:r>
-    </w:p>
-    <w:p>
-      <w:pPr>
-        <w:spacing w:before="0" w:after="80"/>
+        <w:spacing w:before="0" w:after="60" w:line="280" w:lineRule="exact"/>
         <w:jc w:val="left"/>
       </w:pPr>
       <w:r>
         <w:rPr>
           <w:rFonts w:ascii="Times New Roman" w:hAnsi="Times New Roman"/>
           <w:b w:val="0"/>
+          <w:i w:val="0"/>
           <w:sz w:val="22"/>
+          <w:u w:val="none"/>
         </w:rPr>
+        <w:t>Phone: (401) 633-5598</w:t>
       </w:r>
     </w:p>
     <w:p>
       <w:pPr>
-        <w:spacing w:before="0" w:after="320"/>
+        <w:spacing w:before="0" w:after="60" w:line="280" w:lineRule="exact"/>
         <w:jc w:val="left"/>
       </w:pPr>
       <w:r>
         <w:rPr>
           <w:rFonts w:ascii="Times New Roman" w:hAnsi="Times New Roman"/>
           <w:b w:val="0"/>
+          <w:i w:val="0"/>
           <w:sz w:val="22"/>
-        </w:rPr>
-        <w:t>I declare under penalty of perjury that the information provided herein is true, correct, and complete to the best of my knowledge and belief.</w:t>
-      </w:r>
-    </w:p>
-    <w:p>
-      <w:pPr>
-        <w:spacing w:before="0" w:after="720"/>
-        <w:jc w:val="left"/>
-      </w:pPr>
-      <w:r>
-        <w:rPr>
-          <w:rFonts w:ascii="Times New Roman" w:hAnsi="Times New Roman"/>
-          <w:b w:val="0"/>
-          <w:sz w:val="22"/>
-        </w:rPr>
-        <w:t>Sincerely,</w:t>
-      </w:r>
-    </w:p>
-    <w:p>
-      <w:pPr>
-        <w:spacing w:before="0" w:after="40"/>
-        <w:jc w:val="left"/>
-      </w:pPr>
-      <w:r>
-        <w:rPr>
-          <w:rFonts w:ascii="Courier New" w:hAnsi="Courier New"/>
-          <w:b w:val="0"/>
-          <w:sz w:val="20"/>
-        </w:rPr>
-        <w:t>_________________________________        Date: ________________</w:t>
-      </w:r>
-    </w:p>
-    <w:p>
-      <w:pPr>
-        <w:spacing w:before="0" w:after="40"/>
-        <w:jc w:val="left"/>
-      </w:pPr>
-      <w:r>
-        <w:rPr>
-          <w:rFonts w:ascii="Times New Roman" w:hAnsi="Times New Roman"/>
-          <w:b w:val="0"/>
-          <w:sz w:val="22"/>
-        </w:rPr>
-        <w:t>Eliana Machado de Almeida</w:t>
-      </w:r>
-    </w:p>
-    <w:p>
-      <w:pPr>
-        <w:spacing w:before="0" w:after="40"/>
-        <w:jc w:val="left"/>
-      </w:pPr>
-      <w:r>
-        <w:rPr>
-          <w:rFonts w:ascii="Times New Roman" w:hAnsi="Times New Roman"/>
-          <w:b w:val="0"/>
-          <w:sz w:val="22"/>
-        </w:rPr>
-        <w:t>SSN: 697-75-6336</w:t>
-      </w:r>
-    </w:p>
-    <w:p>
-      <w:pPr>
-        <w:spacing w:before="0" w:after="40"/>
-        <w:jc w:val="left"/>
-      </w:pPr>
-      <w:r>
-        <w:rPr>
-          <w:rFonts w:ascii="Times New Roman" w:hAnsi="Times New Roman"/>
-          <w:b w:val="0"/>
-          <w:sz w:val="22"/>
-        </w:rPr>
-        <w:t>Address: PO Box 1467, Edgartown, MA 02539</w:t>
-      </w:r>
-    </w:p>
-    <w:p>
-      <w:pPr>
-        <w:spacing w:before="0" w:after="40"/>
-        <w:jc w:val="left"/>
-      </w:pPr>
-      <w:r>
-        <w:rPr>
-          <w:rFonts w:ascii="Times New Roman" w:hAnsi="Times New Roman"/>
-          <w:b w:val="0"/>
-          <w:sz w:val="22"/>
-        </w:rPr>
-        <w:t>Phone: (401) 633-5598</w:t>
-      </w:r>
-    </w:p>
-    <w:p>
-      <w:pPr>
-        <w:spacing w:before="0" w:after="40"/>
-        <w:jc w:val="left"/>
-      </w:pPr>
-      <w:r>
-        <w:rPr>
-          <w:rFonts w:ascii="Times New Roman" w:hAnsi="Times New Roman"/>
-          <w:b w:val="0"/>
-          <w:sz w:val="22"/>
+          <w:u w:val="none"/>
         </w:rPr>
         <w:t>Email: elly_usa@hotmail.com</w:t>
       </w:r>
     </w:p>
     <w:sectPr>
       <w:pgSz w:w="12240" w:h="15840"/>
-      <w:pgMar w:top="1584" w:right="1800" w:bottom="1584" w:left="1800" w:header="720" w:footer="720" w:gutter="0"/>
+      <w:pgMar w:top="1800" w:right="1944" w:bottom="1800" w:left="1944" w:header="720" w:footer="720" w:gutter="0"/>
       <w:cols w:space="720"/>
       <w:docGrid w:linePitch="360"/>
     </w:sectPr>

</xml_diff>